<commit_message>
Deploying to gh-pages from @ YoungJIn94/YoungJIn94.github.io@16a32ed3dd13efcfd58f301cae70e271920ee2b2 🚀
</commit_message>
<xml_diff>
--- a/assets/pdf/YJKim_CV.docx
+++ b/assets/pdf/YJKim_CV.docx
@@ -759,7 +759,6 @@
               <w:t xml:space="preserve">dvisor: </w:t>
             </w:r>
             <w:hyperlink r:id="rId12" w:history="1">
-              <w:proofErr w:type="spellStart"/>
               <w:r>
                 <w:rPr>
                   <w:rStyle w:val="Hyperlink"/>
@@ -769,19 +768,7 @@
                   <w:kern w:val="0"/>
                   <w:szCs w:val="20"/>
                 </w:rPr>
-                <w:t>Byoungho</w:t>
-              </w:r>
-              <w:proofErr w:type="spellEnd"/>
-              <w:r>
-                <w:rPr>
-                  <w:rStyle w:val="Hyperlink"/>
-                  <w:rFonts w:ascii="Linux Libertine Display" w:hAnsi="Linux Libertine Display" w:cs="Linux Libertine Display"/>
-                  <w:bCs/>
-                  <w:color w:val="1F497D" w:themeColor="text2"/>
-                  <w:kern w:val="0"/>
-                  <w:szCs w:val="20"/>
-                </w:rPr>
-                <w:t xml:space="preserve"> Lee</w:t>
+                <w:t>Byoungho Lee</w:t>
               </w:r>
             </w:hyperlink>
             <w:r>
@@ -3385,7 +3372,7 @@
           <w:kern w:val="0"/>
           <w:szCs w:val="28"/>
         </w:rPr>
-        <w:t>, 202</w:t>
+        <w:t xml:space="preserve">, </w:t>
       </w:r>
       <w:r>
         <w:rPr>
@@ -3394,7 +3381,7 @@
           <w:kern w:val="0"/>
           <w:szCs w:val="28"/>
         </w:rPr>
-        <w:t>5</w:t>
+        <w:t xml:space="preserve">vol. 17, </w:t>
       </w:r>
       <w:r>
         <w:rPr>
@@ -3403,7 +3390,34 @@
           <w:kern w:val="0"/>
           <w:szCs w:val="28"/>
         </w:rPr>
-        <w:t xml:space="preserve"> (Accepted)</w:t>
+        <w:t>no.</w:t>
+      </w:r>
+      <w:r>
+        <w:rPr>
+          <w:rFonts w:ascii="Linux Libertine Display" w:hAnsi="Linux Libertine Display" w:cs="Linux Libertine Display"/>
+          <w:bCs/>
+          <w:kern w:val="0"/>
+          <w:szCs w:val="28"/>
+        </w:rPr>
+        <w:t xml:space="preserve"> 1411, </w:t>
+      </w:r>
+      <w:r>
+        <w:rPr>
+          <w:rFonts w:ascii="Linux Libertine Display" w:hAnsi="Linux Libertine Display" w:cs="Linux Libertine Display"/>
+          <w:bCs/>
+          <w:kern w:val="0"/>
+          <w:szCs w:val="28"/>
+        </w:rPr>
+        <w:t>202</w:t>
+      </w:r>
+      <w:r>
+        <w:rPr>
+          <w:rFonts w:ascii="Linux Libertine Display" w:hAnsi="Linux Libertine Display" w:cs="Linux Libertine Display"/>
+          <w:bCs/>
+          <w:kern w:val="0"/>
+          <w:szCs w:val="28"/>
+        </w:rPr>
+        <w:t>6</w:t>
       </w:r>
       <w:r>
         <w:rPr>
@@ -7112,14 +7126,14 @@
         <v:path o:extrusionok="f" gradientshapeok="t" o:connecttype="rect"/>
         <o:lock v:ext="edit" aspectratio="t"/>
       </v:shapetype>
-      <v:shape id="_x0000_i1025" type="#_x0000_t75" style="width:540pt;height:540pt;visibility:visible;mso-wrap-style:square" o:bullet="t">
+      <v:shape id="_x0000_i1025" type="#_x0000_t75" style="width:540.45pt;height:540.45pt;visibility:visible;mso-wrap-style:square" o:bullet="t">
         <v:imagedata r:id="rId1" o:title="" croptop="3115f" cropbottom="3115f" cropleft="3115f" cropright="3115f"/>
       </v:shape>
     </w:pict>
   </w:numPicBullet>
   <w:numPicBullet w:numPicBulletId="1">
     <w:pict>
-      <v:shape id="_x0000_i1026" type="#_x0000_t75" style="width:14pt;height:14pt;visibility:visible;mso-wrap-style:square" o:bullet="t">
+      <v:shape id="_x0000_i1026" type="#_x0000_t75" style="width:13.9pt;height:13.9pt;visibility:visible;mso-wrap-style:square" o:bullet="t">
         <v:imagedata r:id="rId2" o:title="" cropbottom="-1179f" cropright="-1179f"/>
       </v:shape>
     </w:pict>

</xml_diff>

<commit_message>
Deploying to gh-pages from @ YoungJIn94/YoungJIn94.github.io@4533988e01d399d0aa3f06ac2b68867e2dd59572 🚀
</commit_message>
<xml_diff>
--- a/assets/pdf/YJKim_CV.docx
+++ b/assets/pdf/YJKim_CV.docx
@@ -4369,35 +4369,38 @@
         <w:outlineLvl w:val="0"/>
         <w:rPr>
           <w:rFonts w:ascii="Linux Libertine Display" w:hAnsi="Linux Libertine Display" w:cs="Linux Libertine Display"/>
-          <w:b/>
-          <w:bCs/>
-          <w:i/>
-          <w:kern w:val="0"/>
-          <w:sz w:val="24"/>
-          <w:szCs w:val="24"/>
-        </w:rPr>
-      </w:pPr>
-      <w:r>
-        <w:rPr>
-          <w:rFonts w:ascii="Linux Libertine Display" w:hAnsi="Linux Libertine Display" w:cs="Linux Libertine Display"/>
-          <w:bCs/>
-          <w:kern w:val="0"/>
-          <w:szCs w:val="28"/>
-        </w:rPr>
-        <w:br/>
-      </w:r>
-      <w:r>
-        <w:rPr>
           <w:noProof/>
+          <w:kern w:val="0"/>
+        </w:rPr>
+      </w:pPr>
+    </w:p>
+    <w:p>
+      <w:pPr>
+        <w:wordWrap/>
+        <w:adjustRightInd w:val="0"/>
+        <w:spacing w:after="0" w:line="360" w:lineRule="auto"/>
+        <w:jc w:val="left"/>
+        <w:outlineLvl w:val="0"/>
+        <w:rPr>
+          <w:rFonts w:ascii="Linux Libertine Display" w:hAnsi="Linux Libertine Display" w:cs="Linux Libertine Display"/>
+          <w:noProof/>
+          <w:kern w:val="0"/>
+        </w:rPr>
+      </w:pPr>
+      <w:r>
+        <w:rPr>
+          <w:rFonts w:ascii="Linux Libertine Display" w:hAnsi="Linux Libertine Display" w:cs="Linux Libertine Display"/>
+          <w:noProof/>
+          <w:kern w:val="0"/>
         </w:rPr>
         <w:lastRenderedPageBreak/>
         <mc:AlternateContent>
           <mc:Choice Requires="wps">
             <w:drawing>
-              <wp:inline distT="0" distB="0" distL="0" distR="0" wp14:anchorId="032FFE47" wp14:editId="633A9F11">
+              <wp:inline distT="0" distB="0" distL="0" distR="0" wp14:anchorId="374893FB" wp14:editId="7661C3DF">
                 <wp:extent cx="5687695" cy="0"/>
                 <wp:effectExtent l="0" t="0" r="27305" b="19050"/>
-                <wp:docPr id="4" name="직선 연결선 2"/>
+                <wp:docPr id="13" name="직선 연결선 2"/>
                 <wp:cNvGraphicFramePr>
                   <a:graphicFrameLocks xmlns:a="http://schemas.openxmlformats.org/drawingml/2006/main"/>
                 </wp:cNvGraphicFramePr>
@@ -4415,26 +4418,15 @@
                         <a:prstGeom prst="line">
                           <a:avLst/>
                         </a:prstGeom>
-                        <a:ln>
+                        <a:noFill/>
+                        <a:ln w="9525" cap="flat" cmpd="sng" algn="ctr">
                           <a:solidFill>
-                            <a:schemeClr val="tx1"/>
+                            <a:sysClr val="windowText" lastClr="000000"/>
                           </a:solidFill>
+                          <a:prstDash val="solid"/>
                         </a:ln>
+                        <a:effectLst/>
                       </wps:spPr>
-                      <wps:style>
-                        <a:lnRef idx="1">
-                          <a:schemeClr val="accent1"/>
-                        </a:lnRef>
-                        <a:fillRef idx="0">
-                          <a:schemeClr val="accent1"/>
-                        </a:fillRef>
-                        <a:effectRef idx="0">
-                          <a:schemeClr val="accent1"/>
-                        </a:effectRef>
-                        <a:fontRef idx="minor">
-                          <a:schemeClr val="tx1"/>
-                        </a:fontRef>
-                      </wps:style>
                       <wps:bodyPr/>
                     </wps:wsp>
                   </a:graphicData>
@@ -4444,7 +4436,7 @@
           </mc:Choice>
           <mc:Fallback>
             <w:pict>
-              <v:line w14:anchorId="276F53CC" id="직선 연결선 2" o:spid="_x0000_s1026" style="visibility:visible;mso-wrap-style:square;mso-left-percent:-10001;mso-top-percent:-10001;mso-position-horizontal:absolute;mso-position-horizontal-relative:char;mso-position-vertical:absolute;mso-position-vertical-relative:line;mso-left-percent:-10001;mso-top-percent:-10001" from="0,0" to="447.85pt,0" o:gfxdata="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" strokecolor="black [3213]">
+              <v:line w14:anchorId="4C96F6B9" id="직선 연결선 2" o:spid="_x0000_s1026" style="visibility:visible;mso-wrap-style:square;mso-left-percent:-10001;mso-top-percent:-10001;mso-position-horizontal:absolute;mso-position-horizontal-relative:char;mso-position-vertical:absolute;mso-position-vertical-relative:line;mso-left-percent:-10001;mso-top-percent:-10001" from="0,0" to="447.85pt,0" o:gfxdata="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" strokecolor="windowText">
                 <o:lock v:ext="edit" shapetype="f"/>
                 <w10:anchorlock/>
               </v:line>
@@ -4478,37 +4470,117 @@
           <w:sz w:val="28"/>
           <w:szCs w:val="28"/>
         </w:rPr>
-        <w:t>CONFERENCES</w:t>
+        <w:t xml:space="preserve">PATENTS </w:t>
       </w:r>
     </w:p>
     <w:p>
       <w:pPr>
         <w:pStyle w:val="051"/>
+        <w:numPr>
+          <w:ilvl w:val="0"/>
+          <w:numId w:val="17"/>
+        </w:numPr>
         <w:spacing w:after="120"/>
-      </w:pPr>
-      <w:r>
-        <w:rPr>
-          <w:b/>
+        <w:rPr>
+          <w:rFonts w:ascii="Linux Libertine Display" w:hAnsi="Linux Libertine Display" w:cs="Linux Libertine Display"/>
+        </w:rPr>
+      </w:pPr>
+      <w:r>
+        <w:rPr>
+          <w:rFonts w:ascii="Linux Libertine Display" w:hAnsi="Linux Libertine Display" w:cs="Linux Libertine Display"/>
+          <w:bCs/>
+        </w:rPr>
+        <w:t xml:space="preserve">Y. Park, </w:t>
+      </w:r>
+      <w:r>
+        <w:rPr>
+          <w:rFonts w:ascii="Linux Libertine Display" w:hAnsi="Linux Libertine Display" w:cs="Linux Libertine Display"/>
+          <w:b/>
+          <w:bCs/>
           <w:u w:val="single"/>
         </w:rPr>
         <w:t>Y. Kim</w:t>
       </w:r>
       <w:r>
-        <w:t xml:space="preserve">, C. Kim, B. Lee, Y. Jeong, and B. Lee, “Meta-optic Miniaturized Telephoto Lens System,” High Contrast </w:t>
-      </w:r>
-      <w:proofErr w:type="spellStart"/>
-      <w:r>
-        <w:t>Metastructures</w:t>
-      </w:r>
-      <w:proofErr w:type="spellEnd"/>
-      <w:r>
-        <w:t xml:space="preserve"> XII, SPIE Photonics West 2023, San Francisco, USA, paper 12432-32, Feb. 2023. </w:t>
-      </w:r>
-      <w:r>
-        <w:rPr>
-          <w:b/>
-        </w:rPr>
-        <w:t>(Oral presentation)</w:t>
+        <w:rPr>
+          <w:rFonts w:ascii="Linux Libertine Display" w:hAnsi="Linux Libertine Display" w:cs="Linux Libertine Display"/>
+          <w:bCs/>
+        </w:rPr>
+        <w:t xml:space="preserve">, </w:t>
+      </w:r>
+      <w:r>
+        <w:rPr>
+          <w:rFonts w:ascii="Linux Libertine Display" w:hAnsi="Linux Libertine Display" w:cs="Linux Libertine Display"/>
+          <w:color w:val="000000"/>
+          <w:shd w:val="clear" w:color="auto" w:fill="FFFFFF"/>
+        </w:rPr>
+        <w:t>G.-Y. Lee</w:t>
+      </w:r>
+      <w:r>
+        <w:rPr>
+          <w:rFonts w:ascii="Linux Libertine Display" w:hAnsi="Linux Libertine Display" w:cs="Linux Libertine Display"/>
+          <w:bCs/>
+        </w:rPr>
+        <w:t xml:space="preserve">, </w:t>
+      </w:r>
+      <w:r>
+        <w:rPr>
+          <w:rFonts w:ascii="Linux Libertine Display" w:hAnsi="Linux Libertine Display" w:cs="Linux Libertine Display"/>
+          <w:bCs/>
+        </w:rPr>
+        <w:t xml:space="preserve">B. Lee, Y. Jeong, </w:t>
+      </w:r>
+      <w:r>
+        <w:rPr>
+          <w:rFonts w:ascii="Linux Libertine Display" w:hAnsi="Linux Libertine Display" w:cs="Linux Libertine Display"/>
+          <w:bCs/>
+        </w:rPr>
+        <w:t>“</w:t>
+      </w:r>
+      <w:hyperlink r:id="rId26" w:history="1">
+        <w:r>
+          <w:rPr>
+            <w:rStyle w:val="Hyperlink"/>
+            <w:rFonts w:ascii="Linux Libertine Display" w:hAnsi="Linux Libertine Display" w:cs="Linux Libertine Display"/>
+            <w:bCs/>
+            <w:color w:val="1F497D" w:themeColor="text2"/>
+          </w:rPr>
+          <w:t xml:space="preserve">Double sided </w:t>
+        </w:r>
+        <w:proofErr w:type="spellStart"/>
+        <w:r>
+          <w:rPr>
+            <w:rStyle w:val="Hyperlink"/>
+            <w:rFonts w:ascii="Linux Libertine Display" w:hAnsi="Linux Libertine Display" w:cs="Linux Libertine Display"/>
+            <w:bCs/>
+            <w:color w:val="1F497D" w:themeColor="text2"/>
+          </w:rPr>
+          <w:t>metalens</w:t>
+        </w:r>
+        <w:proofErr w:type="spellEnd"/>
+        <w:r>
+          <w:rPr>
+            <w:rStyle w:val="Hyperlink"/>
+            <w:rFonts w:ascii="Linux Libertine Display" w:hAnsi="Linux Libertine Display" w:cs="Linux Libertine Display"/>
+            <w:bCs/>
+            <w:color w:val="1F497D" w:themeColor="text2"/>
+          </w:rPr>
+          <w:t xml:space="preserve"> and electronic device including the same</w:t>
+        </w:r>
+      </w:hyperlink>
+      <w:r>
+        <w:rPr>
+          <w:rFonts w:ascii="Linux Libertine Display" w:hAnsi="Linux Libertine Display" w:cs="Linux Libertine Display"/>
+          <w:bCs/>
+        </w:rPr>
+        <w:t xml:space="preserve">” </w:t>
+      </w:r>
+      <w:r>
+        <w:rPr>
+          <w:rFonts w:ascii="Linux Libertine Display" w:hAnsi="Linux Libertine Display" w:cs="Linux Libertine Display"/>
+          <w:bCs/>
+        </w:rPr>
+        <w:t>(US – Application No. 18/490,121)</w:t>
       </w:r>
     </w:p>
     <w:p>
@@ -4526,6 +4598,12 @@
       <w:r>
         <w:rPr>
           <w:rFonts w:ascii="Linux Libertine Display" w:hAnsi="Linux Libertine Display" w:cs="Linux Libertine Display"/>
+        </w:rPr>
+        <w:t xml:space="preserve">Y. Jeong, S.-W. Nam, </w:t>
+      </w:r>
+      <w:r>
+        <w:rPr>
+          <w:rFonts w:ascii="Linux Libertine Display" w:hAnsi="Linux Libertine Display" w:cs="Linux Libertine Display"/>
           <w:b/>
           <w:u w:val="single"/>
         </w:rPr>
@@ -4534,36 +4612,66 @@
       <w:r>
         <w:rPr>
           <w:rFonts w:ascii="Linux Libertine Display" w:hAnsi="Linux Libertine Display" w:cs="Linux Libertine Display"/>
-          <w:b/>
-        </w:rPr>
-        <w:t xml:space="preserve">, </w:t>
-      </w:r>
-      <w:r>
-        <w:rPr>
-          <w:rFonts w:ascii="Linux Libertine Display" w:hAnsi="Linux Libertine Display" w:cs="Linux Libertine Display"/>
-        </w:rPr>
-        <w:t xml:space="preserve">C. Kim, and B. Lee, “Phase contrast imaging with multiwavelength achromatic spiral </w:t>
-      </w:r>
-      <w:proofErr w:type="spellStart"/>
-      <w:r>
-        <w:rPr>
-          <w:rFonts w:ascii="Linux Libertine Display" w:hAnsi="Linux Libertine Display" w:cs="Linux Libertine Display"/>
-        </w:rPr>
-        <w:t>metalens</w:t>
-      </w:r>
-      <w:proofErr w:type="spellEnd"/>
-      <w:r>
-        <w:rPr>
-          <w:rFonts w:ascii="Linux Libertine Display" w:hAnsi="Linux Libertine Display" w:cs="Linux Libertine Display"/>
-        </w:rPr>
-        <w:t xml:space="preserve">,” OSA Optical Design and Fabrication Congress, Virtual Conference, paper FW4C.3, Jun. 2021. </w:t>
-      </w:r>
-      <w:r>
-        <w:rPr>
-          <w:rFonts w:ascii="Linux Libertine Display" w:hAnsi="Linux Libertine Display" w:cs="Linux Libertine Display"/>
-          <w:b/>
-        </w:rPr>
-        <w:t>(Oral presentation)</w:t>
+        </w:rPr>
+        <w:t>, D. Kim</w:t>
+      </w:r>
+      <w:r>
+        <w:rPr>
+          <w:rFonts w:ascii="Linux Libertine Display" w:hAnsi="Linux Libertine Display" w:cs="Linux Libertine Display"/>
+        </w:rPr>
+        <w:t>, “</w:t>
+      </w:r>
+      <w:hyperlink r:id="rId27" w:history="1">
+        <w:r>
+          <w:rPr>
+            <w:rStyle w:val="Hyperlink"/>
+            <w:rFonts w:ascii="Linux Libertine Display" w:hAnsi="Linux Libertine Display" w:cs="Linux Libertine Display"/>
+            <w:color w:val="1F497D" w:themeColor="text2"/>
+          </w:rPr>
+          <w:t xml:space="preserve">Holographic display using </w:t>
+        </w:r>
+        <w:proofErr w:type="spellStart"/>
+        <w:r>
+          <w:rPr>
+            <w:rStyle w:val="Hyperlink"/>
+            <w:rFonts w:ascii="Linux Libertine Display" w:hAnsi="Linux Libertine Display" w:cs="Linux Libertine Display"/>
+            <w:color w:val="1F497D" w:themeColor="text2"/>
+          </w:rPr>
+          <w:t>metasurface</w:t>
+        </w:r>
+        <w:proofErr w:type="spellEnd"/>
+        <w:r>
+          <w:rPr>
+            <w:rStyle w:val="Hyperlink"/>
+            <w:rFonts w:ascii="Linux Libertine Display" w:hAnsi="Linux Libertine Display" w:cs="Linux Libertine Display"/>
+            <w:color w:val="1F497D" w:themeColor="text2"/>
+          </w:rPr>
+          <w:t xml:space="preserve"> and </w:t>
+        </w:r>
+        <w:proofErr w:type="spellStart"/>
+        <w:r>
+          <w:rPr>
+            <w:rStyle w:val="Hyperlink"/>
+            <w:rFonts w:ascii="Linux Libertine Display" w:hAnsi="Linux Libertine Display" w:cs="Linux Libertine Display"/>
+            <w:color w:val="1F497D" w:themeColor="text2"/>
+          </w:rPr>
+          <w:t>metasurface</w:t>
+        </w:r>
+        <w:proofErr w:type="spellEnd"/>
+        <w:r>
+          <w:rPr>
+            <w:rStyle w:val="Hyperlink"/>
+            <w:rFonts w:ascii="Linux Libertine Display" w:hAnsi="Linux Libertine Display" w:cs="Linux Libertine Display"/>
+            <w:color w:val="1F497D" w:themeColor="text2"/>
+          </w:rPr>
+          <w:t xml:space="preserve"> optimization method</w:t>
+        </w:r>
+      </w:hyperlink>
+      <w:r>
+        <w:rPr>
+          <w:rFonts w:ascii="Linux Libertine Display" w:hAnsi="Linux Libertine Display" w:cs="Linux Libertine Display"/>
+        </w:rPr>
+        <w:t>” (US – Application No. 18/737,648)</w:t>
       </w:r>
     </w:p>
     <w:p>
@@ -4576,12 +4684,21 @@
         <w:spacing w:after="120"/>
         <w:rPr>
           <w:rFonts w:ascii="Linux Libertine Display" w:hAnsi="Linux Libertine Display" w:cs="Linux Libertine Display"/>
-        </w:rPr>
-      </w:pPr>
-      <w:r>
-        <w:rPr>
-          <w:rFonts w:ascii="Linux Libertine Display" w:hAnsi="Linux Libertine Display" w:cs="Linux Libertine Display"/>
-          <w:b/>
+          <w:bCs/>
+          <w:kern w:val="0"/>
+        </w:rPr>
+      </w:pPr>
+      <w:r>
+        <w:rPr>
+          <w:rFonts w:ascii="Linux Libertine Display" w:hAnsi="Linux Libertine Display" w:cs="Linux Libertine Display"/>
+        </w:rPr>
+        <w:t xml:space="preserve">J. Hong, C. Kim, B. Lee, </w:t>
+      </w:r>
+      <w:r>
+        <w:rPr>
+          <w:rFonts w:ascii="Linux Libertine Display" w:hAnsi="Linux Libertine Display" w:cs="Linux Libertine Display"/>
+          <w:b/>
+          <w:bCs/>
           <w:u w:val="single"/>
         </w:rPr>
         <w:t>Y. Kim</w:t>
@@ -4590,105 +4707,23 @@
         <w:rPr>
           <w:rFonts w:ascii="Linux Libertine Display" w:hAnsi="Linux Libertine Display" w:cs="Linux Libertine Display"/>
         </w:rPr>
-        <w:t xml:space="preserve">, J. Hong, and B. Lee, “Edge detection </w:t>
-      </w:r>
-      <w:proofErr w:type="spellStart"/>
-      <w:r>
-        <w:rPr>
-          <w:rFonts w:ascii="Linux Libertine Display" w:hAnsi="Linux Libertine Display" w:cs="Linux Libertine Display"/>
-        </w:rPr>
-        <w:t>metalens</w:t>
-      </w:r>
-      <w:proofErr w:type="spellEnd"/>
-      <w:r>
-        <w:rPr>
-          <w:rFonts w:ascii="Linux Libertine Display" w:hAnsi="Linux Libertine Display" w:cs="Linux Libertine Display"/>
-        </w:rPr>
-        <w:t xml:space="preserve"> with additional spiral phase profiles,” The 20th International Meeting on Information Display (IMID 2020), Virtual Conference, paper 04-10-1232, Aug. 2020. </w:t>
-      </w:r>
-      <w:r>
-        <w:rPr>
-          <w:rFonts w:ascii="Linux Libertine Display" w:hAnsi="Linux Libertine Display" w:cs="Linux Libertine Display"/>
-          <w:b/>
-        </w:rPr>
-        <w:t>(Oral presentation)</w:t>
-      </w:r>
-    </w:p>
-    <w:p>
-      <w:pPr>
-        <w:pStyle w:val="051"/>
-        <w:numPr>
-          <w:ilvl w:val="0"/>
-          <w:numId w:val="1"/>
-        </w:numPr>
-        <w:spacing w:after="120"/>
-        <w:rPr>
-          <w:rFonts w:ascii="Linux Libertine Display" w:hAnsi="Linux Libertine Display" w:cs="Linux Libertine Display"/>
-        </w:rPr>
-      </w:pPr>
-      <w:r>
-        <w:rPr>
-          <w:rFonts w:ascii="Linux Libertine Display" w:hAnsi="Linux Libertine Display" w:cs="Linux Libertine Display"/>
-          <w:b/>
-          <w:u w:val="single"/>
-        </w:rPr>
-        <w:t>Y. Kim</w:t>
-      </w:r>
-      <w:r>
-        <w:rPr>
-          <w:rFonts w:ascii="Linux Libertine Display" w:hAnsi="Linux Libertine Display" w:cs="Linux Libertine Display"/>
-          <w:b/>
-        </w:rPr>
-        <w:t xml:space="preserve">, </w:t>
-      </w:r>
-      <w:r>
-        <w:rPr>
-          <w:rFonts w:ascii="Linux Libertine Display" w:hAnsi="Linux Libertine Display" w:cs="Linux Libertine Display"/>
-        </w:rPr>
-        <w:t xml:space="preserve">C. Kim, and B. Lee, “Single-layer edge detecting </w:t>
-      </w:r>
-      <w:proofErr w:type="spellStart"/>
-      <w:r>
-        <w:rPr>
-          <w:rFonts w:ascii="Linux Libertine Display" w:hAnsi="Linux Libertine Display" w:cs="Linux Libertine Display"/>
-        </w:rPr>
-        <w:t>metalens</w:t>
-      </w:r>
-      <w:proofErr w:type="spellEnd"/>
-      <w:r>
-        <w:rPr>
-          <w:rFonts w:ascii="Linux Libertine Display" w:hAnsi="Linux Libertine Display" w:cs="Linux Libertine Display"/>
-        </w:rPr>
-        <w:t xml:space="preserve"> with combining hyperbolic and spiral phase profiles,” The 14th Pacific Rim Conference on Lasers and Electro-Optics (CLEO PR 2020), Virtual Conference, paper P5-7, Aug. 2020.</w:t>
-      </w:r>
-    </w:p>
-    <w:p>
-      <w:pPr>
-        <w:pStyle w:val="051"/>
-        <w:numPr>
-          <w:ilvl w:val="0"/>
-          <w:numId w:val="1"/>
-        </w:numPr>
-        <w:spacing w:after="120"/>
-        <w:rPr>
-          <w:rFonts w:ascii="Linux Libertine Display" w:hAnsi="Linux Libertine Display" w:cs="Linux Libertine Display"/>
-          <w:noProof/>
-          <w:kern w:val="0"/>
-        </w:rPr>
-      </w:pPr>
-      <w:r>
-        <w:rPr>
-          <w:rFonts w:ascii="Linux Libertine Display" w:hAnsi="Linux Libertine Display" w:cs="Linux Libertine Display"/>
-          <w:b/>
-          <w:u w:val="single"/>
-        </w:rPr>
-        <w:t>Y. Kim</w:t>
-      </w:r>
-      <w:r>
-        <w:rPr>
-          <w:rFonts w:ascii="Linux Libertine Display" w:hAnsi="Linux Libertine Display" w:cs="Linux Libertine Display"/>
-        </w:rPr>
-        <w:t>, J. Hong, J. Sung, and B. Lee, “Transmission-Type Color Filters with Silicon Mie Resonators using Guided-Mode-Resonance,” OSA Frontiers in Optics + Laser Science APS/DLS, Washington D.C., USA, paper JW4A.74, Sep. 2019.</w:t>
+        <w:t>, G.-Y. Lee, J. Jang, Y. Jeong, “</w:t>
+      </w:r>
+      <w:hyperlink r:id="rId28" w:history="1">
+        <w:r>
+          <w:rPr>
+            <w:rStyle w:val="Hyperlink"/>
+            <w:rFonts w:ascii="Linux Libertine Display" w:hAnsi="Linux Libertine Display" w:cs="Linux Libertine Display"/>
+            <w:color w:val="1F497D" w:themeColor="text2"/>
+          </w:rPr>
+          <w:t>Color-routing element, method of manufacturing the same, and image sensor including the color-routing element</w:t>
+        </w:r>
+      </w:hyperlink>
+      <w:r>
+        <w:rPr>
+          <w:rFonts w:ascii="Linux Libertine Display" w:hAnsi="Linux Libertine Display" w:cs="Linux Libertine Display"/>
+        </w:rPr>
+        <w:t>” (US – Application No. 18/937,958)</w:t>
       </w:r>
     </w:p>
     <w:p>
@@ -4716,7 +4751,7 @@
         <mc:AlternateContent>
           <mc:Choice Requires="wps">
             <w:drawing>
-              <wp:inline distT="0" distB="0" distL="0" distR="0" wp14:anchorId="1FFC5104" wp14:editId="2DBCC877">
+              <wp:inline distT="0" distB="0" distL="0" distR="0" wp14:anchorId="12ECFAFC" wp14:editId="2865595C">
                 <wp:extent cx="5687695" cy="0"/>
                 <wp:effectExtent l="0" t="0" r="27305" b="19050"/>
                 <wp:docPr id="17" name="직선 연결선 2"/>
@@ -4766,7 +4801,7 @@
           </mc:Choice>
           <mc:Fallback>
             <w:pict>
-              <v:line w14:anchorId="56FD4E29" id="직선 연결선 2" o:spid="_x0000_s1026" style="visibility:visible;mso-wrap-style:square;mso-left-percent:-10001;mso-top-percent:-10001;mso-position-horizontal:absolute;mso-position-horizontal-relative:char;mso-position-vertical:absolute;mso-position-vertical-relative:line;mso-left-percent:-10001;mso-top-percent:-10001" from="0,0" to="447.85pt,0" o:gfxdata="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" strokecolor="black [3213]">
+              <v:line w14:anchorId="0EDA4637" id="직선 연결선 2" o:spid="_x0000_s1026" style="visibility:visible;mso-wrap-style:square;mso-left-percent:-10001;mso-top-percent:-10001;mso-position-horizontal:absolute;mso-position-horizontal-relative:char;mso-position-vertical:absolute;mso-position-vertical-relative:line;mso-left-percent:-10001;mso-top-percent:-10001" from="0,0" to="447.85pt,0" o:gfxdata="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" strokecolor="black [3213]">
                 <o:lock v:ext="edit" shapetype="f"/>
                 <w10:anchorlock/>
               </v:line>
@@ -4779,576 +4814,16 @@
       <w:pPr>
         <w:wordWrap/>
         <w:adjustRightInd w:val="0"/>
-        <w:spacing w:after="0" w:line="360" w:lineRule="auto"/>
-        <w:jc w:val="left"/>
-        <w:outlineLvl w:val="0"/>
-        <w:rPr>
-          <w:rFonts w:ascii="Linux Libertine Display" w:hAnsi="Linux Libertine Display" w:cs="Linux Libertine Display"/>
-          <w:b/>
-          <w:bCs/>
-          <w:kern w:val="0"/>
-          <w:sz w:val="28"/>
-          <w:szCs w:val="28"/>
-        </w:rPr>
-      </w:pPr>
-      <w:r>
-        <w:rPr>
-          <w:rFonts w:ascii="Linux Libertine Display" w:hAnsi="Linux Libertine Display" w:cs="Linux Libertine Display"/>
-          <w:b/>
-          <w:bCs/>
-          <w:kern w:val="0"/>
-          <w:sz w:val="28"/>
-          <w:szCs w:val="28"/>
-        </w:rPr>
-        <w:t xml:space="preserve">RESEARCH </w:t>
-      </w:r>
-      <w:r>
-        <w:rPr>
-          <w:rFonts w:ascii="Linux Libertine Display" w:hAnsi="Linux Libertine Display" w:cs="Linux Libertine Display"/>
-          <w:b/>
-          <w:bCs/>
-          <w:kern w:val="0"/>
-          <w:sz w:val="28"/>
-          <w:szCs w:val="28"/>
-        </w:rPr>
-        <w:t>INTEREST</w:t>
-      </w:r>
-    </w:p>
-    <w:p>
-      <w:pPr>
-        <w:pStyle w:val="ListParagraph"/>
-        <w:numPr>
-          <w:ilvl w:val="0"/>
-          <w:numId w:val="3"/>
-        </w:numPr>
-        <w:wordWrap/>
-        <w:adjustRightInd w:val="0"/>
-        <w:spacing w:after="0"/>
-        <w:ind w:leftChars="100" w:left="600"/>
-        <w:jc w:val="left"/>
-        <w:outlineLvl w:val="0"/>
-        <w:rPr>
-          <w:rFonts w:ascii="Linux Libertine Display" w:hAnsi="Linux Libertine Display" w:cs="Linux Libertine Display"/>
-          <w:bCs/>
-          <w:kern w:val="0"/>
-          <w:szCs w:val="20"/>
-        </w:rPr>
-      </w:pPr>
-      <w:proofErr w:type="spellStart"/>
-      <w:r>
-        <w:rPr>
-          <w:rFonts w:ascii="Linux Libertine Display" w:hAnsi="Linux Libertine Display" w:cs="Linux Libertine Display"/>
-          <w:b/>
-          <w:bCs/>
-          <w:kern w:val="0"/>
-          <w:sz w:val="22"/>
-        </w:rPr>
-        <w:t>Metasurfaces</w:t>
-      </w:r>
-      <w:proofErr w:type="spellEnd"/>
-      <w:r>
-        <w:rPr>
-          <w:rFonts w:ascii="Linux Libertine Display" w:hAnsi="Linux Libertine Display" w:cs="Linux Libertine Display"/>
-          <w:b/>
-          <w:bCs/>
-          <w:kern w:val="0"/>
-          <w:sz w:val="22"/>
-        </w:rPr>
-        <w:t xml:space="preserve"> &amp; </w:t>
-      </w:r>
-      <w:proofErr w:type="spellStart"/>
-      <w:r>
-        <w:rPr>
-          <w:rFonts w:ascii="Linux Libertine Display" w:hAnsi="Linux Libertine Display" w:cs="Linux Libertine Display"/>
-          <w:b/>
-          <w:bCs/>
-          <w:kern w:val="0"/>
-          <w:sz w:val="22"/>
-        </w:rPr>
-        <w:t>Nanophotonics</w:t>
-      </w:r>
-      <w:proofErr w:type="spellEnd"/>
-      <w:r>
-        <w:rPr>
-          <w:rFonts w:ascii="Linux Libertine Display" w:hAnsi="Linux Libertine Display" w:cs="Linux Libertine Display"/>
-          <w:b/>
-          <w:bCs/>
-          <w:kern w:val="0"/>
-          <w:sz w:val="22"/>
-        </w:rPr>
-        <w:t xml:space="preserve"> for imaging and display systems</w:t>
-      </w:r>
-    </w:p>
-    <w:p>
-      <w:pPr>
-        <w:pStyle w:val="ListParagraph"/>
-        <w:numPr>
-          <w:ilvl w:val="0"/>
-          <w:numId w:val="13"/>
-        </w:numPr>
-        <w:wordWrap/>
-        <w:adjustRightInd w:val="0"/>
-        <w:spacing w:after="0"/>
-        <w:ind w:leftChars="0" w:left="970" w:hanging="403"/>
-        <w:jc w:val="left"/>
-        <w:outlineLvl w:val="0"/>
-        <w:rPr>
-          <w:rFonts w:ascii="Linux Libertine Display" w:hAnsi="Linux Libertine Display" w:cs="Linux Libertine Display"/>
-          <w:bCs/>
-          <w:kern w:val="0"/>
-          <w:szCs w:val="20"/>
-        </w:rPr>
-      </w:pPr>
-      <w:r>
-        <w:rPr>
-          <w:rFonts w:ascii="Linux Libertine Display" w:hAnsi="Linux Libertine Display" w:cs="Linux Libertine Display"/>
-          <w:bCs/>
-          <w:kern w:val="0"/>
-          <w:szCs w:val="20"/>
-        </w:rPr>
-        <w:t xml:space="preserve">Physical understanding of nanostructure’s optical behavior and </w:t>
-      </w:r>
-      <w:r>
-        <w:rPr>
-          <w:rFonts w:ascii="Linux Libertine Display" w:hAnsi="Linux Libertine Display" w:cs="Linux Libertine Display"/>
-          <w:bCs/>
-          <w:kern w:val="0"/>
-          <w:szCs w:val="20"/>
-        </w:rPr>
-        <w:t xml:space="preserve">design using near-field </w:t>
-      </w:r>
-      <w:r>
-        <w:rPr>
-          <w:rFonts w:ascii="Linux Libertine Display" w:hAnsi="Linux Libertine Display" w:cs="Linux Libertine Display"/>
-          <w:bCs/>
-          <w:kern w:val="0"/>
-          <w:szCs w:val="20"/>
-        </w:rPr>
-        <w:t>simulation tools (RCWA, FDTD, FEM, etc.)</w:t>
-      </w:r>
-    </w:p>
-    <w:p>
-      <w:pPr>
-        <w:pStyle w:val="ListParagraph"/>
-        <w:numPr>
-          <w:ilvl w:val="0"/>
-          <w:numId w:val="13"/>
-        </w:numPr>
-        <w:wordWrap/>
-        <w:adjustRightInd w:val="0"/>
-        <w:spacing w:after="0"/>
-        <w:ind w:leftChars="0" w:left="970" w:hanging="403"/>
-        <w:jc w:val="left"/>
-        <w:outlineLvl w:val="0"/>
-        <w:rPr>
-          <w:rFonts w:ascii="Linux Libertine Display" w:hAnsi="Linux Libertine Display" w:cs="Linux Libertine Display"/>
-          <w:bCs/>
-          <w:kern w:val="0"/>
-          <w:szCs w:val="20"/>
-        </w:rPr>
-      </w:pPr>
-      <w:r>
-        <w:rPr>
-          <w:rFonts w:ascii="Linux Libertine Display" w:hAnsi="Linux Libertine Display" w:cs="Linux Libertine Display"/>
-          <w:bCs/>
-          <w:kern w:val="0"/>
-          <w:szCs w:val="20"/>
-        </w:rPr>
-        <w:t xml:space="preserve">Design of waveguide-type folded </w:t>
-      </w:r>
-      <w:proofErr w:type="spellStart"/>
-      <w:r>
-        <w:rPr>
-          <w:rFonts w:ascii="Linux Libertine Display" w:hAnsi="Linux Libertine Display" w:cs="Linux Libertine Display"/>
-          <w:bCs/>
-          <w:kern w:val="0"/>
-          <w:szCs w:val="20"/>
-        </w:rPr>
-        <w:t>metasurface</w:t>
-      </w:r>
-      <w:proofErr w:type="spellEnd"/>
-      <w:r>
-        <w:rPr>
-          <w:rFonts w:ascii="Linux Libertine Display" w:hAnsi="Linux Libertine Display" w:cs="Linux Libertine Display"/>
-          <w:bCs/>
-          <w:kern w:val="0"/>
-          <w:szCs w:val="20"/>
-        </w:rPr>
-        <w:t xml:space="preserve"> system using ray- and wave-optic simulations</w:t>
-      </w:r>
-    </w:p>
-    <w:p>
-      <w:pPr>
-        <w:pStyle w:val="ListParagraph"/>
-        <w:numPr>
-          <w:ilvl w:val="0"/>
-          <w:numId w:val="13"/>
-        </w:numPr>
-        <w:wordWrap/>
-        <w:adjustRightInd w:val="0"/>
-        <w:spacing w:after="0"/>
-        <w:ind w:leftChars="0" w:left="970" w:hanging="403"/>
-        <w:jc w:val="left"/>
-        <w:outlineLvl w:val="0"/>
-        <w:rPr>
-          <w:rFonts w:ascii="Linux Libertine Display" w:hAnsi="Linux Libertine Display" w:cs="Linux Libertine Display"/>
-          <w:bCs/>
-          <w:kern w:val="0"/>
-          <w:szCs w:val="20"/>
-        </w:rPr>
-      </w:pPr>
-      <w:r>
-        <w:rPr>
-          <w:rFonts w:ascii="Linux Libertine Display" w:hAnsi="Linux Libertine Display" w:cs="Linux Libertine Display"/>
-          <w:bCs/>
-          <w:kern w:val="0"/>
-          <w:szCs w:val="20"/>
-        </w:rPr>
-        <w:t>Hands-on optical experiments (+5 years)</w:t>
-      </w:r>
-    </w:p>
-    <w:p>
-      <w:pPr>
-        <w:pStyle w:val="ListParagraph"/>
-        <w:numPr>
-          <w:ilvl w:val="0"/>
-          <w:numId w:val="13"/>
-        </w:numPr>
-        <w:wordWrap/>
-        <w:adjustRightInd w:val="0"/>
-        <w:spacing w:after="0"/>
-        <w:ind w:leftChars="0" w:left="970" w:hanging="403"/>
-        <w:jc w:val="left"/>
-        <w:outlineLvl w:val="0"/>
-        <w:rPr>
-          <w:rFonts w:ascii="Linux Libertine Display" w:hAnsi="Linux Libertine Display" w:cs="Linux Libertine Display"/>
-          <w:bCs/>
-          <w:kern w:val="0"/>
-          <w:szCs w:val="20"/>
-        </w:rPr>
-      </w:pPr>
-      <w:r>
-        <w:rPr>
-          <w:rFonts w:ascii="Linux Libertine Display" w:hAnsi="Linux Libertine Display" w:cs="Linux Libertine Display"/>
-          <w:bCs/>
-          <w:kern w:val="0"/>
-          <w:szCs w:val="20"/>
-        </w:rPr>
-        <w:t>Hands-on nanofabrication using lithography-techniques (+5 years)</w:t>
-      </w:r>
-    </w:p>
-    <w:p>
-      <w:pPr>
-        <w:pStyle w:val="ListParagraph"/>
-        <w:numPr>
-          <w:ilvl w:val="0"/>
-          <w:numId w:val="13"/>
-        </w:numPr>
-        <w:wordWrap/>
-        <w:adjustRightInd w:val="0"/>
-        <w:spacing w:after="0"/>
-        <w:ind w:leftChars="0" w:left="970" w:hanging="403"/>
-        <w:jc w:val="left"/>
-        <w:outlineLvl w:val="0"/>
-        <w:rPr>
-          <w:rFonts w:ascii="Linux Libertine Display" w:hAnsi="Linux Libertine Display" w:cs="Linux Libertine Display"/>
-          <w:bCs/>
-          <w:kern w:val="0"/>
-          <w:szCs w:val="20"/>
-        </w:rPr>
-      </w:pPr>
-      <w:r>
-        <w:rPr>
-          <w:rFonts w:ascii="Linux Libertine Display" w:hAnsi="Linux Libertine Display" w:cs="Linux Libertine Display"/>
-          <w:bCs/>
-          <w:kern w:val="0"/>
-          <w:szCs w:val="20"/>
-        </w:rPr>
-        <w:t>Applications to cameras, AR/VR displays, holographic displays, microscopy, etc.</w:t>
-      </w:r>
-    </w:p>
-    <w:p>
-      <w:pPr>
-        <w:wordWrap/>
-        <w:adjustRightInd w:val="0"/>
         <w:spacing w:after="0" w:line="240" w:lineRule="auto"/>
-        <w:jc w:val="left"/>
-        <w:rPr>
-          <w:rFonts w:ascii="Linux Libertine Display" w:hAnsi="Linux Libertine Display" w:cs="Linux Libertine Display"/>
-          <w:bCs/>
-          <w:kern w:val="0"/>
-          <w:sz w:val="10"/>
-          <w:szCs w:val="10"/>
-        </w:rPr>
-      </w:pPr>
-    </w:p>
-    <w:p>
-      <w:pPr>
-        <w:pStyle w:val="ListParagraph"/>
-        <w:numPr>
-          <w:ilvl w:val="0"/>
-          <w:numId w:val="3"/>
-        </w:numPr>
-        <w:wordWrap/>
-        <w:adjustRightInd w:val="0"/>
-        <w:spacing w:after="0"/>
-        <w:ind w:leftChars="100" w:left="600"/>
-        <w:jc w:val="left"/>
-        <w:outlineLvl w:val="0"/>
-        <w:rPr>
-          <w:rFonts w:ascii="Linux Libertine Display" w:hAnsi="Linux Libertine Display" w:cs="Linux Libertine Display"/>
-          <w:bCs/>
-          <w:kern w:val="0"/>
-          <w:szCs w:val="20"/>
-        </w:rPr>
-      </w:pPr>
-      <w:r>
-        <w:rPr>
-          <w:rFonts w:ascii="Linux Libertine Display" w:hAnsi="Linux Libertine Display" w:cs="Linux Libertine Display"/>
-          <w:b/>
-          <w:bCs/>
-          <w:kern w:val="0"/>
-          <w:sz w:val="22"/>
-        </w:rPr>
-        <w:t>Computational optics design</w:t>
-      </w:r>
-    </w:p>
-    <w:p>
-      <w:pPr>
-        <w:pStyle w:val="ListParagraph"/>
-        <w:numPr>
-          <w:ilvl w:val="0"/>
-          <w:numId w:val="14"/>
-        </w:numPr>
-        <w:wordWrap/>
-        <w:adjustRightInd w:val="0"/>
-        <w:spacing w:after="0"/>
-        <w:ind w:leftChars="0" w:left="970" w:hanging="403"/>
-        <w:jc w:val="left"/>
-        <w:outlineLvl w:val="0"/>
-        <w:rPr>
-          <w:rFonts w:ascii="Linux Libertine Display" w:hAnsi="Linux Libertine Display" w:cs="Linux Libertine Display"/>
-          <w:bCs/>
-          <w:kern w:val="0"/>
-          <w:szCs w:val="20"/>
-        </w:rPr>
-      </w:pPr>
-      <w:r>
-        <w:rPr>
-          <w:rFonts w:ascii="Linux Libertine Display" w:hAnsi="Linux Libertine Display" w:cs="Linux Libertine Display"/>
-          <w:bCs/>
-          <w:kern w:val="0"/>
-          <w:szCs w:val="20"/>
-        </w:rPr>
-        <w:t xml:space="preserve">End-to-end optimization of </w:t>
-      </w:r>
-      <w:proofErr w:type="spellStart"/>
-      <w:r>
-        <w:rPr>
-          <w:rFonts w:ascii="Linux Libertine Display" w:hAnsi="Linux Libertine Display" w:cs="Linux Libertine Display"/>
-          <w:bCs/>
-          <w:kern w:val="0"/>
-          <w:szCs w:val="20"/>
-        </w:rPr>
-        <w:t>metalens</w:t>
-      </w:r>
-      <w:proofErr w:type="spellEnd"/>
-      <w:r>
-        <w:rPr>
-          <w:rFonts w:ascii="Linux Libertine Display" w:hAnsi="Linux Libertine Display" w:cs="Linux Libertine Display"/>
-          <w:bCs/>
-          <w:kern w:val="0"/>
-          <w:szCs w:val="20"/>
-        </w:rPr>
-        <w:t xml:space="preserve"> imaging system</w:t>
-      </w:r>
-      <w:r>
-        <w:rPr>
-          <w:rFonts w:ascii="Linux Libertine Display" w:hAnsi="Linux Libertine Display" w:cs="Linux Libertine Display"/>
-          <w:bCs/>
-          <w:kern w:val="0"/>
-          <w:szCs w:val="20"/>
-        </w:rPr>
-        <w:t xml:space="preserve"> (Hardware + Software co-design)</w:t>
-      </w:r>
-    </w:p>
-    <w:p>
-      <w:pPr>
-        <w:pStyle w:val="ListParagraph"/>
-        <w:numPr>
-          <w:ilvl w:val="0"/>
-          <w:numId w:val="14"/>
-        </w:numPr>
-        <w:wordWrap/>
-        <w:adjustRightInd w:val="0"/>
-        <w:spacing w:after="0" w:line="360" w:lineRule="auto"/>
-        <w:ind w:leftChars="0" w:left="970" w:hanging="403"/>
-        <w:jc w:val="left"/>
-        <w:outlineLvl w:val="0"/>
-        <w:rPr>
-          <w:rFonts w:ascii="Linux Libertine Display" w:hAnsi="Linux Libertine Display" w:cs="Linux Libertine Display"/>
-          <w:bCs/>
-          <w:kern w:val="0"/>
-          <w:szCs w:val="20"/>
-        </w:rPr>
-      </w:pPr>
-      <w:r>
-        <w:rPr>
-          <w:rFonts w:ascii="Linux Libertine Display" w:hAnsi="Linux Libertine Display" w:cs="Linux Libertine Display"/>
-          <w:bCs/>
-          <w:kern w:val="0"/>
-          <w:szCs w:val="20"/>
-        </w:rPr>
-        <w:t>Nanostructure optimization through rigorous coupled-wave analysis using automatic differentiation</w:t>
-      </w:r>
-    </w:p>
-    <w:p>
-      <w:pPr>
-        <w:pStyle w:val="ListParagraph"/>
-        <w:numPr>
-          <w:ilvl w:val="0"/>
-          <w:numId w:val="14"/>
-        </w:numPr>
-        <w:wordWrap/>
-        <w:adjustRightInd w:val="0"/>
-        <w:spacing w:after="0"/>
-        <w:ind w:leftChars="0" w:left="970" w:hanging="403"/>
-        <w:jc w:val="left"/>
-        <w:outlineLvl w:val="0"/>
-        <w:rPr>
-          <w:rFonts w:ascii="Linux Libertine Display" w:hAnsi="Linux Libertine Display" w:cs="Linux Libertine Display"/>
-          <w:bCs/>
-          <w:kern w:val="0"/>
-          <w:szCs w:val="20"/>
-        </w:rPr>
-      </w:pPr>
-      <w:r>
-        <w:rPr>
-          <w:rFonts w:ascii="Linux Libertine Display" w:hAnsi="Linux Libertine Display" w:cs="Linux Libertine Display"/>
-          <w:bCs/>
-          <w:kern w:val="0"/>
-          <w:szCs w:val="20"/>
-        </w:rPr>
-        <w:t>J</w:t>
-      </w:r>
-      <w:r>
-        <w:rPr>
-          <w:rFonts w:ascii="Linux Libertine Display" w:hAnsi="Linux Libertine Display" w:cs="Linux Libertine Display"/>
-          <w:bCs/>
-          <w:kern w:val="0"/>
-          <w:szCs w:val="20"/>
-        </w:rPr>
-        <w:t xml:space="preserve">oint optimization of </w:t>
-      </w:r>
-      <w:proofErr w:type="spellStart"/>
-      <w:r>
-        <w:rPr>
-          <w:rFonts w:ascii="Linux Libertine Display" w:hAnsi="Linux Libertine Display" w:cs="Linux Libertine Display"/>
-          <w:bCs/>
-          <w:kern w:val="0"/>
-          <w:szCs w:val="20"/>
-        </w:rPr>
-        <w:t>metasurface</w:t>
-      </w:r>
-      <w:proofErr w:type="spellEnd"/>
-      <w:r>
-        <w:rPr>
-          <w:rFonts w:ascii="Linux Libertine Display" w:hAnsi="Linux Libertine Display" w:cs="Linux Libertine Display"/>
-          <w:bCs/>
-          <w:kern w:val="0"/>
-          <w:szCs w:val="20"/>
-        </w:rPr>
-        <w:t xml:space="preserve"> and </w:t>
-      </w:r>
-      <w:r>
-        <w:rPr>
-          <w:rFonts w:ascii="Linux Libertine Display" w:hAnsi="Linux Libertine Display" w:cs="Linux Libertine Display"/>
-          <w:bCs/>
-          <w:kern w:val="0"/>
-          <w:szCs w:val="20"/>
-        </w:rPr>
-        <w:t>spatial light modulator (SLM) phase profiles</w:t>
-      </w:r>
-    </w:p>
-    <w:p>
-      <w:pPr>
-        <w:wordWrap/>
-        <w:adjustRightInd w:val="0"/>
-        <w:spacing w:after="0" w:line="360" w:lineRule="auto"/>
-        <w:rPr>
-          <w:rFonts w:ascii="Linux Libertine Display" w:hAnsi="Linux Libertine Display" w:cs="Linux Libertine Display"/>
-          <w:b/>
-          <w:bCs/>
-          <w:kern w:val="0"/>
-          <w:sz w:val="24"/>
-          <w:szCs w:val="24"/>
-        </w:rPr>
-      </w:pPr>
-      <w:r>
-        <w:rPr>
-          <w:noProof/>
-        </w:rPr>
-        <mc:AlternateContent>
-          <mc:Choice Requires="wps">
-            <w:drawing>
-              <wp:inline distT="0" distB="0" distL="0" distR="0" wp14:anchorId="3E63580B" wp14:editId="04357D89">
-                <wp:extent cx="5687695" cy="0"/>
-                <wp:effectExtent l="0" t="0" r="27305" b="19050"/>
-                <wp:docPr id="7" name="직선 연결선 2"/>
-                <wp:cNvGraphicFramePr>
-                  <a:graphicFrameLocks xmlns:a="http://schemas.openxmlformats.org/drawingml/2006/main"/>
-                </wp:cNvGraphicFramePr>
-                <a:graphic xmlns:a="http://schemas.openxmlformats.org/drawingml/2006/main">
-                  <a:graphicData uri="http://schemas.microsoft.com/office/word/2010/wordprocessingShape">
-                    <wps:wsp>
-                      <wps:cNvCnPr>
-                        <a:cxnSpLocks/>
-                      </wps:cNvCnPr>
-                      <wps:spPr>
-                        <a:xfrm>
-                          <a:off x="0" y="0"/>
-                          <a:ext cx="5687695" cy="0"/>
-                        </a:xfrm>
-                        <a:prstGeom prst="line">
-                          <a:avLst/>
-                        </a:prstGeom>
-                        <a:ln>
-                          <a:solidFill>
-                            <a:schemeClr val="tx1"/>
-                          </a:solidFill>
-                        </a:ln>
-                      </wps:spPr>
-                      <wps:style>
-                        <a:lnRef idx="1">
-                          <a:schemeClr val="accent1"/>
-                        </a:lnRef>
-                        <a:fillRef idx="0">
-                          <a:schemeClr val="accent1"/>
-                        </a:fillRef>
-                        <a:effectRef idx="0">
-                          <a:schemeClr val="accent1"/>
-                        </a:effectRef>
-                        <a:fontRef idx="minor">
-                          <a:schemeClr val="tx1"/>
-                        </a:fontRef>
-                      </wps:style>
-                      <wps:bodyPr/>
-                    </wps:wsp>
-                  </a:graphicData>
-                </a:graphic>
-              </wp:inline>
-            </w:drawing>
-          </mc:Choice>
-          <mc:Fallback>
-            <w:pict>
-              <v:line w14:anchorId="26510AED" id="직선 연결선 2" o:spid="_x0000_s1026" style="visibility:visible;mso-wrap-style:square;mso-left-percent:-10001;mso-top-percent:-10001;mso-position-horizontal:absolute;mso-position-horizontal-relative:char;mso-position-vertical:absolute;mso-position-vertical-relative:line;mso-left-percent:-10001;mso-top-percent:-10001" from="0,0" to="447.85pt,0" o:gfxdata="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" strokecolor="black [3213]">
-                <o:lock v:ext="edit" shapetype="f"/>
-                <w10:anchorlock/>
-              </v:line>
-            </w:pict>
-          </mc:Fallback>
-        </mc:AlternateContent>
-      </w:r>
+        <w:jc w:val="center"/>
+        <w:rPr>
+          <w:rFonts w:ascii="Linux Libertine Display" w:hAnsi="Linux Libertine Display" w:cs="Linux Libertine Display"/>
+          <w:b/>
+          <w:bCs/>
+          <w:kern w:val="0"/>
+          <w:szCs w:val="20"/>
+        </w:rPr>
+      </w:pPr>
     </w:p>
     <w:p>
       <w:pPr>
@@ -5375,939 +4850,7 @@
           <w:sz w:val="28"/>
           <w:szCs w:val="28"/>
         </w:rPr>
-        <w:t>SKILLS</w:t>
-      </w:r>
-    </w:p>
-    <w:tbl>
-      <w:tblPr>
-        <w:tblStyle w:val="TableGrid"/>
-        <w:tblW w:w="0" w:type="auto"/>
-        <w:tblInd w:w="200" w:type="dxa"/>
-        <w:tblBorders>
-          <w:top w:val="none" w:sz="0" w:space="0" w:color="auto"/>
-          <w:left w:val="none" w:sz="0" w:space="0" w:color="auto"/>
-          <w:bottom w:val="none" w:sz="0" w:space="0" w:color="auto"/>
-          <w:right w:val="none" w:sz="0" w:space="0" w:color="auto"/>
-          <w:insideH w:val="none" w:sz="0" w:space="0" w:color="auto"/>
-          <w:insideV w:val="none" w:sz="0" w:space="0" w:color="auto"/>
-        </w:tblBorders>
-        <w:tblLook w:val="04A0" w:firstRow="1" w:lastRow="0" w:firstColumn="1" w:lastColumn="0" w:noHBand="0" w:noVBand="1"/>
-      </w:tblPr>
-      <w:tblGrid>
-        <w:gridCol w:w="2068"/>
-        <w:gridCol w:w="6758"/>
-      </w:tblGrid>
-      <w:tr>
-        <w:tc>
-          <w:tcPr>
-            <w:tcW w:w="2068" w:type="dxa"/>
-          </w:tcPr>
-          <w:p>
-            <w:pPr>
-              <w:wordWrap/>
-              <w:adjustRightInd w:val="0"/>
-              <w:rPr>
-                <w:rFonts w:ascii="Linux Libertine Display" w:hAnsi="Linux Libertine Display" w:cs="Linux Libertine Display"/>
-                <w:b/>
-                <w:bCs/>
-                <w:kern w:val="0"/>
-                <w:sz w:val="22"/>
-              </w:rPr>
-            </w:pPr>
-            <w:r>
-              <w:rPr>
-                <w:rFonts w:ascii="Linux Libertine Display" w:hAnsi="Linux Libertine Display" w:cs="Linux Libertine Display"/>
-                <w:b/>
-                <w:bCs/>
-                <w:kern w:val="0"/>
-                <w:sz w:val="22"/>
-              </w:rPr>
-              <w:t xml:space="preserve">Numerical </w:t>
-            </w:r>
-          </w:p>
-          <w:p>
-            <w:pPr>
-              <w:wordWrap/>
-              <w:adjustRightInd w:val="0"/>
-              <w:rPr>
-                <w:rFonts w:ascii="Linux Libertine Display" w:hAnsi="Linux Libertine Display" w:cs="Linux Libertine Display"/>
-                <w:b/>
-                <w:bCs/>
-                <w:kern w:val="0"/>
-                <w:sz w:val="22"/>
-              </w:rPr>
-            </w:pPr>
-            <w:r>
-              <w:rPr>
-                <w:rFonts w:ascii="Linux Libertine Display" w:hAnsi="Linux Libertine Display" w:cs="Linux Libertine Display"/>
-                <w:b/>
-                <w:bCs/>
-                <w:kern w:val="0"/>
-                <w:sz w:val="22"/>
-              </w:rPr>
-              <w:t>simulations</w:t>
-            </w:r>
-          </w:p>
-        </w:tc>
-        <w:tc>
-          <w:tcPr>
-            <w:tcW w:w="6758" w:type="dxa"/>
-            <w:vAlign w:val="center"/>
-          </w:tcPr>
-          <w:p>
-            <w:pPr>
-              <w:wordWrap/>
-              <w:adjustRightInd w:val="0"/>
-              <w:rPr>
-                <w:rFonts w:ascii="Linux Libertine Display" w:hAnsi="Linux Libertine Display" w:cs="Linux Libertine Display"/>
-                <w:bCs/>
-                <w:kern w:val="0"/>
-                <w:sz w:val="22"/>
-              </w:rPr>
-            </w:pPr>
-            <w:r>
-              <w:rPr>
-                <w:rFonts w:ascii="Linux Libertine Display" w:hAnsi="Linux Libertine Display" w:cs="Linux Libertine Display"/>
-                <w:b/>
-                <w:bCs/>
-                <w:kern w:val="0"/>
-                <w:sz w:val="22"/>
-              </w:rPr>
-              <w:t>Optical n</w:t>
-            </w:r>
-            <w:r>
-              <w:rPr>
-                <w:rFonts w:ascii="Linux Libertine Display" w:hAnsi="Linux Libertine Display" w:cs="Linux Libertine Display"/>
-                <w:b/>
-                <w:bCs/>
-                <w:kern w:val="0"/>
-                <w:sz w:val="22"/>
-              </w:rPr>
-              <w:t>ear-field simulations:</w:t>
-            </w:r>
-          </w:p>
-          <w:p>
-            <w:pPr>
-              <w:wordWrap/>
-              <w:adjustRightInd w:val="0"/>
-              <w:rPr>
-                <w:rFonts w:ascii="Linux Libertine Display" w:hAnsi="Linux Libertine Display" w:cs="Linux Libertine Display"/>
-                <w:bCs/>
-                <w:kern w:val="0"/>
-                <w:szCs w:val="20"/>
-              </w:rPr>
-            </w:pPr>
-            <w:r>
-              <w:rPr>
-                <w:rFonts w:ascii="Linux Libertine Display" w:hAnsi="Linux Libertine Display" w:cs="Linux Libertine Display"/>
-                <w:bCs/>
-                <w:kern w:val="0"/>
-                <w:szCs w:val="20"/>
-              </w:rPr>
-              <w:t>RCWA (Python</w:t>
-            </w:r>
-            <w:r>
-              <w:rPr>
-                <w:rFonts w:ascii="Linux Libertine Display" w:hAnsi="Linux Libertine Display" w:cs="Linux Libertine Display"/>
-                <w:bCs/>
-                <w:kern w:val="0"/>
-                <w:szCs w:val="20"/>
-              </w:rPr>
-              <w:t xml:space="preserve">, </w:t>
-            </w:r>
-            <w:proofErr w:type="spellStart"/>
-            <w:r>
-              <w:rPr>
-                <w:rFonts w:ascii="Linux Libertine Display" w:hAnsi="Linux Libertine Display" w:cs="Linux Libertine Display"/>
-                <w:bCs/>
-                <w:kern w:val="0"/>
-                <w:szCs w:val="20"/>
-              </w:rPr>
-              <w:t>Pytorch</w:t>
-            </w:r>
-            <w:proofErr w:type="spellEnd"/>
-            <w:r>
-              <w:rPr>
-                <w:rFonts w:ascii="Linux Libertine Display" w:hAnsi="Linux Libertine Display" w:cs="Linux Libertine Display"/>
-                <w:bCs/>
-                <w:kern w:val="0"/>
-                <w:szCs w:val="20"/>
-              </w:rPr>
-              <w:t>), FEM (COMSOL Multiphysics), FDTD (</w:t>
-            </w:r>
-            <w:proofErr w:type="spellStart"/>
-            <w:r>
-              <w:rPr>
-                <w:rFonts w:ascii="Linux Libertine Display" w:hAnsi="Linux Libertine Display" w:cs="Linux Libertine Display"/>
-                <w:bCs/>
-                <w:kern w:val="0"/>
-                <w:szCs w:val="20"/>
-              </w:rPr>
-              <w:t>Lumerical</w:t>
-            </w:r>
-            <w:proofErr w:type="spellEnd"/>
-            <w:r>
-              <w:rPr>
-                <w:rFonts w:ascii="Linux Libertine Display" w:hAnsi="Linux Libertine Display" w:cs="Linux Libertine Display"/>
-                <w:bCs/>
-                <w:kern w:val="0"/>
-                <w:szCs w:val="20"/>
-              </w:rPr>
-              <w:t>)</w:t>
-            </w:r>
-          </w:p>
-          <w:p>
-            <w:pPr>
-              <w:wordWrap/>
-              <w:adjustRightInd w:val="0"/>
-              <w:rPr>
-                <w:rFonts w:ascii="Linux Libertine Display" w:hAnsi="Linux Libertine Display" w:cs="Linux Libertine Display"/>
-                <w:b/>
-                <w:bCs/>
-                <w:kern w:val="0"/>
-                <w:sz w:val="22"/>
-              </w:rPr>
-            </w:pPr>
-          </w:p>
-          <w:p>
-            <w:pPr>
-              <w:wordWrap/>
-              <w:adjustRightInd w:val="0"/>
-              <w:rPr>
-                <w:rFonts w:ascii="Linux Libertine Display" w:hAnsi="Linux Libertine Display" w:cs="Linux Libertine Display"/>
-                <w:b/>
-                <w:bCs/>
-                <w:kern w:val="0"/>
-                <w:sz w:val="22"/>
-              </w:rPr>
-            </w:pPr>
-            <w:r>
-              <w:rPr>
-                <w:rFonts w:ascii="Linux Libertine Display" w:hAnsi="Linux Libertine Display" w:cs="Linux Libertine Display"/>
-                <w:b/>
-                <w:bCs/>
-                <w:kern w:val="0"/>
-                <w:sz w:val="22"/>
-              </w:rPr>
-              <w:t>Optical f</w:t>
-            </w:r>
-            <w:r>
-              <w:rPr>
-                <w:rFonts w:ascii="Linux Libertine Display" w:hAnsi="Linux Libertine Display" w:cs="Linux Libertine Display"/>
-                <w:b/>
-                <w:bCs/>
-                <w:kern w:val="0"/>
-                <w:sz w:val="22"/>
-              </w:rPr>
-              <w:t>ar-field simulations:</w:t>
-            </w:r>
-          </w:p>
-          <w:p>
-            <w:pPr>
-              <w:wordWrap/>
-              <w:adjustRightInd w:val="0"/>
-              <w:rPr>
-                <w:rFonts w:ascii="Linux Libertine Display" w:hAnsi="Linux Libertine Display" w:cs="Linux Libertine Display"/>
-                <w:bCs/>
-                <w:kern w:val="0"/>
-                <w:szCs w:val="20"/>
-              </w:rPr>
-            </w:pPr>
-            <w:r>
-              <w:rPr>
-                <w:rFonts w:ascii="Linux Libertine Display" w:hAnsi="Linux Libertine Display" w:cs="Linux Libertine Display"/>
-                <w:bCs/>
-                <w:kern w:val="0"/>
-                <w:szCs w:val="20"/>
-              </w:rPr>
-              <w:t>Ray-optic simulation (</w:t>
-            </w:r>
-            <w:proofErr w:type="spellStart"/>
-            <w:r>
-              <w:rPr>
-                <w:rFonts w:ascii="Linux Libertine Display" w:hAnsi="Linux Libertine Display" w:cs="Linux Libertine Display"/>
-                <w:bCs/>
-                <w:kern w:val="0"/>
-                <w:szCs w:val="20"/>
-              </w:rPr>
-              <w:t>Zemax</w:t>
-            </w:r>
-            <w:proofErr w:type="spellEnd"/>
-            <w:r>
-              <w:rPr>
-                <w:rFonts w:ascii="Linux Libertine Display" w:hAnsi="Linux Libertine Display" w:cs="Linux Libertine Display"/>
-                <w:bCs/>
-                <w:kern w:val="0"/>
-                <w:szCs w:val="20"/>
-              </w:rPr>
-              <w:t>), Wave-optic simulation (MATLAB, Python</w:t>
-            </w:r>
-            <w:r>
-              <w:rPr>
-                <w:rFonts w:ascii="Linux Libertine Display" w:hAnsi="Linux Libertine Display" w:cs="Linux Libertine Display"/>
-                <w:bCs/>
-                <w:kern w:val="0"/>
-                <w:szCs w:val="20"/>
-              </w:rPr>
-              <w:t xml:space="preserve">, </w:t>
-            </w:r>
-            <w:proofErr w:type="spellStart"/>
-            <w:r>
-              <w:rPr>
-                <w:rFonts w:ascii="Linux Libertine Display" w:hAnsi="Linux Libertine Display" w:cs="Linux Libertine Display"/>
-                <w:bCs/>
-                <w:kern w:val="0"/>
-                <w:szCs w:val="20"/>
-              </w:rPr>
-              <w:t>Pytorch</w:t>
-            </w:r>
-            <w:proofErr w:type="spellEnd"/>
-            <w:r>
-              <w:rPr>
-                <w:rFonts w:ascii="Linux Libertine Display" w:hAnsi="Linux Libertine Display" w:cs="Linux Libertine Display"/>
-                <w:bCs/>
-                <w:kern w:val="0"/>
-                <w:szCs w:val="20"/>
-              </w:rPr>
-              <w:t>)</w:t>
-            </w:r>
-          </w:p>
-          <w:p>
-            <w:pPr>
-              <w:wordWrap/>
-              <w:adjustRightInd w:val="0"/>
-              <w:rPr>
-                <w:rFonts w:ascii="Linux Libertine Display" w:hAnsi="Linux Libertine Display" w:cs="Linux Libertine Display"/>
-                <w:b/>
-                <w:bCs/>
-                <w:kern w:val="0"/>
-                <w:sz w:val="22"/>
-              </w:rPr>
-            </w:pPr>
-          </w:p>
-          <w:p>
-            <w:pPr>
-              <w:wordWrap/>
-              <w:adjustRightInd w:val="0"/>
-              <w:rPr>
-                <w:rFonts w:ascii="Linux Libertine Display" w:hAnsi="Linux Libertine Display" w:cs="Linux Libertine Display"/>
-                <w:b/>
-                <w:bCs/>
-                <w:kern w:val="0"/>
-                <w:sz w:val="22"/>
-              </w:rPr>
-            </w:pPr>
-            <w:r>
-              <w:rPr>
-                <w:rFonts w:ascii="Linux Libertine Display" w:hAnsi="Linux Libertine Display" w:cs="Linux Libertine Display"/>
-                <w:b/>
-                <w:bCs/>
-                <w:kern w:val="0"/>
-                <w:sz w:val="22"/>
-              </w:rPr>
-              <w:t>Computational optics design</w:t>
-            </w:r>
-            <w:r>
-              <w:rPr>
-                <w:rFonts w:ascii="Linux Libertine Display" w:hAnsi="Linux Libertine Display" w:cs="Linux Libertine Display"/>
-                <w:b/>
-                <w:bCs/>
-                <w:kern w:val="0"/>
-                <w:sz w:val="22"/>
-              </w:rPr>
-              <w:t>:</w:t>
-            </w:r>
-          </w:p>
-          <w:p>
-            <w:pPr>
-              <w:wordWrap/>
-              <w:adjustRightInd w:val="0"/>
-              <w:rPr>
-                <w:rFonts w:ascii="Linux Libertine Display" w:hAnsi="Linux Libertine Display" w:cs="Linux Libertine Display"/>
-                <w:bCs/>
-                <w:kern w:val="0"/>
-                <w:szCs w:val="20"/>
-              </w:rPr>
-            </w:pPr>
-            <w:r>
-              <w:rPr>
-                <w:rFonts w:ascii="Linux Libertine Display" w:hAnsi="Linux Libertine Display" w:cs="Linux Libertine Display"/>
-                <w:bCs/>
-                <w:kern w:val="0"/>
-                <w:szCs w:val="20"/>
-              </w:rPr>
-              <w:lastRenderedPageBreak/>
-              <w:t>Data-driven optimization through machine-learning framework (</w:t>
-            </w:r>
-            <w:proofErr w:type="spellStart"/>
-            <w:r>
-              <w:rPr>
-                <w:rFonts w:ascii="Linux Libertine Display" w:hAnsi="Linux Libertine Display" w:cs="Linux Libertine Display"/>
-                <w:bCs/>
-                <w:kern w:val="0"/>
-                <w:szCs w:val="20"/>
-              </w:rPr>
-              <w:t>Pytorch</w:t>
-            </w:r>
-            <w:proofErr w:type="spellEnd"/>
-            <w:r>
-              <w:rPr>
-                <w:rFonts w:ascii="Linux Libertine Display" w:hAnsi="Linux Libertine Display" w:cs="Linux Libertine Display"/>
-                <w:bCs/>
-                <w:kern w:val="0"/>
-                <w:szCs w:val="20"/>
-              </w:rPr>
-              <w:t>),</w:t>
-            </w:r>
-            <w:r>
-              <w:rPr>
-                <w:rFonts w:ascii="Linux Libertine Display" w:hAnsi="Linux Libertine Display" w:cs="Linux Libertine Display"/>
-                <w:bCs/>
-                <w:kern w:val="0"/>
-                <w:szCs w:val="20"/>
-              </w:rPr>
-              <w:br/>
-              <w:t>Inverse design of periodic nanostructures using automatic-differentiation (</w:t>
-            </w:r>
-            <w:proofErr w:type="spellStart"/>
-            <w:r>
-              <w:rPr>
-                <w:rFonts w:ascii="Linux Libertine Display" w:hAnsi="Linux Libertine Display" w:cs="Linux Libertine Display"/>
-                <w:bCs/>
-                <w:kern w:val="0"/>
-                <w:szCs w:val="20"/>
-              </w:rPr>
-              <w:t>Pytorch</w:t>
-            </w:r>
-            <w:proofErr w:type="spellEnd"/>
-            <w:r>
-              <w:rPr>
-                <w:rFonts w:ascii="Linux Libertine Display" w:hAnsi="Linux Libertine Display" w:cs="Linux Libertine Display"/>
-                <w:bCs/>
-                <w:kern w:val="0"/>
-                <w:szCs w:val="20"/>
-              </w:rPr>
-              <w:t>)</w:t>
-            </w:r>
-          </w:p>
-          <w:p>
-            <w:pPr>
-              <w:wordWrap/>
-              <w:adjustRightInd w:val="0"/>
-              <w:rPr>
-                <w:rFonts w:ascii="Linux Libertine Display" w:hAnsi="Linux Libertine Display" w:cs="Linux Libertine Display"/>
-                <w:b/>
-                <w:bCs/>
-                <w:kern w:val="0"/>
-                <w:sz w:val="22"/>
-              </w:rPr>
-            </w:pPr>
-          </w:p>
-          <w:p>
-            <w:pPr>
-              <w:wordWrap/>
-              <w:adjustRightInd w:val="0"/>
-              <w:rPr>
-                <w:rFonts w:ascii="Linux Libertine Display" w:hAnsi="Linux Libertine Display" w:cs="Linux Libertine Display"/>
-                <w:b/>
-                <w:bCs/>
-                <w:kern w:val="0"/>
-                <w:sz w:val="22"/>
-              </w:rPr>
-            </w:pPr>
-            <w:r>
-              <w:rPr>
-                <w:rFonts w:ascii="Linux Libertine Display" w:hAnsi="Linux Libertine Display" w:cs="Linux Libertine Display"/>
-                <w:b/>
-                <w:bCs/>
-                <w:kern w:val="0"/>
-                <w:sz w:val="22"/>
-              </w:rPr>
-              <w:t>Programming languages &amp; tools:</w:t>
-            </w:r>
-          </w:p>
-          <w:p>
-            <w:pPr>
-              <w:wordWrap/>
-              <w:adjustRightInd w:val="0"/>
-              <w:rPr>
-                <w:rFonts w:ascii="Linux Libertine Display" w:hAnsi="Linux Libertine Display" w:cs="Linux Libertine Display"/>
-                <w:bCs/>
-                <w:kern w:val="0"/>
-                <w:sz w:val="22"/>
-              </w:rPr>
-            </w:pPr>
-            <w:r>
-              <w:rPr>
-                <w:rFonts w:ascii="Linux Libertine Display" w:hAnsi="Linux Libertine Display" w:cs="Linux Libertine Display"/>
-                <w:bCs/>
-                <w:kern w:val="0"/>
-                <w:sz w:val="22"/>
-              </w:rPr>
-              <w:t>MATLAB, Python (</w:t>
-            </w:r>
-            <w:proofErr w:type="spellStart"/>
-            <w:r>
-              <w:rPr>
-                <w:rFonts w:ascii="Linux Libertine Display" w:hAnsi="Linux Libertine Display" w:cs="Linux Libertine Display"/>
-                <w:bCs/>
-                <w:kern w:val="0"/>
-                <w:sz w:val="22"/>
-              </w:rPr>
-              <w:t>Pytorch</w:t>
-            </w:r>
-            <w:proofErr w:type="spellEnd"/>
-            <w:r>
-              <w:rPr>
-                <w:rFonts w:ascii="Linux Libertine Display" w:hAnsi="Linux Libertine Display" w:cs="Linux Libertine Display"/>
-                <w:bCs/>
-                <w:kern w:val="0"/>
-                <w:sz w:val="22"/>
-              </w:rPr>
-              <w:t xml:space="preserve">), ZPL (for </w:t>
-            </w:r>
-            <w:proofErr w:type="spellStart"/>
-            <w:r>
-              <w:rPr>
-                <w:rFonts w:ascii="Linux Libertine Display" w:hAnsi="Linux Libertine Display" w:cs="Linux Libertine Display"/>
-                <w:bCs/>
-                <w:kern w:val="0"/>
-                <w:sz w:val="22"/>
-              </w:rPr>
-              <w:t>Zemax</w:t>
-            </w:r>
-            <w:proofErr w:type="spellEnd"/>
-            <w:r>
-              <w:rPr>
-                <w:rFonts w:ascii="Linux Libertine Display" w:hAnsi="Linux Libertine Display" w:cs="Linux Libertine Display"/>
-                <w:bCs/>
-                <w:kern w:val="0"/>
-                <w:sz w:val="22"/>
-              </w:rPr>
-              <w:t>)</w:t>
-            </w:r>
-          </w:p>
-          <w:p>
-            <w:pPr>
-              <w:wordWrap/>
-              <w:adjustRightInd w:val="0"/>
-              <w:ind w:left="190"/>
-              <w:rPr>
-                <w:rFonts w:ascii="Linux Libertine Display" w:hAnsi="Linux Libertine Display" w:cs="Linux Libertine Display"/>
-                <w:bCs/>
-                <w:kern w:val="0"/>
-                <w:sz w:val="22"/>
-              </w:rPr>
-            </w:pPr>
-          </w:p>
-        </w:tc>
-      </w:tr>
-      <w:tr>
-        <w:tc>
-          <w:tcPr>
-            <w:tcW w:w="2068" w:type="dxa"/>
-          </w:tcPr>
-          <w:p>
-            <w:pPr>
-              <w:wordWrap/>
-              <w:adjustRightInd w:val="0"/>
-              <w:rPr>
-                <w:rFonts w:ascii="Linux Libertine Display" w:hAnsi="Linux Libertine Display" w:cs="Linux Libertine Display"/>
-                <w:b/>
-                <w:bCs/>
-                <w:kern w:val="0"/>
-                <w:sz w:val="22"/>
-              </w:rPr>
-            </w:pPr>
-            <w:r>
-              <w:rPr>
-                <w:rFonts w:ascii="Linux Libertine Display" w:hAnsi="Linux Libertine Display" w:cs="Linux Libertine Display"/>
-                <w:b/>
-                <w:bCs/>
-                <w:kern w:val="0"/>
-                <w:sz w:val="22"/>
-              </w:rPr>
-              <w:lastRenderedPageBreak/>
-              <w:t>Experimental</w:t>
-            </w:r>
-          </w:p>
-          <w:p>
-            <w:pPr>
-              <w:wordWrap/>
-              <w:adjustRightInd w:val="0"/>
-              <w:rPr>
-                <w:rFonts w:ascii="Linux Libertine Display" w:hAnsi="Linux Libertine Display" w:cs="Linux Libertine Display"/>
-                <w:b/>
-                <w:bCs/>
-                <w:kern w:val="0"/>
-                <w:sz w:val="22"/>
-              </w:rPr>
-            </w:pPr>
-            <w:r>
-              <w:rPr>
-                <w:rFonts w:ascii="Linux Libertine Display" w:hAnsi="Linux Libertine Display" w:cs="Linux Libertine Display"/>
-                <w:b/>
-                <w:bCs/>
-                <w:kern w:val="0"/>
-                <w:sz w:val="22"/>
-              </w:rPr>
-              <w:t>experiences</w:t>
-            </w:r>
-          </w:p>
-        </w:tc>
-        <w:tc>
-          <w:tcPr>
-            <w:tcW w:w="6758" w:type="dxa"/>
-            <w:vAlign w:val="center"/>
-          </w:tcPr>
-          <w:p>
-            <w:pPr>
-              <w:wordWrap/>
-              <w:adjustRightInd w:val="0"/>
-              <w:rPr>
-                <w:rFonts w:ascii="Linux Libertine Display" w:hAnsi="Linux Libertine Display" w:cs="Linux Libertine Display"/>
-                <w:bCs/>
-                <w:kern w:val="0"/>
-                <w:szCs w:val="20"/>
-              </w:rPr>
-            </w:pPr>
-            <w:r>
-              <w:rPr>
-                <w:rFonts w:ascii="Linux Libertine Display" w:hAnsi="Linux Libertine Display" w:cs="Linux Libertine Display"/>
-                <w:bCs/>
-                <w:kern w:val="0"/>
-                <w:szCs w:val="20"/>
-              </w:rPr>
-              <w:t>Photography, Holographic display with spatial light modulator, Laser/LED-based experiments</w:t>
-            </w:r>
-          </w:p>
-          <w:p>
-            <w:pPr>
-              <w:wordWrap/>
-              <w:adjustRightInd w:val="0"/>
-              <w:rPr>
-                <w:rFonts w:ascii="Linux Libertine Display" w:hAnsi="Linux Libertine Display" w:cs="Linux Libertine Display"/>
-                <w:b/>
-                <w:bCs/>
-                <w:kern w:val="0"/>
-                <w:sz w:val="22"/>
-              </w:rPr>
-            </w:pPr>
-          </w:p>
-        </w:tc>
-      </w:tr>
-      <w:tr>
-        <w:tc>
-          <w:tcPr>
-            <w:tcW w:w="2068" w:type="dxa"/>
-          </w:tcPr>
-          <w:p>
-            <w:pPr>
-              <w:wordWrap/>
-              <w:adjustRightInd w:val="0"/>
-              <w:rPr>
-                <w:rFonts w:ascii="Linux Libertine Display" w:hAnsi="Linux Libertine Display" w:cs="Linux Libertine Display"/>
-                <w:b/>
-                <w:bCs/>
-                <w:kern w:val="0"/>
-                <w:sz w:val="22"/>
-              </w:rPr>
-            </w:pPr>
-            <w:r>
-              <w:rPr>
-                <w:rFonts w:ascii="Linux Libertine Display" w:hAnsi="Linux Libertine Display" w:cs="Linux Libertine Display"/>
-                <w:b/>
-                <w:bCs/>
-                <w:kern w:val="0"/>
-                <w:sz w:val="22"/>
-              </w:rPr>
-              <w:t>Device fabrication</w:t>
-            </w:r>
-          </w:p>
-        </w:tc>
-        <w:tc>
-          <w:tcPr>
-            <w:tcW w:w="6758" w:type="dxa"/>
-            <w:vAlign w:val="center"/>
-          </w:tcPr>
-          <w:p>
-            <w:pPr>
-              <w:wordWrap/>
-              <w:adjustRightInd w:val="0"/>
-              <w:rPr>
-                <w:rFonts w:ascii="Linux Libertine Display" w:hAnsi="Linux Libertine Display" w:cs="Linux Libertine Display"/>
-                <w:b/>
-                <w:bCs/>
-                <w:kern w:val="0"/>
-                <w:szCs w:val="20"/>
-              </w:rPr>
-            </w:pPr>
-            <w:r>
-              <w:rPr>
-                <w:rFonts w:ascii="Linux Libertine Display" w:hAnsi="Linux Libertine Display" w:cs="Linux Libertine Display"/>
-                <w:b/>
-                <w:bCs/>
-                <w:kern w:val="0"/>
-                <w:szCs w:val="20"/>
-              </w:rPr>
-              <w:t>Nanofabrication:</w:t>
-            </w:r>
-          </w:p>
-          <w:p>
-            <w:pPr>
-              <w:wordWrap/>
-              <w:adjustRightInd w:val="0"/>
-              <w:rPr>
-                <w:rFonts w:ascii="Linux Libertine Display" w:hAnsi="Linux Libertine Display" w:cs="Linux Libertine Display"/>
-                <w:bCs/>
-                <w:kern w:val="0"/>
-                <w:szCs w:val="20"/>
-              </w:rPr>
-            </w:pPr>
-            <w:r>
-              <w:rPr>
-                <w:rFonts w:ascii="Linux Libertine Display" w:hAnsi="Linux Libertine Display" w:cs="Linux Libertine Display"/>
-                <w:bCs/>
-                <w:kern w:val="0"/>
-                <w:szCs w:val="20"/>
-              </w:rPr>
-              <w:t>Electron beam lithography, Photolithography (Aligner, Maskless lithography), Electron beam evapora</w:t>
-            </w:r>
-            <w:r>
-              <w:rPr>
-                <w:rFonts w:ascii="Linux Libertine Display" w:hAnsi="Linux Libertine Display" w:cs="Linux Libertine Display"/>
-                <w:bCs/>
-                <w:kern w:val="0"/>
-                <w:szCs w:val="20"/>
-              </w:rPr>
-              <w:t>tion</w:t>
-            </w:r>
-            <w:r>
-              <w:rPr>
-                <w:rFonts w:ascii="Linux Libertine Display" w:hAnsi="Linux Libertine Display" w:cs="Linux Libertine Display"/>
-                <w:bCs/>
-                <w:kern w:val="0"/>
-                <w:szCs w:val="20"/>
-              </w:rPr>
-              <w:t>, Plasma-enhanced chemical vapor deposition (PECVD), Reactive ion etching (RIE)</w:t>
-            </w:r>
-            <w:r>
-              <w:rPr>
-                <w:rFonts w:ascii="Linux Libertine Display" w:hAnsi="Linux Libertine Display" w:cs="Linux Libertine Display"/>
-                <w:bCs/>
-                <w:kern w:val="0"/>
-                <w:szCs w:val="20"/>
-              </w:rPr>
-              <w:t xml:space="preserve">, </w:t>
-            </w:r>
-            <w:r>
-              <w:rPr>
-                <w:rFonts w:ascii="Linux Libertine Display" w:hAnsi="Linux Libertine Display" w:cs="Linux Libertine Display"/>
-                <w:bCs/>
-                <w:kern w:val="0"/>
-                <w:szCs w:val="20"/>
-              </w:rPr>
-              <w:t>Focused ion beam (FIB) milling</w:t>
-            </w:r>
-          </w:p>
-          <w:p>
-            <w:pPr>
-              <w:wordWrap/>
-              <w:adjustRightInd w:val="0"/>
-              <w:rPr>
-                <w:rFonts w:ascii="Linux Libertine Display" w:hAnsi="Linux Libertine Display" w:cs="Linux Libertine Display"/>
-                <w:bCs/>
-                <w:kern w:val="0"/>
-                <w:szCs w:val="20"/>
-              </w:rPr>
-            </w:pPr>
-          </w:p>
-          <w:p>
-            <w:pPr>
-              <w:wordWrap/>
-              <w:adjustRightInd w:val="0"/>
-              <w:rPr>
-                <w:rFonts w:ascii="Linux Libertine Display" w:hAnsi="Linux Libertine Display" w:cs="Linux Libertine Display"/>
-                <w:b/>
-                <w:bCs/>
-                <w:kern w:val="0"/>
-                <w:szCs w:val="20"/>
-              </w:rPr>
-            </w:pPr>
-            <w:r>
-              <w:rPr>
-                <w:rFonts w:ascii="Linux Libertine Display" w:hAnsi="Linux Libertine Display" w:cs="Linux Libertine Display"/>
-                <w:b/>
-                <w:bCs/>
-                <w:kern w:val="0"/>
-                <w:szCs w:val="20"/>
-              </w:rPr>
-              <w:t>Measurement:</w:t>
-            </w:r>
-          </w:p>
-          <w:p>
-            <w:pPr>
-              <w:wordWrap/>
-              <w:adjustRightInd w:val="0"/>
-              <w:rPr>
-                <w:rFonts w:ascii="Linux Libertine Display" w:hAnsi="Linux Libertine Display" w:cs="Linux Libertine Display"/>
-                <w:bCs/>
-                <w:kern w:val="0"/>
-                <w:szCs w:val="20"/>
-              </w:rPr>
-            </w:pPr>
-            <w:r>
-              <w:rPr>
-                <w:rFonts w:ascii="Linux Libertine Display" w:hAnsi="Linux Libertine Display" w:cs="Linux Libertine Display"/>
-                <w:bCs/>
-                <w:kern w:val="0"/>
-                <w:szCs w:val="20"/>
-              </w:rPr>
-              <w:t>Scanning electron microscope (SEM), Ellipsometry</w:t>
-            </w:r>
-          </w:p>
-          <w:p>
-            <w:pPr>
-              <w:wordWrap/>
-              <w:adjustRightInd w:val="0"/>
-              <w:rPr>
-                <w:rFonts w:ascii="Linux Libertine Display" w:hAnsi="Linux Libertine Display" w:cs="Linux Libertine Display"/>
-                <w:b/>
-                <w:bCs/>
-                <w:kern w:val="0"/>
-                <w:sz w:val="22"/>
-              </w:rPr>
-            </w:pPr>
-          </w:p>
-        </w:tc>
-      </w:tr>
-      <w:tr>
-        <w:tc>
-          <w:tcPr>
-            <w:tcW w:w="2068" w:type="dxa"/>
-          </w:tcPr>
-          <w:p>
-            <w:pPr>
-              <w:wordWrap/>
-              <w:adjustRightInd w:val="0"/>
-              <w:rPr>
-                <w:rFonts w:ascii="Linux Libertine Display" w:hAnsi="Linux Libertine Display" w:cs="Linux Libertine Display"/>
-                <w:b/>
-                <w:bCs/>
-                <w:kern w:val="0"/>
-                <w:sz w:val="22"/>
-              </w:rPr>
-            </w:pPr>
-            <w:r>
-              <w:rPr>
-                <w:rFonts w:ascii="Linux Libertine Display" w:hAnsi="Linux Libertine Display" w:cs="Linux Libertine Display"/>
-                <w:b/>
-                <w:bCs/>
-                <w:kern w:val="0"/>
-                <w:sz w:val="22"/>
-              </w:rPr>
-              <w:t>Languages</w:t>
-            </w:r>
-          </w:p>
-        </w:tc>
-        <w:tc>
-          <w:tcPr>
-            <w:tcW w:w="6758" w:type="dxa"/>
-            <w:vAlign w:val="center"/>
-          </w:tcPr>
-          <w:p>
-            <w:pPr>
-              <w:wordWrap/>
-              <w:adjustRightInd w:val="0"/>
-              <w:rPr>
-                <w:rFonts w:ascii="Linux Libertine Display" w:hAnsi="Linux Libertine Display" w:cs="Linux Libertine Display"/>
-                <w:bCs/>
-                <w:kern w:val="0"/>
-                <w:szCs w:val="20"/>
-              </w:rPr>
-            </w:pPr>
-            <w:r>
-              <w:rPr>
-                <w:rFonts w:ascii="Linux Libertine Display" w:hAnsi="Linux Libertine Display" w:cs="Linux Libertine Display"/>
-                <w:bCs/>
-                <w:kern w:val="0"/>
-                <w:szCs w:val="20"/>
-              </w:rPr>
-              <w:t>Korean (Native) / English (Fluent)</w:t>
-            </w:r>
-          </w:p>
-        </w:tc>
-      </w:tr>
-    </w:tbl>
-    <w:p>
-      <w:pPr>
-        <w:pStyle w:val="051"/>
-        <w:numPr>
-          <w:ilvl w:val="0"/>
-          <w:numId w:val="0"/>
-        </w:numPr>
-        <w:spacing w:after="120"/>
-        <w:rPr>
-          <w:rFonts w:ascii="Linux Libertine Display" w:hAnsi="Linux Libertine Display" w:cs="Linux Libertine Display"/>
-          <w:noProof/>
-          <w:kern w:val="0"/>
-        </w:rPr>
-      </w:pPr>
-      <w:r>
-        <w:rPr>
-          <w:rFonts w:ascii="Linux Libertine Display" w:hAnsi="Linux Libertine Display" w:cs="Linux Libertine Display"/>
-          <w:noProof/>
-          <w:kern w:val="0"/>
-        </w:rPr>
-        <mc:AlternateContent>
-          <mc:Choice Requires="wps">
-            <w:drawing>
-              <wp:inline distT="0" distB="0" distL="0" distR="0" wp14:anchorId="374893FB" wp14:editId="7661C3DF">
-                <wp:extent cx="5687695" cy="0"/>
-                <wp:effectExtent l="0" t="0" r="27305" b="19050"/>
-                <wp:docPr id="13" name="직선 연결선 2"/>
-                <wp:cNvGraphicFramePr>
-                  <a:graphicFrameLocks xmlns:a="http://schemas.openxmlformats.org/drawingml/2006/main"/>
-                </wp:cNvGraphicFramePr>
-                <a:graphic xmlns:a="http://schemas.openxmlformats.org/drawingml/2006/main">
-                  <a:graphicData uri="http://schemas.microsoft.com/office/word/2010/wordprocessingShape">
-                    <wps:wsp>
-                      <wps:cNvCnPr>
-                        <a:cxnSpLocks/>
-                      </wps:cNvCnPr>
-                      <wps:spPr>
-                        <a:xfrm>
-                          <a:off x="0" y="0"/>
-                          <a:ext cx="5687695" cy="0"/>
-                        </a:xfrm>
-                        <a:prstGeom prst="line">
-                          <a:avLst/>
-                        </a:prstGeom>
-                        <a:noFill/>
-                        <a:ln w="9525" cap="flat" cmpd="sng" algn="ctr">
-                          <a:solidFill>
-                            <a:sysClr val="windowText" lastClr="000000"/>
-                          </a:solidFill>
-                          <a:prstDash val="solid"/>
-                        </a:ln>
-                        <a:effectLst/>
-                      </wps:spPr>
-                      <wps:bodyPr/>
-                    </wps:wsp>
-                  </a:graphicData>
-                </a:graphic>
-              </wp:inline>
-            </w:drawing>
-          </mc:Choice>
-          <mc:Fallback>
-            <w:pict>
-              <v:line w14:anchorId="4C96F6B9" id="직선 연결선 2" o:spid="_x0000_s1026" style="visibility:visible;mso-wrap-style:square;mso-left-percent:-10001;mso-top-percent:-10001;mso-position-horizontal:absolute;mso-position-horizontal-relative:char;mso-position-vertical:absolute;mso-position-vertical-relative:line;mso-left-percent:-10001;mso-top-percent:-10001" from="0,0" to="447.85pt,0" o:gfxdata="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" strokecolor="windowText">
-                <o:lock v:ext="edit" shapetype="f"/>
-                <w10:anchorlock/>
-              </v:line>
-            </w:pict>
-          </mc:Fallback>
-        </mc:AlternateContent>
+        <w:t>SERVICES</w:t>
       </w:r>
     </w:p>
     <w:p>
@@ -6322,273 +4865,53 @@
           <w:b/>
           <w:bCs/>
           <w:kern w:val="0"/>
-          <w:sz w:val="28"/>
-          <w:szCs w:val="28"/>
-        </w:rPr>
-      </w:pPr>
-      <w:r>
-        <w:rPr>
-          <w:rFonts w:ascii="Linux Libertine Display" w:hAnsi="Linux Libertine Display" w:cs="Linux Libertine Display"/>
-          <w:b/>
-          <w:bCs/>
-          <w:kern w:val="0"/>
-          <w:sz w:val="28"/>
-          <w:szCs w:val="28"/>
-        </w:rPr>
-        <w:t xml:space="preserve">PATENTS </w:t>
+          <w:sz w:val="24"/>
+          <w:szCs w:val="24"/>
+        </w:rPr>
+      </w:pPr>
+      <w:r>
+        <w:rPr>
+          <w:rFonts w:ascii="Linux Libertine Display" w:hAnsi="Linux Libertine Display" w:cs="Linux Libertine Display"/>
+          <w:b/>
+          <w:bCs/>
+          <w:kern w:val="0"/>
+          <w:sz w:val="24"/>
+          <w:szCs w:val="24"/>
+        </w:rPr>
+        <w:t>Reviewer</w:t>
       </w:r>
     </w:p>
     <w:p>
       <w:pPr>
-        <w:pStyle w:val="051"/>
-        <w:numPr>
-          <w:ilvl w:val="0"/>
-          <w:numId w:val="17"/>
-        </w:numPr>
-        <w:spacing w:after="120"/>
-        <w:rPr>
-          <w:rFonts w:ascii="Linux Libertine Display" w:hAnsi="Linux Libertine Display" w:cs="Linux Libertine Display"/>
-        </w:rPr>
-      </w:pPr>
-      <w:r>
-        <w:rPr>
-          <w:rFonts w:ascii="Linux Libertine Display" w:hAnsi="Linux Libertine Display" w:cs="Linux Libertine Display"/>
-          <w:bCs/>
-        </w:rPr>
-        <w:t xml:space="preserve">Y. Park, </w:t>
-      </w:r>
-      <w:r>
-        <w:rPr>
-          <w:rFonts w:ascii="Linux Libertine Display" w:hAnsi="Linux Libertine Display" w:cs="Linux Libertine Display"/>
-          <w:b/>
-          <w:bCs/>
-          <w:u w:val="single"/>
-        </w:rPr>
-        <w:t>Y. Kim</w:t>
-      </w:r>
-      <w:r>
-        <w:rPr>
-          <w:rFonts w:ascii="Linux Libertine Display" w:hAnsi="Linux Libertine Display" w:cs="Linux Libertine Display"/>
-          <w:bCs/>
-        </w:rPr>
-        <w:t xml:space="preserve">, </w:t>
-      </w:r>
-      <w:r>
-        <w:rPr>
-          <w:rFonts w:ascii="Linux Libertine Display" w:hAnsi="Linux Libertine Display" w:cs="Linux Libertine Display"/>
-          <w:color w:val="000000"/>
-          <w:shd w:val="clear" w:color="auto" w:fill="FFFFFF"/>
-        </w:rPr>
-        <w:t>G.-Y. Lee</w:t>
-      </w:r>
-      <w:r>
-        <w:rPr>
-          <w:rFonts w:ascii="Linux Libertine Display" w:hAnsi="Linux Libertine Display" w:cs="Linux Libertine Display"/>
-          <w:bCs/>
-        </w:rPr>
-        <w:t xml:space="preserve">, </w:t>
-      </w:r>
-      <w:r>
-        <w:rPr>
-          <w:rFonts w:ascii="Linux Libertine Display" w:hAnsi="Linux Libertine Display" w:cs="Linux Libertine Display"/>
-          <w:bCs/>
-        </w:rPr>
-        <w:t xml:space="preserve">B. Lee, Y. Jeong, </w:t>
-      </w:r>
-      <w:r>
-        <w:rPr>
-          <w:rFonts w:ascii="Linux Libertine Display" w:hAnsi="Linux Libertine Display" w:cs="Linux Libertine Display"/>
-          <w:bCs/>
-        </w:rPr>
-        <w:t>“</w:t>
-      </w:r>
-      <w:hyperlink r:id="rId26" w:history="1">
-        <w:r>
-          <w:rPr>
-            <w:rStyle w:val="Hyperlink"/>
-            <w:rFonts w:ascii="Linux Libertine Display" w:hAnsi="Linux Libertine Display" w:cs="Linux Libertine Display"/>
-            <w:bCs/>
-            <w:color w:val="1F497D" w:themeColor="text2"/>
-          </w:rPr>
-          <w:t xml:space="preserve">Double sided </w:t>
-        </w:r>
-        <w:proofErr w:type="spellStart"/>
-        <w:r>
-          <w:rPr>
-            <w:rStyle w:val="Hyperlink"/>
-            <w:rFonts w:ascii="Linux Libertine Display" w:hAnsi="Linux Libertine Display" w:cs="Linux Libertine Display"/>
-            <w:bCs/>
-            <w:color w:val="1F497D" w:themeColor="text2"/>
-          </w:rPr>
-          <w:t>metalens</w:t>
-        </w:r>
-        <w:proofErr w:type="spellEnd"/>
-        <w:r>
-          <w:rPr>
-            <w:rStyle w:val="Hyperlink"/>
-            <w:rFonts w:ascii="Linux Libertine Display" w:hAnsi="Linux Libertine Display" w:cs="Linux Libertine Display"/>
-            <w:bCs/>
-            <w:color w:val="1F497D" w:themeColor="text2"/>
-          </w:rPr>
-          <w:t xml:space="preserve"> and electronic device including the same</w:t>
-        </w:r>
-      </w:hyperlink>
-      <w:r>
-        <w:rPr>
-          <w:rFonts w:ascii="Linux Libertine Display" w:hAnsi="Linux Libertine Display" w:cs="Linux Libertine Display"/>
-          <w:bCs/>
-        </w:rPr>
-        <w:t xml:space="preserve">” </w:t>
-      </w:r>
-      <w:r>
-        <w:rPr>
-          <w:rFonts w:ascii="Linux Libertine Display" w:hAnsi="Linux Libertine Display" w:cs="Linux Libertine Display"/>
-          <w:bCs/>
-        </w:rPr>
-        <w:t>(US – Application No. 18/490,121)</w:t>
-      </w:r>
-    </w:p>
-    <w:p>
-      <w:pPr>
-        <w:pStyle w:val="051"/>
-        <w:numPr>
-          <w:ilvl w:val="0"/>
-          <w:numId w:val="1"/>
-        </w:numPr>
-        <w:spacing w:after="120"/>
-        <w:rPr>
-          <w:rFonts w:ascii="Linux Libertine Display" w:hAnsi="Linux Libertine Display" w:cs="Linux Libertine Display"/>
-        </w:rPr>
-      </w:pPr>
-      <w:r>
-        <w:rPr>
-          <w:rFonts w:ascii="Linux Libertine Display" w:hAnsi="Linux Libertine Display" w:cs="Linux Libertine Display"/>
-        </w:rPr>
-        <w:t xml:space="preserve">Y. Jeong, S.-W. Nam, </w:t>
-      </w:r>
-      <w:r>
-        <w:rPr>
-          <w:rFonts w:ascii="Linux Libertine Display" w:hAnsi="Linux Libertine Display" w:cs="Linux Libertine Display"/>
-          <w:b/>
-          <w:u w:val="single"/>
-        </w:rPr>
-        <w:t>Y. Kim</w:t>
-      </w:r>
-      <w:r>
-        <w:rPr>
-          <w:rFonts w:ascii="Linux Libertine Display" w:hAnsi="Linux Libertine Display" w:cs="Linux Libertine Display"/>
-        </w:rPr>
-        <w:t>, D. Kim</w:t>
-      </w:r>
-      <w:r>
-        <w:rPr>
-          <w:rFonts w:ascii="Linux Libertine Display" w:hAnsi="Linux Libertine Display" w:cs="Linux Libertine Display"/>
-        </w:rPr>
-        <w:t>, “</w:t>
-      </w:r>
-      <w:hyperlink r:id="rId27" w:history="1">
-        <w:r>
-          <w:rPr>
-            <w:rStyle w:val="Hyperlink"/>
-            <w:rFonts w:ascii="Linux Libertine Display" w:hAnsi="Linux Libertine Display" w:cs="Linux Libertine Display"/>
-            <w:color w:val="1F497D" w:themeColor="text2"/>
-          </w:rPr>
-          <w:t xml:space="preserve">Holographic display using </w:t>
-        </w:r>
-        <w:proofErr w:type="spellStart"/>
-        <w:r>
-          <w:rPr>
-            <w:rStyle w:val="Hyperlink"/>
-            <w:rFonts w:ascii="Linux Libertine Display" w:hAnsi="Linux Libertine Display" w:cs="Linux Libertine Display"/>
-            <w:color w:val="1F497D" w:themeColor="text2"/>
-          </w:rPr>
-          <w:t>metasurface</w:t>
-        </w:r>
-        <w:proofErr w:type="spellEnd"/>
-        <w:r>
-          <w:rPr>
-            <w:rStyle w:val="Hyperlink"/>
-            <w:rFonts w:ascii="Linux Libertine Display" w:hAnsi="Linux Libertine Display" w:cs="Linux Libertine Display"/>
-            <w:color w:val="1F497D" w:themeColor="text2"/>
-          </w:rPr>
-          <w:t xml:space="preserve"> and </w:t>
-        </w:r>
-        <w:proofErr w:type="spellStart"/>
-        <w:r>
-          <w:rPr>
-            <w:rStyle w:val="Hyperlink"/>
-            <w:rFonts w:ascii="Linux Libertine Display" w:hAnsi="Linux Libertine Display" w:cs="Linux Libertine Display"/>
-            <w:color w:val="1F497D" w:themeColor="text2"/>
-          </w:rPr>
-          <w:t>metasurface</w:t>
-        </w:r>
-        <w:proofErr w:type="spellEnd"/>
-        <w:r>
-          <w:rPr>
-            <w:rStyle w:val="Hyperlink"/>
-            <w:rFonts w:ascii="Linux Libertine Display" w:hAnsi="Linux Libertine Display" w:cs="Linux Libertine Display"/>
-            <w:color w:val="1F497D" w:themeColor="text2"/>
-          </w:rPr>
-          <w:t xml:space="preserve"> optimization method</w:t>
-        </w:r>
-      </w:hyperlink>
-      <w:r>
-        <w:rPr>
-          <w:rFonts w:ascii="Linux Libertine Display" w:hAnsi="Linux Libertine Display" w:cs="Linux Libertine Display"/>
-        </w:rPr>
-        <w:t>” (US – Application No. 18/737,648)</w:t>
-      </w:r>
-    </w:p>
-    <w:p>
-      <w:pPr>
-        <w:pStyle w:val="051"/>
-        <w:numPr>
-          <w:ilvl w:val="0"/>
-          <w:numId w:val="1"/>
-        </w:numPr>
-        <w:spacing w:after="120"/>
-        <w:rPr>
-          <w:rFonts w:ascii="Linux Libertine Display" w:hAnsi="Linux Libertine Display" w:cs="Linux Libertine Display"/>
-          <w:bCs/>
-          <w:kern w:val="0"/>
-        </w:rPr>
-      </w:pPr>
-      <w:r>
-        <w:rPr>
-          <w:rFonts w:ascii="Linux Libertine Display" w:hAnsi="Linux Libertine Display" w:cs="Linux Libertine Display"/>
-        </w:rPr>
-        <w:t xml:space="preserve">J. Hong, C. Kim, B. Lee, </w:t>
-      </w:r>
-      <w:r>
-        <w:rPr>
-          <w:rFonts w:ascii="Linux Libertine Display" w:hAnsi="Linux Libertine Display" w:cs="Linux Libertine Display"/>
-          <w:b/>
-          <w:bCs/>
-          <w:u w:val="single"/>
-        </w:rPr>
-        <w:t>Y. Kim</w:t>
-      </w:r>
-      <w:r>
-        <w:rPr>
-          <w:rFonts w:ascii="Linux Libertine Display" w:hAnsi="Linux Libertine Display" w:cs="Linux Libertine Display"/>
-        </w:rPr>
-        <w:t>, G.-Y. Lee, J. Jang, Y. Jeong, “</w:t>
-      </w:r>
-      <w:hyperlink r:id="rId28" w:history="1">
-        <w:r>
-          <w:rPr>
-            <w:rStyle w:val="Hyperlink"/>
-            <w:rFonts w:ascii="Linux Libertine Display" w:hAnsi="Linux Libertine Display" w:cs="Linux Libertine Display"/>
-            <w:color w:val="1F497D" w:themeColor="text2"/>
-          </w:rPr>
-          <w:t>Color-routing element, method of manufacturing the same, and image sensor including the color-routing element</w:t>
-        </w:r>
-      </w:hyperlink>
-      <w:r>
-        <w:rPr>
-          <w:rFonts w:ascii="Linux Libertine Display" w:hAnsi="Linux Libertine Display" w:cs="Linux Libertine Display"/>
-        </w:rPr>
-        <w:t>” (US – Application No. 18/937,958)</w:t>
+        <w:wordWrap/>
+        <w:adjustRightInd w:val="0"/>
+        <w:spacing w:after="0" w:line="360" w:lineRule="auto"/>
+        <w:jc w:val="left"/>
+        <w:outlineLvl w:val="0"/>
+        <w:rPr>
+          <w:rFonts w:ascii="Linux Libertine Display" w:hAnsi="Linux Libertine Display" w:cs="Linux Libertine Display"/>
+          <w:b/>
+          <w:bCs/>
+          <w:kern w:val="0"/>
+          <w:sz w:val="24"/>
+          <w:szCs w:val="24"/>
+        </w:rPr>
+      </w:pPr>
+      <w:r>
+        <w:rPr>
+          <w:rFonts w:ascii="Linux Libertine Display" w:hAnsi="Linux Libertine Display" w:cs="Linux Libertine Display"/>
+          <w:kern w:val="0"/>
+          <w:sz w:val="22"/>
+        </w:rPr>
+        <w:t xml:space="preserve">Nature Communications, </w:t>
+      </w:r>
+      <w:r>
+        <w:rPr>
+          <w:rFonts w:ascii="Linux Libertine Display" w:hAnsi="Linux Libertine Display" w:cs="Linux Libertine Display"/>
+          <w:kern w:val="0"/>
+          <w:sz w:val="22"/>
+        </w:rPr>
+        <w:t>Scientific Reports, ACS Photonics, ACM SIGGRAPH, ACM Transactions on Graphics (TOG), Optical and Quantum Electronics</w:t>
       </w:r>
     </w:p>
     <w:p>
@@ -7139,6 +5462,95 @@
     </w:pict>
   </w:numPicBullet>
   <w:abstractNum w:abstractNumId="0" w15:restartNumberingAfterBreak="0">
+    <w:nsid w:val="024D600A"/>
+    <w:multiLevelType w:val="hybridMultilevel"/>
+    <w:tmpl w:val="34342A78"/>
+    <w:lvl w:ilvl="0" w:tplc="0409000F">
+      <w:start w:val="1"/>
+      <w:numFmt w:val="decimal"/>
+      <w:lvlText w:val="%1."/>
+      <w:lvlJc w:val="left"/>
+      <w:pPr>
+        <w:ind w:left="360" w:hanging="360"/>
+      </w:pPr>
+      <w:rPr>
+        <w:rFonts w:hint="default"/>
+      </w:rPr>
+    </w:lvl>
+    <w:lvl w:ilvl="1" w:tplc="04090019" w:tentative="1">
+      <w:start w:val="1"/>
+      <w:numFmt w:val="lowerLetter"/>
+      <w:lvlText w:val="%2."/>
+      <w:lvlJc w:val="left"/>
+      <w:pPr>
+        <w:ind w:left="1080" w:hanging="360"/>
+      </w:pPr>
+    </w:lvl>
+    <w:lvl w:ilvl="2" w:tplc="0409001B" w:tentative="1">
+      <w:start w:val="1"/>
+      <w:numFmt w:val="lowerRoman"/>
+      <w:lvlText w:val="%3."/>
+      <w:lvlJc w:val="right"/>
+      <w:pPr>
+        <w:ind w:left="1800" w:hanging="180"/>
+      </w:pPr>
+    </w:lvl>
+    <w:lvl w:ilvl="3" w:tplc="0409000F" w:tentative="1">
+      <w:start w:val="1"/>
+      <w:numFmt w:val="decimal"/>
+      <w:lvlText w:val="%4."/>
+      <w:lvlJc w:val="left"/>
+      <w:pPr>
+        <w:ind w:left="2520" w:hanging="360"/>
+      </w:pPr>
+    </w:lvl>
+    <w:lvl w:ilvl="4" w:tplc="04090019" w:tentative="1">
+      <w:start w:val="1"/>
+      <w:numFmt w:val="lowerLetter"/>
+      <w:lvlText w:val="%5."/>
+      <w:lvlJc w:val="left"/>
+      <w:pPr>
+        <w:ind w:left="3240" w:hanging="360"/>
+      </w:pPr>
+    </w:lvl>
+    <w:lvl w:ilvl="5" w:tplc="0409001B" w:tentative="1">
+      <w:start w:val="1"/>
+      <w:numFmt w:val="lowerRoman"/>
+      <w:lvlText w:val="%6."/>
+      <w:lvlJc w:val="right"/>
+      <w:pPr>
+        <w:ind w:left="3960" w:hanging="180"/>
+      </w:pPr>
+    </w:lvl>
+    <w:lvl w:ilvl="6" w:tplc="0409000F" w:tentative="1">
+      <w:start w:val="1"/>
+      <w:numFmt w:val="decimal"/>
+      <w:lvlText w:val="%7."/>
+      <w:lvlJc w:val="left"/>
+      <w:pPr>
+        <w:ind w:left="4680" w:hanging="360"/>
+      </w:pPr>
+    </w:lvl>
+    <w:lvl w:ilvl="7" w:tplc="04090019" w:tentative="1">
+      <w:start w:val="1"/>
+      <w:numFmt w:val="lowerLetter"/>
+      <w:lvlText w:val="%8."/>
+      <w:lvlJc w:val="left"/>
+      <w:pPr>
+        <w:ind w:left="5400" w:hanging="360"/>
+      </w:pPr>
+    </w:lvl>
+    <w:lvl w:ilvl="8" w:tplc="0409001B" w:tentative="1">
+      <w:start w:val="1"/>
+      <w:numFmt w:val="lowerRoman"/>
+      <w:lvlText w:val="%9."/>
+      <w:lvlJc w:val="right"/>
+      <w:pPr>
+        <w:ind w:left="6120" w:hanging="180"/>
+      </w:pPr>
+    </w:lvl>
+  </w:abstractNum>
+  <w:abstractNum w:abstractNumId="1" w15:restartNumberingAfterBreak="0">
     <w:nsid w:val="036D2C9A"/>
     <w:multiLevelType w:val="hybridMultilevel"/>
     <w:tmpl w:val="7B004432"/>
@@ -7251,7 +5663,7 @@
       </w:rPr>
     </w:lvl>
   </w:abstractNum>
-  <w:abstractNum w:abstractNumId="1" w15:restartNumberingAfterBreak="0">
+  <w:abstractNum w:abstractNumId="2" w15:restartNumberingAfterBreak="0">
     <w:nsid w:val="0AD429EF"/>
     <w:multiLevelType w:val="hybridMultilevel"/>
     <w:tmpl w:val="BBD09E72"/>
@@ -7341,7 +5753,7 @@
       </w:pPr>
     </w:lvl>
   </w:abstractNum>
-  <w:abstractNum w:abstractNumId="2" w15:restartNumberingAfterBreak="0">
+  <w:abstractNum w:abstractNumId="3" w15:restartNumberingAfterBreak="0">
     <w:nsid w:val="0D407BFD"/>
     <w:multiLevelType w:val="hybridMultilevel"/>
     <w:tmpl w:val="032ACA38"/>
@@ -7454,7 +5866,7 @@
       </w:rPr>
     </w:lvl>
   </w:abstractNum>
-  <w:abstractNum w:abstractNumId="3" w15:restartNumberingAfterBreak="0">
+  <w:abstractNum w:abstractNumId="4" w15:restartNumberingAfterBreak="0">
     <w:nsid w:val="12295F0B"/>
     <w:multiLevelType w:val="hybridMultilevel"/>
     <w:tmpl w:val="554C9864"/>
@@ -7546,7 +5958,7 @@
       </w:pPr>
     </w:lvl>
   </w:abstractNum>
-  <w:abstractNum w:abstractNumId="4" w15:restartNumberingAfterBreak="0">
+  <w:abstractNum w:abstractNumId="5" w15:restartNumberingAfterBreak="0">
     <w:nsid w:val="19DF3515"/>
     <w:multiLevelType w:val="hybridMultilevel"/>
     <w:tmpl w:val="9CE8DFF4"/>
@@ -7640,7 +6052,7 @@
       </w:pPr>
     </w:lvl>
   </w:abstractNum>
-  <w:abstractNum w:abstractNumId="5" w15:restartNumberingAfterBreak="0">
+  <w:abstractNum w:abstractNumId="6" w15:restartNumberingAfterBreak="0">
     <w:nsid w:val="2AB23543"/>
     <w:multiLevelType w:val="hybridMultilevel"/>
     <w:tmpl w:val="2B720934"/>
@@ -7753,7 +6165,7 @@
       </w:rPr>
     </w:lvl>
   </w:abstractNum>
-  <w:abstractNum w:abstractNumId="6" w15:restartNumberingAfterBreak="0">
+  <w:abstractNum w:abstractNumId="7" w15:restartNumberingAfterBreak="0">
     <w:nsid w:val="3F8812B1"/>
     <w:multiLevelType w:val="hybridMultilevel"/>
     <w:tmpl w:val="4772487E"/>
@@ -7845,7 +6257,7 @@
       </w:pPr>
     </w:lvl>
   </w:abstractNum>
-  <w:abstractNum w:abstractNumId="7" w15:restartNumberingAfterBreak="0">
+  <w:abstractNum w:abstractNumId="8" w15:restartNumberingAfterBreak="0">
     <w:nsid w:val="4322261B"/>
     <w:multiLevelType w:val="hybridMultilevel"/>
     <w:tmpl w:val="13423E08"/>
@@ -7986,7 +6398,7 @@
       </w:rPr>
     </w:lvl>
   </w:abstractNum>
-  <w:abstractNum w:abstractNumId="8" w15:restartNumberingAfterBreak="0">
+  <w:abstractNum w:abstractNumId="9" w15:restartNumberingAfterBreak="0">
     <w:nsid w:val="43986CB8"/>
     <w:multiLevelType w:val="hybridMultilevel"/>
     <w:tmpl w:val="04628078"/>
@@ -8099,7 +6511,7 @@
       </w:rPr>
     </w:lvl>
   </w:abstractNum>
-  <w:abstractNum w:abstractNumId="9" w15:restartNumberingAfterBreak="0">
+  <w:abstractNum w:abstractNumId="10" w15:restartNumberingAfterBreak="0">
     <w:nsid w:val="48D7176B"/>
     <w:multiLevelType w:val="hybridMultilevel"/>
     <w:tmpl w:val="0D5CED46"/>
@@ -8212,7 +6624,7 @@
       </w:rPr>
     </w:lvl>
   </w:abstractNum>
-  <w:abstractNum w:abstractNumId="10" w15:restartNumberingAfterBreak="0">
+  <w:abstractNum w:abstractNumId="11" w15:restartNumberingAfterBreak="0">
     <w:nsid w:val="5E576954"/>
     <w:multiLevelType w:val="hybridMultilevel"/>
     <w:tmpl w:val="F5A6A4A8"/>
@@ -8325,7 +6737,7 @@
       </w:rPr>
     </w:lvl>
   </w:abstractNum>
-  <w:abstractNum w:abstractNumId="11" w15:restartNumberingAfterBreak="0">
+  <w:abstractNum w:abstractNumId="12" w15:restartNumberingAfterBreak="0">
     <w:nsid w:val="603519C7"/>
     <w:multiLevelType w:val="hybridMultilevel"/>
     <w:tmpl w:val="ED428562"/>
@@ -8438,7 +6850,7 @@
       </w:rPr>
     </w:lvl>
   </w:abstractNum>
-  <w:abstractNum w:abstractNumId="12" w15:restartNumberingAfterBreak="0">
+  <w:abstractNum w:abstractNumId="13" w15:restartNumberingAfterBreak="0">
     <w:nsid w:val="67BF651D"/>
     <w:multiLevelType w:val="hybridMultilevel"/>
     <w:tmpl w:val="1940FBC2"/>
@@ -8551,7 +6963,7 @@
       </w:rPr>
     </w:lvl>
   </w:abstractNum>
-  <w:abstractNum w:abstractNumId="13" w15:restartNumberingAfterBreak="0">
+  <w:abstractNum w:abstractNumId="14" w15:restartNumberingAfterBreak="0">
     <w:nsid w:val="77DB4C94"/>
     <w:multiLevelType w:val="hybridMultilevel"/>
     <w:tmpl w:val="3CE44034"/>
@@ -8664,7 +7076,7 @@
       </w:rPr>
     </w:lvl>
   </w:abstractNum>
-  <w:abstractNum w:abstractNumId="14" w15:restartNumberingAfterBreak="0">
+  <w:abstractNum w:abstractNumId="15" w15:restartNumberingAfterBreak="0">
     <w:nsid w:val="7B2B77D8"/>
     <w:multiLevelType w:val="hybridMultilevel"/>
     <w:tmpl w:val="9C529402"/>
@@ -8778,58 +7190,61 @@
     </w:lvl>
   </w:abstractNum>
   <w:num w:numId="1" w16cid:durableId="1891913885">
+    <w:abstractNumId w:val="5"/>
+  </w:num>
+  <w:num w:numId="2" w16cid:durableId="1085683944">
+    <w:abstractNumId w:val="9"/>
+  </w:num>
+  <w:num w:numId="3" w16cid:durableId="1269384679">
+    <w:abstractNumId w:val="3"/>
+  </w:num>
+  <w:num w:numId="4" w16cid:durableId="2139296027">
+    <w:abstractNumId w:val="5"/>
+  </w:num>
+  <w:num w:numId="5" w16cid:durableId="1830242527">
+    <w:abstractNumId w:val="2"/>
+  </w:num>
+  <w:num w:numId="6" w16cid:durableId="799692344">
     <w:abstractNumId w:val="4"/>
   </w:num>
-  <w:num w:numId="2" w16cid:durableId="1085683944">
+  <w:num w:numId="7" w16cid:durableId="1320768709">
+    <w:abstractNumId w:val="14"/>
+  </w:num>
+  <w:num w:numId="8" w16cid:durableId="261687185">
+    <w:abstractNumId w:val="10"/>
+  </w:num>
+  <w:num w:numId="9" w16cid:durableId="1553421429">
+    <w:abstractNumId w:val="13"/>
+  </w:num>
+  <w:num w:numId="10" w16cid:durableId="798184333">
     <w:abstractNumId w:val="8"/>
   </w:num>
-  <w:num w:numId="3" w16cid:durableId="1269384679">
-    <w:abstractNumId w:val="2"/>
+  <w:num w:numId="11" w16cid:durableId="2013101990">
+    <w:abstractNumId w:val="15"/>
   </w:num>
-  <w:num w:numId="4" w16cid:durableId="2139296027">
-    <w:abstractNumId w:val="4"/>
+  <w:num w:numId="12" w16cid:durableId="761612898">
+    <w:abstractNumId w:val="12"/>
   </w:num>
-  <w:num w:numId="5" w16cid:durableId="1830242527">
+  <w:num w:numId="13" w16cid:durableId="909540162">
+    <w:abstractNumId w:val="6"/>
+  </w:num>
+  <w:num w:numId="14" w16cid:durableId="1929382911">
+    <w:abstractNumId w:val="11"/>
+  </w:num>
+  <w:num w:numId="15" w16cid:durableId="1567298874">
     <w:abstractNumId w:val="1"/>
   </w:num>
-  <w:num w:numId="6" w16cid:durableId="799692344">
-    <w:abstractNumId w:val="3"/>
-  </w:num>
-  <w:num w:numId="7" w16cid:durableId="1320768709">
-    <w:abstractNumId w:val="13"/>
-  </w:num>
-  <w:num w:numId="8" w16cid:durableId="261687185">
-    <w:abstractNumId w:val="9"/>
-  </w:num>
-  <w:num w:numId="9" w16cid:durableId="1553421429">
-    <w:abstractNumId w:val="12"/>
-  </w:num>
-  <w:num w:numId="10" w16cid:durableId="798184333">
+  <w:num w:numId="16" w16cid:durableId="974213894">
     <w:abstractNumId w:val="7"/>
   </w:num>
-  <w:num w:numId="11" w16cid:durableId="2013101990">
-    <w:abstractNumId w:val="14"/>
-  </w:num>
-  <w:num w:numId="12" w16cid:durableId="761612898">
-    <w:abstractNumId w:val="11"/>
-  </w:num>
-  <w:num w:numId="13" w16cid:durableId="909540162">
+  <w:num w:numId="17" w16cid:durableId="493835943">
     <w:abstractNumId w:val="5"/>
-  </w:num>
-  <w:num w:numId="14" w16cid:durableId="1929382911">
-    <w:abstractNumId w:val="10"/>
-  </w:num>
-  <w:num w:numId="15" w16cid:durableId="1567298874">
-    <w:abstractNumId w:val="0"/>
-  </w:num>
-  <w:num w:numId="16" w16cid:durableId="974213894">
-    <w:abstractNumId w:val="6"/>
-  </w:num>
-  <w:num w:numId="17" w16cid:durableId="493835943">
-    <w:abstractNumId w:val="4"/>
     <w:lvlOverride w:ilvl="0">
       <w:startOverride w:val="1"/>
     </w:lvlOverride>
+  </w:num>
+  <w:num w:numId="18" w16cid:durableId="2118020040">
+    <w:abstractNumId w:val="0"/>
   </w:num>
   <w:numIdMacAtCleanup w:val="9"/>
 </w:numbering>

</xml_diff>

<commit_message>
Deploying to gh-pages from @ YoungJIn94/YoungJIn94.github.io@7133bafd148ca53880fb117788484f4c106025eb 🚀
</commit_message>
<xml_diff>
--- a/assets/pdf/YJKim_CV.docx
+++ b/assets/pdf/YJKim_CV.docx
@@ -1551,7 +1551,7 @@
               <w:jc w:val="center"/>
               <w:outlineLvl w:val="0"/>
               <w:rPr>
-                <w:rFonts w:ascii="Linux Libertine Display" w:hAnsi="Linux Libertine Display" w:cs="Linux Libertine Display"/>
+                <w:rFonts w:ascii="Linux Libertine Display" w:hAnsi="Linux Libertine Display" w:cs="Linux Libertine Display" w:hint="eastAsia"/>
                 <w:bCs/>
                 <w:kern w:val="0"/>
                 <w:sz w:val="22"/>
@@ -1565,15 +1565,6 @@
                 <w:sz w:val="22"/>
               </w:rPr>
               <w:t>Intern</w:t>
-            </w:r>
-            <w:r>
-              <w:rPr>
-                <w:rFonts w:ascii="Linux Libertine Display" w:hAnsi="Linux Libertine Display" w:cs="Linux Libertine Display"/>
-                <w:bCs/>
-                <w:kern w:val="0"/>
-                <w:sz w:val="22"/>
-              </w:rPr>
-              <w:t>ship</w:t>
             </w:r>
           </w:p>
         </w:tc>
@@ -1652,7 +1643,7 @@
                 <w:rFonts w:ascii="Linux Libertine Display" w:hAnsi="Linux Libertine Display" w:cs="Linux Libertine Display"/>
                 <w:bCs/>
                 <w:kern w:val="0"/>
-                <w:sz w:val="22"/>
+                <w:szCs w:val="20"/>
               </w:rPr>
             </w:pPr>
             <w:r>
@@ -1663,6 +1654,50 @@
                 <w:szCs w:val="20"/>
               </w:rPr>
               <w:t>Research subject: Development of new waveguide architecture</w:t>
+            </w:r>
+          </w:p>
+          <w:p>
+            <w:pPr>
+              <w:wordWrap/>
+              <w:adjustRightInd w:val="0"/>
+              <w:spacing w:line="276" w:lineRule="auto"/>
+              <w:ind w:firstLineChars="50" w:firstLine="110"/>
+              <w:jc w:val="left"/>
+              <w:rPr>
+                <w:rFonts w:ascii="Linux Libertine Display" w:hAnsi="Linux Libertine Display" w:cs="Linux Libertine Display"/>
+                <w:bCs/>
+                <w:kern w:val="0"/>
+                <w:sz w:val="22"/>
+              </w:rPr>
+            </w:pPr>
+            <w:r>
+              <w:rPr>
+                <w:rFonts w:ascii="Linux Libertine Display" w:hAnsi="Linux Libertine Display" w:cs="Linux Libertine Display"/>
+                <w:bCs/>
+                <w:kern w:val="0"/>
+                <w:sz w:val="22"/>
+              </w:rPr>
+              <w:t xml:space="preserve">Manager: </w:t>
+            </w:r>
+            <w:proofErr w:type="spellStart"/>
+            <w:r>
+              <w:rPr>
+                <w:rFonts w:ascii="Linux Libertine Display" w:hAnsi="Linux Libertine Display" w:cs="Linux Libertine Display"/>
+                <w:bCs/>
+                <w:kern w:val="0"/>
+                <w:sz w:val="22"/>
+              </w:rPr>
+              <w:t>Xiayu</w:t>
+            </w:r>
+            <w:proofErr w:type="spellEnd"/>
+            <w:r>
+              <w:rPr>
+                <w:rFonts w:ascii="Linux Libertine Display" w:hAnsi="Linux Libertine Display" w:cs="Linux Libertine Display"/>
+                <w:bCs/>
+                <w:kern w:val="0"/>
+                <w:sz w:val="22"/>
+              </w:rPr>
+              <w:t xml:space="preserve"> Feng</w:t>
             </w:r>
           </w:p>
         </w:tc>
@@ -1803,7 +1838,29 @@
           <w:sz w:val="28"/>
           <w:szCs w:val="28"/>
         </w:rPr>
-        <w:t>HONOR AND AWARDS</w:t>
+        <w:t>HONOR</w:t>
+      </w:r>
+      <w:r>
+        <w:rPr>
+          <w:rFonts w:ascii="Linux Libertine Display" w:hAnsi="Linux Libertine Display" w:cs="Linux Libertine Display"/>
+          <w:b/>
+          <w:bCs/>
+          <w:kern w:val="0"/>
+          <w:sz w:val="28"/>
+          <w:szCs w:val="28"/>
+        </w:rPr>
+        <w:t>S</w:t>
+      </w:r>
+      <w:r>
+        <w:rPr>
+          <w:rFonts w:ascii="Linux Libertine Display" w:hAnsi="Linux Libertine Display" w:cs="Linux Libertine Display"/>
+          <w:b/>
+          <w:bCs/>
+          <w:kern w:val="0"/>
+          <w:sz w:val="28"/>
+          <w:szCs w:val="28"/>
+        </w:rPr>
+        <w:t xml:space="preserve"> AND AWARDS</w:t>
       </w:r>
     </w:p>
     <w:p>
@@ -2248,6 +2305,7 @@
           <w:kern w:val="0"/>
           <w:szCs w:val="20"/>
         </w:rPr>
+        <w:lastRenderedPageBreak/>
         <w:t>Best Poster Paper Awards</w:t>
       </w:r>
     </w:p>
@@ -2273,7 +2331,6 @@
           <w:bCs/>
           <w:kern w:val="0"/>
         </w:rPr>
-        <w:lastRenderedPageBreak/>
         <w:t>Optics and Photonics Congress, Jeju, South Korea, 2021.</w:t>
       </w:r>
     </w:p>
@@ -4393,7 +4450,6 @@
           <w:noProof/>
           <w:kern w:val="0"/>
         </w:rPr>
-        <w:lastRenderedPageBreak/>
         <mc:AlternateContent>
           <mc:Choice Requires="wps">
             <w:drawing>
@@ -4850,8 +4906,385 @@
           <w:sz w:val="28"/>
           <w:szCs w:val="28"/>
         </w:rPr>
-        <w:t>SERVICES</w:t>
-      </w:r>
+        <w:t>INVITED TALKS</w:t>
+      </w:r>
+    </w:p>
+    <w:tbl>
+      <w:tblPr>
+        <w:tblStyle w:val="TableGrid"/>
+        <w:tblW w:w="0" w:type="auto"/>
+        <w:tblBorders>
+          <w:top w:val="none" w:sz="0" w:space="0" w:color="auto"/>
+          <w:left w:val="none" w:sz="0" w:space="0" w:color="auto"/>
+          <w:bottom w:val="none" w:sz="0" w:space="0" w:color="auto"/>
+          <w:right w:val="none" w:sz="0" w:space="0" w:color="auto"/>
+          <w:insideH w:val="none" w:sz="0" w:space="0" w:color="auto"/>
+          <w:insideV w:val="none" w:sz="0" w:space="0" w:color="auto"/>
+        </w:tblBorders>
+        <w:tblLook w:val="04A0" w:firstRow="1" w:lastRow="0" w:firstColumn="1" w:lastColumn="0" w:noHBand="0" w:noVBand="1"/>
+      </w:tblPr>
+      <w:tblGrid>
+        <w:gridCol w:w="1525"/>
+        <w:gridCol w:w="7491"/>
+      </w:tblGrid>
+      <w:tr>
+        <w:trPr>
+          <w:trHeight w:val="720"/>
+        </w:trPr>
+        <w:tc>
+          <w:tcPr>
+            <w:tcW w:w="1525" w:type="dxa"/>
+          </w:tcPr>
+          <w:p>
+            <w:pPr>
+              <w:wordWrap/>
+              <w:adjustRightInd w:val="0"/>
+              <w:jc w:val="left"/>
+              <w:rPr>
+                <w:rFonts w:ascii="Linux Libertine Display" w:hAnsi="Linux Libertine Display" w:cs="Linux Libertine Display"/>
+                <w:b/>
+                <w:bCs/>
+                <w:kern w:val="0"/>
+                <w:sz w:val="22"/>
+              </w:rPr>
+            </w:pPr>
+            <w:r>
+              <w:rPr>
+                <w:rFonts w:ascii="Linux Libertine Display" w:hAnsi="Linux Libertine Display" w:cs="Linux Libertine Display"/>
+                <w:b/>
+                <w:bCs/>
+                <w:kern w:val="0"/>
+                <w:sz w:val="22"/>
+              </w:rPr>
+              <w:t>Mar</w:t>
+            </w:r>
+            <w:r>
+              <w:rPr>
+                <w:rFonts w:ascii="Linux Libertine Display" w:hAnsi="Linux Libertine Display" w:cs="Linux Libertine Display"/>
+                <w:b/>
+                <w:bCs/>
+                <w:kern w:val="0"/>
+                <w:sz w:val="22"/>
+              </w:rPr>
+              <w:t xml:space="preserve"> 202</w:t>
+            </w:r>
+            <w:r>
+              <w:rPr>
+                <w:rFonts w:ascii="Linux Libertine Display" w:hAnsi="Linux Libertine Display" w:cs="Linux Libertine Display"/>
+                <w:b/>
+                <w:bCs/>
+                <w:kern w:val="0"/>
+                <w:sz w:val="22"/>
+              </w:rPr>
+              <w:t>6</w:t>
+            </w:r>
+          </w:p>
+        </w:tc>
+        <w:tc>
+          <w:tcPr>
+            <w:tcW w:w="7491" w:type="dxa"/>
+          </w:tcPr>
+          <w:p>
+            <w:pPr>
+              <w:wordWrap/>
+              <w:adjustRightInd w:val="0"/>
+              <w:spacing w:line="276" w:lineRule="auto"/>
+              <w:jc w:val="left"/>
+              <w:rPr>
+                <w:rFonts w:ascii="Linux Libertine Display" w:hAnsi="Linux Libertine Display" w:cs="Linux Libertine Display"/>
+                <w:b/>
+                <w:bCs/>
+                <w:kern w:val="0"/>
+                <w:sz w:val="22"/>
+              </w:rPr>
+            </w:pPr>
+            <w:r>
+              <w:rPr>
+                <w:rFonts w:ascii="Linux Libertine Display" w:hAnsi="Linux Libertine Display" w:cs="Linux Libertine Display"/>
+                <w:b/>
+                <w:bCs/>
+                <w:kern w:val="0"/>
+                <w:sz w:val="22"/>
+              </w:rPr>
+              <w:t>University College London (UCL)</w:t>
+            </w:r>
+            <w:r>
+              <w:rPr>
+                <w:rFonts w:ascii="Linux Libertine Display" w:hAnsi="Linux Libertine Display" w:cs="Linux Libertine Display"/>
+                <w:kern w:val="0"/>
+                <w:sz w:val="22"/>
+              </w:rPr>
+              <w:t xml:space="preserve">, </w:t>
+            </w:r>
+            <w:r>
+              <w:rPr>
+                <w:rFonts w:ascii="Linux Libertine Display" w:hAnsi="Linux Libertine Display" w:cs="Linux Libertine Display"/>
+                <w:kern w:val="0"/>
+                <w:sz w:val="22"/>
+              </w:rPr>
+              <w:t>invited by Prof. Kaan Ak</w:t>
+            </w:r>
+            <w:r>
+              <w:rPr>
+                <w:rFonts w:ascii="Linux Libertine Display" w:hAnsi="Linux Libertine Display" w:cs="Linux Libertine Display"/>
+                <w:kern w:val="0"/>
+                <w:sz w:val="22"/>
+              </w:rPr>
+              <w:t>ş</w:t>
+            </w:r>
+            <w:r>
+              <w:rPr>
+                <w:rFonts w:ascii="Linux Libertine Display" w:hAnsi="Linux Libertine Display" w:cs="Linux Libertine Display"/>
+                <w:kern w:val="0"/>
+                <w:sz w:val="22"/>
+              </w:rPr>
+              <w:t>it</w:t>
+            </w:r>
+            <w:r>
+              <w:rPr>
+                <w:rFonts w:ascii="Linux Libertine Display" w:hAnsi="Linux Libertine Display" w:cs="Linux Libertine Display"/>
+                <w:b/>
+                <w:bCs/>
+                <w:kern w:val="0"/>
+                <w:sz w:val="22"/>
+              </w:rPr>
+              <w:br/>
+            </w:r>
+            <w:proofErr w:type="spellStart"/>
+            <w:r>
+              <w:rPr>
+                <w:rFonts w:ascii="Linux Libertine Display" w:hAnsi="Linux Libertine Display" w:cs="Linux Libertine Display"/>
+                <w:kern w:val="0"/>
+                <w:szCs w:val="20"/>
+              </w:rPr>
+              <w:t>Nanophotonics</w:t>
+            </w:r>
+            <w:proofErr w:type="spellEnd"/>
+            <w:r>
+              <w:rPr>
+                <w:rFonts w:ascii="Linux Libertine Display" w:hAnsi="Linux Libertine Display" w:cs="Linux Libertine Display"/>
+                <w:kern w:val="0"/>
+                <w:szCs w:val="20"/>
+              </w:rPr>
+              <w:t xml:space="preserve"> for Next-Generation Imaging Systems</w:t>
+            </w:r>
+          </w:p>
+        </w:tc>
+      </w:tr>
+      <w:tr>
+        <w:trPr>
+          <w:trHeight w:val="720"/>
+        </w:trPr>
+        <w:tc>
+          <w:tcPr>
+            <w:tcW w:w="1525" w:type="dxa"/>
+          </w:tcPr>
+          <w:p>
+            <w:pPr>
+              <w:wordWrap/>
+              <w:adjustRightInd w:val="0"/>
+              <w:jc w:val="left"/>
+              <w:rPr>
+                <w:rFonts w:ascii="Linux Libertine Display" w:hAnsi="Linux Libertine Display" w:cs="Linux Libertine Display"/>
+                <w:b/>
+                <w:bCs/>
+                <w:kern w:val="0"/>
+                <w:sz w:val="22"/>
+              </w:rPr>
+            </w:pPr>
+            <w:r>
+              <w:rPr>
+                <w:rFonts w:ascii="Linux Libertine Display" w:hAnsi="Linux Libertine Display" w:cs="Linux Libertine Display"/>
+                <w:b/>
+                <w:bCs/>
+                <w:kern w:val="0"/>
+                <w:sz w:val="22"/>
+              </w:rPr>
+              <w:t>Feb 2024</w:t>
+            </w:r>
+          </w:p>
+        </w:tc>
+        <w:tc>
+          <w:tcPr>
+            <w:tcW w:w="7491" w:type="dxa"/>
+          </w:tcPr>
+          <w:p>
+            <w:pPr>
+              <w:wordWrap/>
+              <w:adjustRightInd w:val="0"/>
+              <w:spacing w:line="276" w:lineRule="auto"/>
+              <w:jc w:val="left"/>
+              <w:rPr>
+                <w:rFonts w:ascii="Linux Libertine Display" w:hAnsi="Linux Libertine Display" w:cs="Linux Libertine Display"/>
+                <w:b/>
+                <w:bCs/>
+                <w:kern w:val="0"/>
+                <w:sz w:val="22"/>
+              </w:rPr>
+            </w:pPr>
+            <w:r>
+              <w:rPr>
+                <w:rFonts w:ascii="Linux Libertine Display" w:hAnsi="Linux Libertine Display" w:cs="Linux Libertine Display"/>
+                <w:b/>
+                <w:bCs/>
+                <w:kern w:val="0"/>
+                <w:sz w:val="22"/>
+              </w:rPr>
+              <w:t>Stanford University</w:t>
+            </w:r>
+            <w:r>
+              <w:rPr>
+                <w:rFonts w:ascii="Linux Libertine Display" w:hAnsi="Linux Libertine Display" w:cs="Linux Libertine Display"/>
+                <w:kern w:val="0"/>
+                <w:sz w:val="22"/>
+              </w:rPr>
+              <w:t>, invited by Prof. Mark Brongersma</w:t>
+            </w:r>
+            <w:r>
+              <w:rPr>
+                <w:rFonts w:ascii="Linux Libertine Display" w:hAnsi="Linux Libertine Display" w:cs="Linux Libertine Display"/>
+                <w:b/>
+                <w:bCs/>
+                <w:kern w:val="0"/>
+                <w:sz w:val="22"/>
+              </w:rPr>
+              <w:br/>
+            </w:r>
+            <w:proofErr w:type="spellStart"/>
+            <w:r>
+              <w:rPr>
+                <w:rFonts w:ascii="Linux Libertine Display" w:hAnsi="Linux Libertine Display" w:cs="Linux Libertine Display"/>
+                <w:kern w:val="0"/>
+                <w:szCs w:val="20"/>
+              </w:rPr>
+              <w:t>Metasurface</w:t>
+            </w:r>
+            <w:proofErr w:type="spellEnd"/>
+            <w:r>
+              <w:rPr>
+                <w:rFonts w:ascii="Linux Libertine Display" w:hAnsi="Linux Libertine Display" w:cs="Linux Libertine Display"/>
+                <w:kern w:val="0"/>
+                <w:szCs w:val="20"/>
+              </w:rPr>
+              <w:t xml:space="preserve"> optics for imaging and holographic display systems</w:t>
+            </w:r>
+          </w:p>
+        </w:tc>
+      </w:tr>
+    </w:tbl>
+    <w:p>
+      <w:pPr>
+        <w:wordWrap/>
+        <w:adjustRightInd w:val="0"/>
+        <w:spacing w:after="0" w:line="240" w:lineRule="auto"/>
+        <w:jc w:val="left"/>
+        <w:rPr>
+          <w:rFonts w:ascii="Linux Libertine Display" w:hAnsi="Linux Libertine Display" w:cs="Linux Libertine Display"/>
+          <w:b/>
+          <w:bCs/>
+          <w:kern w:val="0"/>
+          <w:sz w:val="22"/>
+        </w:rPr>
+      </w:pPr>
+    </w:p>
+    <w:p>
+      <w:pPr>
+        <w:wordWrap/>
+        <w:adjustRightInd w:val="0"/>
+        <w:spacing w:after="0" w:line="240" w:lineRule="auto"/>
+        <w:jc w:val="center"/>
+        <w:rPr>
+          <w:rFonts w:ascii="Linux Libertine Display" w:hAnsi="Linux Libertine Display" w:cs="Linux Libertine Display"/>
+          <w:b/>
+          <w:bCs/>
+          <w:kern w:val="0"/>
+          <w:sz w:val="24"/>
+          <w:szCs w:val="24"/>
+        </w:rPr>
+      </w:pPr>
+      <w:r>
+        <w:rPr>
+          <w:rFonts w:ascii="Linux Libertine Display" w:hAnsi="Linux Libertine Display" w:cs="Linux Libertine Display"/>
+          <w:noProof/>
+          <w:kern w:val="0"/>
+          <w:szCs w:val="20"/>
+        </w:rPr>
+        <mc:AlternateContent>
+          <mc:Choice Requires="wps">
+            <w:drawing>
+              <wp:inline distT="0" distB="0" distL="0" distR="0" wp14:anchorId="13B51F8E" wp14:editId="26884AF4">
+                <wp:extent cx="5687695" cy="0"/>
+                <wp:effectExtent l="0" t="0" r="27305" b="19050"/>
+                <wp:docPr id="405592255" name="직선 연결선 2"/>
+                <wp:cNvGraphicFramePr>
+                  <a:graphicFrameLocks xmlns:a="http://schemas.openxmlformats.org/drawingml/2006/main"/>
+                </wp:cNvGraphicFramePr>
+                <a:graphic xmlns:a="http://schemas.openxmlformats.org/drawingml/2006/main">
+                  <a:graphicData uri="http://schemas.microsoft.com/office/word/2010/wordprocessingShape">
+                    <wps:wsp>
+                      <wps:cNvCnPr>
+                        <a:cxnSpLocks/>
+                      </wps:cNvCnPr>
+                      <wps:spPr>
+                        <a:xfrm>
+                          <a:off x="0" y="0"/>
+                          <a:ext cx="5687695" cy="0"/>
+                        </a:xfrm>
+                        <a:prstGeom prst="line">
+                          <a:avLst/>
+                        </a:prstGeom>
+                        <a:ln>
+                          <a:solidFill>
+                            <a:schemeClr val="tx1"/>
+                          </a:solidFill>
+                        </a:ln>
+                      </wps:spPr>
+                      <wps:style>
+                        <a:lnRef idx="1">
+                          <a:schemeClr val="accent1"/>
+                        </a:lnRef>
+                        <a:fillRef idx="0">
+                          <a:schemeClr val="accent1"/>
+                        </a:fillRef>
+                        <a:effectRef idx="0">
+                          <a:schemeClr val="accent1"/>
+                        </a:effectRef>
+                        <a:fontRef idx="minor">
+                          <a:schemeClr val="tx1"/>
+                        </a:fontRef>
+                      </wps:style>
+                      <wps:bodyPr/>
+                    </wps:wsp>
+                  </a:graphicData>
+                </a:graphic>
+              </wp:inline>
+            </w:drawing>
+          </mc:Choice>
+          <mc:Fallback>
+            <w:pict>
+              <v:line w14:anchorId="3034166A" id="직선 연결선 2" o:spid="_x0000_s1026" style="visibility:visible;mso-wrap-style:square;mso-left-percent:-10001;mso-top-percent:-10001;mso-position-horizontal:absolute;mso-position-horizontal-relative:char;mso-position-vertical:absolute;mso-position-vertical-relative:line;mso-left-percent:-10001;mso-top-percent:-10001" from="0,0" to="447.85pt,0" o:gfxdata="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" strokecolor="black [3213]">
+                <o:lock v:ext="edit" shapetype="f"/>
+                <w10:anchorlock/>
+              </v:line>
+            </w:pict>
+          </mc:Fallback>
+        </mc:AlternateContent>
+      </w:r>
+    </w:p>
+    <w:p>
+      <w:pPr>
+        <w:wordWrap/>
+        <w:adjustRightInd w:val="0"/>
+        <w:spacing w:after="0" w:line="240" w:lineRule="auto"/>
+        <w:jc w:val="center"/>
+        <w:rPr>
+          <w:rFonts w:ascii="Linux Libertine Display" w:hAnsi="Linux Libertine Display" w:cs="Linux Libertine Display"/>
+          <w:b/>
+          <w:bCs/>
+          <w:kern w:val="0"/>
+          <w:szCs w:val="20"/>
+        </w:rPr>
+      </w:pPr>
     </w:p>
     <w:p>
       <w:pPr>
@@ -4865,20 +5298,20 @@
           <w:b/>
           <w:bCs/>
           <w:kern w:val="0"/>
-          <w:sz w:val="24"/>
-          <w:szCs w:val="24"/>
-        </w:rPr>
-      </w:pPr>
-      <w:r>
-        <w:rPr>
-          <w:rFonts w:ascii="Linux Libertine Display" w:hAnsi="Linux Libertine Display" w:cs="Linux Libertine Display"/>
-          <w:b/>
-          <w:bCs/>
-          <w:kern w:val="0"/>
-          <w:sz w:val="24"/>
-          <w:szCs w:val="24"/>
-        </w:rPr>
-        <w:t>Reviewer</w:t>
+          <w:sz w:val="28"/>
+          <w:szCs w:val="28"/>
+        </w:rPr>
+      </w:pPr>
+      <w:r>
+        <w:rPr>
+          <w:rFonts w:ascii="Linux Libertine Display" w:hAnsi="Linux Libertine Display" w:cs="Linux Libertine Display"/>
+          <w:b/>
+          <w:bCs/>
+          <w:kern w:val="0"/>
+          <w:sz w:val="28"/>
+          <w:szCs w:val="28"/>
+        </w:rPr>
+        <w:t>SERVICES</w:t>
       </w:r>
     </w:p>
     <w:p>
@@ -4893,6 +5326,32 @@
           <w:b/>
           <w:bCs/>
           <w:kern w:val="0"/>
+          <w:sz w:val="22"/>
+        </w:rPr>
+      </w:pPr>
+      <w:r>
+        <w:rPr>
+          <w:rFonts w:ascii="Linux Libertine Display" w:hAnsi="Linux Libertine Display" w:cs="Linux Libertine Display"/>
+          <w:b/>
+          <w:bCs/>
+          <w:kern w:val="0"/>
+          <w:sz w:val="22"/>
+        </w:rPr>
+        <w:t>Reviewer</w:t>
+      </w:r>
+    </w:p>
+    <w:p>
+      <w:pPr>
+        <w:wordWrap/>
+        <w:adjustRightInd w:val="0"/>
+        <w:spacing w:after="0" w:line="360" w:lineRule="auto"/>
+        <w:jc w:val="left"/>
+        <w:outlineLvl w:val="0"/>
+        <w:rPr>
+          <w:rFonts w:ascii="Linux Libertine Display" w:hAnsi="Linux Libertine Display" w:cs="Linux Libertine Display"/>
+          <w:b/>
+          <w:bCs/>
+          <w:kern w:val="0"/>
           <w:sz w:val="24"/>
           <w:szCs w:val="24"/>
         </w:rPr>
@@ -4911,8 +5370,42 @@
           <w:kern w:val="0"/>
           <w:sz w:val="22"/>
         </w:rPr>
-        <w:t>Scientific Reports, ACS Photonics, ACM SIGGRAPH, ACM Transactions on Graphics (TOG), Optical and Quantum Electronics</w:t>
-      </w:r>
+        <w:t>Scientific Reports, ACS Photonics, ACM SIGGRAPH, ACM SIGRGAPH Asia, ACM Transactions on Graphics (TOG), Optical and Quantum Electronics</w:t>
+      </w:r>
+    </w:p>
+    <w:p>
+      <w:pPr>
+        <w:wordWrap/>
+        <w:adjustRightInd w:val="0"/>
+        <w:spacing w:after="0" w:line="360" w:lineRule="auto"/>
+        <w:jc w:val="left"/>
+        <w:outlineLvl w:val="0"/>
+        <w:rPr>
+          <w:rFonts w:ascii="Linux Libertine Display" w:hAnsi="Linux Libertine Display" w:cs="Linux Libertine Display"/>
+          <w:b/>
+          <w:bCs/>
+          <w:kern w:val="0"/>
+          <w:sz w:val="24"/>
+          <w:szCs w:val="24"/>
+        </w:rPr>
+      </w:pPr>
+    </w:p>
+    <w:p>
+      <w:pPr>
+        <w:wordWrap/>
+        <w:adjustRightInd w:val="0"/>
+        <w:spacing w:after="0" w:line="360" w:lineRule="auto"/>
+        <w:jc w:val="left"/>
+        <w:outlineLvl w:val="0"/>
+        <w:rPr>
+          <w:rFonts w:ascii="Linux Libertine Display" w:hAnsi="Linux Libertine Display" w:cs="Linux Libertine Display"/>
+          <w:b/>
+          <w:bCs/>
+          <w:kern w:val="0"/>
+          <w:sz w:val="24"/>
+          <w:szCs w:val="24"/>
+        </w:rPr>
+      </w:pPr>
     </w:p>
     <w:p>
       <w:pPr>
@@ -5449,14 +5942,14 @@
         <v:path o:extrusionok="f" gradientshapeok="t" o:connecttype="rect"/>
         <o:lock v:ext="edit" aspectratio="t"/>
       </v:shapetype>
-      <v:shape id="_x0000_i1025" type="#_x0000_t75" style="width:540.45pt;height:540.45pt;visibility:visible;mso-wrap-style:square" o:bullet="t">
+      <v:shape id="_x0000_i1025" type="#_x0000_t75" style="width:540.25pt;height:540.25pt;visibility:visible;mso-wrap-style:square" o:bullet="t">
         <v:imagedata r:id="rId1" o:title="" croptop="3115f" cropbottom="3115f" cropleft="3115f" cropright="3115f"/>
       </v:shape>
     </w:pict>
   </w:numPicBullet>
   <w:numPicBullet w:numPicBulletId="1">
     <w:pict>
-      <v:shape id="_x0000_i1026" type="#_x0000_t75" style="width:13.9pt;height:13.9pt;visibility:visible;mso-wrap-style:square" o:bullet="t">
+      <v:shape id="_x0000_i1026" type="#_x0000_t75" style="width:14.1pt;height:14.1pt;visibility:visible;mso-wrap-style:square" o:bullet="t">
         <v:imagedata r:id="rId2" o:title="" cropbottom="-1179f" cropright="-1179f"/>
       </v:shape>
     </w:pict>

</xml_diff>

<commit_message>
Deploying to gh-pages from @ YoungJIn94/YoungJIn94.github.io@a8840f6201c243f6778bc6febc191793a29dcad1 🚀
</commit_message>
<xml_diff>
--- a/assets/pdf/YJKim_CV.docx
+++ b/assets/pdf/YJKim_CV.docx
@@ -605,7 +605,7 @@
     <w:tbl>
       <w:tblPr>
         <w:tblStyle w:val="TableGrid"/>
-        <w:tblW w:w="0" w:type="auto"/>
+        <w:tblW w:w="9129" w:type="dxa"/>
         <w:tblBorders>
           <w:top w:val="none" w:sz="0" w:space="0" w:color="auto"/>
           <w:left w:val="none" w:sz="0" w:space="0" w:color="auto"/>
@@ -624,12 +624,12 @@
       </w:tblPr>
       <w:tblGrid>
         <w:gridCol w:w="1555"/>
-        <w:gridCol w:w="6100"/>
-        <w:gridCol w:w="1361"/>
+        <w:gridCol w:w="6134"/>
+        <w:gridCol w:w="1440"/>
       </w:tblGrid>
       <w:tr>
         <w:trPr>
-          <w:trHeight w:val="576"/>
+          <w:trHeight w:val="720"/>
         </w:trPr>
         <w:tc>
           <w:tcPr>
@@ -664,7 +664,7 @@
         </w:tc>
         <w:tc>
           <w:tcPr>
-            <w:tcW w:w="6100" w:type="dxa"/>
+            <w:tcW w:w="6134" w:type="dxa"/>
             <w:vAlign w:val="center"/>
           </w:tcPr>
           <w:p>
@@ -829,7 +829,7 @@
         </w:tc>
         <w:tc>
           <w:tcPr>
-            <w:tcW w:w="1361" w:type="dxa"/>
+            <w:tcW w:w="1440" w:type="dxa"/>
             <w:vAlign w:val="center"/>
           </w:tcPr>
           <w:p>
@@ -853,7 +853,7 @@
                 <w:kern w:val="0"/>
                 <w:sz w:val="22"/>
               </w:rPr>
-              <w:t>2019 – 20</w:t>
+              <w:t>3/</w:t>
             </w:r>
             <w:r>
               <w:rPr>
@@ -862,7 +862,62 @@
                 <w:kern w:val="0"/>
                 <w:sz w:val="22"/>
               </w:rPr>
-              <w:t>24</w:t>
+              <w:t>2019</w:t>
+            </w:r>
+            <m:oMath>
+              <m:r>
+                <w:rPr>
+                  <w:rFonts w:ascii="Cambria Math" w:hAnsi="Cambria Math" w:cs="Linux Libertine Display"/>
+                  <w:kern w:val="0"/>
+                  <w:sz w:val="22"/>
+                </w:rPr>
+                <m:t>-</m:t>
+              </m:r>
+            </m:oMath>
+            <w:r>
+              <w:rPr>
+                <w:rFonts w:ascii="Linux Libertine Display" w:hAnsi="Linux Libertine Display" w:cs="Linux Libertine Display"/>
+                <w:bCs/>
+                <w:kern w:val="0"/>
+                <w:sz w:val="22"/>
+              </w:rPr>
+              <w:t xml:space="preserve"> </w:t>
+            </w:r>
+            <w:r>
+              <w:rPr>
+                <w:rFonts w:ascii="Linux Libertine Display" w:hAnsi="Linux Libertine Display" w:cs="Linux Libertine Display"/>
+                <w:bCs/>
+                <w:kern w:val="0"/>
+                <w:sz w:val="22"/>
+              </w:rPr>
+              <w:t>2/</w:t>
+            </w:r>
+            <w:r>
+              <w:rPr>
+                <w:rFonts w:ascii="Linux Libertine Display" w:hAnsi="Linux Libertine Display" w:cs="Linux Libertine Display"/>
+                <w:bCs/>
+                <w:kern w:val="0"/>
+                <w:sz w:val="22"/>
+              </w:rPr>
+              <w:t>20</w:t>
+            </w:r>
+            <w:r>
+              <w:rPr>
+                <w:rFonts w:ascii="Linux Libertine Display" w:hAnsi="Linux Libertine Display" w:cs="Linux Libertine Display"/>
+                <w:bCs/>
+                <w:kern w:val="0"/>
+                <w:sz w:val="22"/>
+              </w:rPr>
+              <w:t>2</w:t>
+            </w:r>
+            <w:r>
+              <w:rPr>
+                <w:rFonts w:ascii="Linux Libertine Display" w:hAnsi="Linux Libertine Display" w:cs="Linux Libertine Display"/>
+                <w:bCs/>
+                <w:kern w:val="0"/>
+                <w:sz w:val="22"/>
+              </w:rPr>
+              <w:t>5</w:t>
             </w:r>
           </w:p>
           <w:p>
@@ -886,7 +941,7 @@
       </w:tr>
       <w:tr>
         <w:trPr>
-          <w:trHeight w:val="576"/>
+          <w:trHeight w:val="720"/>
         </w:trPr>
         <w:tc>
           <w:tcPr>
@@ -921,7 +976,7 @@
         </w:tc>
         <w:tc>
           <w:tcPr>
-            <w:tcW w:w="6100" w:type="dxa"/>
+            <w:tcW w:w="6134" w:type="dxa"/>
             <w:vAlign w:val="center"/>
           </w:tcPr>
           <w:p>
@@ -1011,7 +1066,7 @@
         </w:tc>
         <w:tc>
           <w:tcPr>
-            <w:tcW w:w="1361" w:type="dxa"/>
+            <w:tcW w:w="1440" w:type="dxa"/>
             <w:vAlign w:val="center"/>
           </w:tcPr>
           <w:p>
@@ -1023,11 +1078,9 @@
               <w:outlineLvl w:val="0"/>
               <w:rPr>
                 <w:rFonts w:ascii="Linux Libertine Display" w:hAnsi="Linux Libertine Display" w:cs="Linux Libertine Display"/>
-                <w:b/>
-                <w:bCs/>
-                <w:kern w:val="0"/>
-                <w:sz w:val="28"/>
-                <w:szCs w:val="28"/>
+                <w:bCs/>
+                <w:kern w:val="0"/>
+                <w:sz w:val="22"/>
               </w:rPr>
             </w:pPr>
             <w:r>
@@ -1037,7 +1090,53 @@
                 <w:kern w:val="0"/>
                 <w:sz w:val="22"/>
               </w:rPr>
-              <w:t>2012 – 2019</w:t>
+              <w:t>3/</w:t>
+            </w:r>
+            <w:r>
+              <w:rPr>
+                <w:rFonts w:ascii="Linux Libertine Display" w:hAnsi="Linux Libertine Display" w:cs="Linux Libertine Display"/>
+                <w:bCs/>
+                <w:kern w:val="0"/>
+                <w:sz w:val="22"/>
+              </w:rPr>
+              <w:t>2012</w:t>
+            </w:r>
+            <m:oMath>
+              <m:r>
+                <w:rPr>
+                  <w:rFonts w:ascii="Cambria Math" w:hAnsi="Cambria Math" w:cs="Linux Libertine Display"/>
+                  <w:kern w:val="0"/>
+                  <w:sz w:val="22"/>
+                </w:rPr>
+                <m:t>-</m:t>
+              </m:r>
+            </m:oMath>
+            <w:r>
+              <w:rPr>
+                <w:rFonts w:ascii="Linux Libertine Display" w:hAnsi="Linux Libertine Display" w:cs="Linux Libertine Display"/>
+                <w:bCs/>
+                <w:kern w:val="0"/>
+                <w:sz w:val="22"/>
+              </w:rPr>
+              <w:t xml:space="preserve"> </w:t>
+            </w:r>
+            <w:r>
+              <w:rPr>
+                <w:rFonts w:ascii="Linux Libertine Display" w:hAnsi="Linux Libertine Display" w:cs="Linux Libertine Display"/>
+                <w:bCs/>
+                <w:kern w:val="0"/>
+                <w:sz w:val="22"/>
+              </w:rPr>
+              <w:t>2/</w:t>
+            </w:r>
+            <w:r>
+              <w:rPr>
+                <w:rFonts w:ascii="Linux Libertine Display" w:hAnsi="Linux Libertine Display" w:cs="Linux Libertine Display"/>
+                <w:bCs/>
+                <w:kern w:val="0"/>
+                <w:sz w:val="22"/>
+              </w:rPr>
+              <w:t>2019</w:t>
             </w:r>
           </w:p>
         </w:tc>
@@ -1158,7 +1257,7 @@
     <w:tbl>
       <w:tblPr>
         <w:tblStyle w:val="TableGrid"/>
-        <w:tblW w:w="0" w:type="auto"/>
+        <w:tblW w:w="9270" w:type="dxa"/>
         <w:tblBorders>
           <w:top w:val="none" w:sz="0" w:space="0" w:color="auto"/>
           <w:left w:val="none" w:sz="0" w:space="0" w:color="auto"/>
@@ -1178,9 +1277,12 @@
       <w:tblGrid>
         <w:gridCol w:w="1701"/>
         <w:gridCol w:w="6129"/>
-        <w:gridCol w:w="1186"/>
+        <w:gridCol w:w="1440"/>
       </w:tblGrid>
       <w:tr>
+        <w:trPr>
+          <w:trHeight w:val="720"/>
+        </w:trPr>
         <w:tc>
           <w:tcPr>
             <w:tcW w:w="1701" w:type="dxa"/>
@@ -1303,7 +1405,7 @@
         </w:tc>
         <w:tc>
           <w:tcPr>
-            <w:tcW w:w="1186" w:type="dxa"/>
+            <w:tcW w:w="1440" w:type="dxa"/>
             <w:vAlign w:val="center"/>
           </w:tcPr>
           <w:p>
@@ -1329,6 +1431,15 @@
                 <w:kern w:val="0"/>
                 <w:sz w:val="22"/>
               </w:rPr>
+              <w:t>9/</w:t>
+            </w:r>
+            <w:r>
+              <w:rPr>
+                <w:rFonts w:ascii="Linux Libertine Display" w:hAnsi="Linux Libertine Display" w:cs="Linux Libertine Display"/>
+                <w:bCs/>
+                <w:kern w:val="0"/>
+                <w:sz w:val="22"/>
+              </w:rPr>
               <w:t>202</w:t>
             </w:r>
             <w:r>
@@ -1340,28 +1451,23 @@
               </w:rPr>
               <w:t>5</w:t>
             </w:r>
-            <w:r>
-              <w:rPr>
-                <w:rFonts w:ascii="Linux Libertine Display" w:hAnsi="Linux Libertine Display" w:cs="Linux Libertine Display"/>
-                <w:bCs/>
-                <w:kern w:val="0"/>
-                <w:sz w:val="22"/>
-              </w:rPr>
-              <w:t xml:space="preserve"> </w:t>
-            </w:r>
-            <w:r>
-              <w:rPr>
-                <w:rFonts w:ascii="Linux Libertine Display" w:hAnsi="Linux Libertine Display" w:cs="Linux Libertine Display"/>
-                <w:bCs/>
-                <w:kern w:val="0"/>
-                <w:sz w:val="22"/>
-              </w:rPr>
-              <w:t>–</w:t>
-            </w:r>
+            <m:oMath>
+              <m:r>
+                <w:rPr>
+                  <w:rFonts w:ascii="Cambria Math" w:hAnsi="Cambria Math" w:cs="Linux Libertine Display"/>
+                  <w:kern w:val="0"/>
+                  <w:sz w:val="22"/>
+                </w:rPr>
+                <m:t>-</m:t>
+              </m:r>
+            </m:oMath>
           </w:p>
         </w:tc>
       </w:tr>
       <w:tr>
+        <w:trPr>
+          <w:trHeight w:val="720"/>
+        </w:trPr>
         <w:tc>
           <w:tcPr>
             <w:tcW w:w="1701" w:type="dxa"/>
@@ -1494,7 +1600,7 @@
         </w:tc>
         <w:tc>
           <w:tcPr>
-            <w:tcW w:w="1186" w:type="dxa"/>
+            <w:tcW w:w="1440" w:type="dxa"/>
             <w:vAlign w:val="center"/>
           </w:tcPr>
           <w:p>
@@ -1506,11 +1612,9 @@
               <w:outlineLvl w:val="0"/>
               <w:rPr>
                 <w:rFonts w:ascii="Linux Libertine Display" w:hAnsi="Linux Libertine Display" w:cs="Linux Libertine Display"/>
-                <w:b/>
-                <w:bCs/>
-                <w:kern w:val="0"/>
-                <w:sz w:val="28"/>
-                <w:szCs w:val="28"/>
+                <w:bCs/>
+                <w:kern w:val="0"/>
+                <w:sz w:val="22"/>
               </w:rPr>
             </w:pPr>
             <w:r>
@@ -1520,6 +1624,15 @@
                 <w:kern w:val="0"/>
                 <w:sz w:val="22"/>
               </w:rPr>
+              <w:t>3/</w:t>
+            </w:r>
+            <w:r>
+              <w:rPr>
+                <w:rFonts w:ascii="Linux Libertine Display" w:hAnsi="Linux Libertine Display" w:cs="Linux Libertine Display"/>
+                <w:bCs/>
+                <w:kern w:val="0"/>
+                <w:sz w:val="22"/>
+              </w:rPr>
               <w:t>20</w:t>
             </w:r>
             <w:r>
@@ -1530,13 +1643,56 @@
                 <w:sz w:val="22"/>
               </w:rPr>
               <w:t>25</w:t>
+            </w:r>
+            <m:oMath>
+              <m:r>
+                <w:rPr>
+                  <w:rFonts w:ascii="Cambria Math" w:hAnsi="Cambria Math" w:cs="Linux Libertine Display"/>
+                  <w:kern w:val="0"/>
+                  <w:sz w:val="22"/>
+                </w:rPr>
+                <m:t>-</m:t>
+              </m:r>
+            </m:oMath>
+          </w:p>
+          <w:p>
+            <w:pPr>
+              <w:wordWrap/>
+              <w:adjustRightInd w:val="0"/>
+              <w:spacing w:line="360" w:lineRule="auto"/>
+              <w:jc w:val="center"/>
+              <w:outlineLvl w:val="0"/>
+              <w:rPr>
+                <w:rFonts w:ascii="Linux Libertine Display" w:hAnsi="Linux Libertine Display" w:cs="Linux Libertine Display"/>
+                <w:bCs/>
+                <w:kern w:val="0"/>
+                <w:sz w:val="22"/>
+              </w:rPr>
+            </w:pPr>
+            <w:r>
+              <w:rPr>
+                <w:rFonts w:ascii="Linux Libertine Display" w:hAnsi="Linux Libertine Display" w:cs="Linux Libertine Display"/>
+                <w:bCs/>
+                <w:kern w:val="0"/>
+                <w:sz w:val="22"/>
+              </w:rPr>
+              <w:t>8/</w:t>
+            </w:r>
+            <w:r>
+              <w:rPr>
+                <w:rFonts w:ascii="Linux Libertine Display" w:hAnsi="Linux Libertine Display" w:cs="Linux Libertine Display"/>
+                <w:bCs/>
+                <w:kern w:val="0"/>
+                <w:sz w:val="22"/>
+              </w:rPr>
+              <w:t>2025</w:t>
             </w:r>
           </w:p>
         </w:tc>
       </w:tr>
       <w:tr>
         <w:trPr>
-          <w:trHeight w:val="813"/>
+          <w:trHeight w:val="720"/>
         </w:trPr>
         <w:tc>
           <w:tcPr>
@@ -1551,7 +1707,7 @@
               <w:jc w:val="center"/>
               <w:outlineLvl w:val="0"/>
               <w:rPr>
-                <w:rFonts w:ascii="Linux Libertine Display" w:hAnsi="Linux Libertine Display" w:cs="Linux Libertine Display" w:hint="eastAsia"/>
+                <w:rFonts w:ascii="Linux Libertine Display" w:hAnsi="Linux Libertine Display" w:cs="Linux Libertine Display"/>
                 <w:bCs/>
                 <w:kern w:val="0"/>
                 <w:sz w:val="22"/>
@@ -1660,11 +1816,11 @@
             <w:pPr>
               <w:wordWrap/>
               <w:adjustRightInd w:val="0"/>
-              <w:spacing w:line="276" w:lineRule="auto"/>
               <w:ind w:firstLineChars="50" w:firstLine="110"/>
               <w:jc w:val="left"/>
               <w:rPr>
                 <w:rFonts w:ascii="Linux Libertine Display" w:hAnsi="Linux Libertine Display" w:cs="Linux Libertine Display"/>
+                <w:b/>
                 <w:bCs/>
                 <w:kern w:val="0"/>
                 <w:sz w:val="22"/>
@@ -1703,7 +1859,7 @@
         </w:tc>
         <w:tc>
           <w:tcPr>
-            <w:tcW w:w="1186" w:type="dxa"/>
+            <w:tcW w:w="1440" w:type="dxa"/>
             <w:vAlign w:val="center"/>
           </w:tcPr>
           <w:p>
@@ -1715,9 +1871,9 @@
               <w:outlineLvl w:val="0"/>
               <w:rPr>
                 <w:rFonts w:ascii="Linux Libertine Display" w:hAnsi="Linux Libertine Display" w:cs="Linux Libertine Display"/>
+                <w:bCs/>
                 <w:kern w:val="0"/>
                 <w:sz w:val="22"/>
-                <w:szCs w:val="28"/>
               </w:rPr>
             </w:pPr>
             <w:r>
@@ -1727,6 +1883,15 @@
                 <w:kern w:val="0"/>
                 <w:sz w:val="22"/>
               </w:rPr>
+              <w:t>6/</w:t>
+            </w:r>
+            <w:r>
+              <w:rPr>
+                <w:rFonts w:ascii="Linux Libertine Display" w:hAnsi="Linux Libertine Display" w:cs="Linux Libertine Display"/>
+                <w:bCs/>
+                <w:kern w:val="0"/>
+                <w:sz w:val="22"/>
+              </w:rPr>
               <w:t>20</w:t>
             </w:r>
             <w:r>
@@ -1737,6 +1902,225 @@
                 <w:sz w:val="22"/>
               </w:rPr>
               <w:t>24</w:t>
+            </w:r>
+            <m:oMath>
+              <m:r>
+                <w:rPr>
+                  <w:rFonts w:ascii="Cambria Math" w:hAnsi="Cambria Math" w:cs="Linux Libertine Display"/>
+                  <w:kern w:val="0"/>
+                  <w:sz w:val="22"/>
+                </w:rPr>
+                <m:t>-</m:t>
+              </m:r>
+            </m:oMath>
+          </w:p>
+          <w:p>
+            <w:pPr>
+              <w:wordWrap/>
+              <w:adjustRightInd w:val="0"/>
+              <w:spacing w:line="360" w:lineRule="auto"/>
+              <w:jc w:val="center"/>
+              <w:outlineLvl w:val="0"/>
+              <w:rPr>
+                <w:rFonts w:ascii="Linux Libertine Display" w:hAnsi="Linux Libertine Display" w:cs="Linux Libertine Display"/>
+                <w:bCs/>
+                <w:kern w:val="0"/>
+                <w:sz w:val="22"/>
+              </w:rPr>
+            </w:pPr>
+            <w:r>
+              <w:rPr>
+                <w:rFonts w:ascii="Linux Libertine Display" w:hAnsi="Linux Libertine Display" w:cs="Linux Libertine Display"/>
+                <w:bCs/>
+                <w:kern w:val="0"/>
+                <w:sz w:val="22"/>
+              </w:rPr>
+              <w:t>10/2024</w:t>
+            </w:r>
+          </w:p>
+        </w:tc>
+      </w:tr>
+      <w:tr>
+        <w:trPr>
+          <w:trHeight w:val="720"/>
+        </w:trPr>
+        <w:tc>
+          <w:tcPr>
+            <w:tcW w:w="1701" w:type="dxa"/>
+            <w:vAlign w:val="center"/>
+          </w:tcPr>
+          <w:p>
+            <w:pPr>
+              <w:wordWrap/>
+              <w:adjustRightInd w:val="0"/>
+              <w:spacing w:line="360" w:lineRule="auto"/>
+              <w:jc w:val="center"/>
+              <w:outlineLvl w:val="0"/>
+              <w:rPr>
+                <w:rFonts w:ascii="Linux Libertine Display" w:hAnsi="Linux Libertine Display" w:cs="Linux Libertine Display"/>
+                <w:bCs/>
+                <w:kern w:val="0"/>
+                <w:sz w:val="22"/>
+              </w:rPr>
+            </w:pPr>
+            <w:r>
+              <w:rPr>
+                <w:rFonts w:ascii="Linux Libertine Display" w:hAnsi="Linux Libertine Display" w:cs="Linux Libertine Display"/>
+                <w:bCs/>
+                <w:kern w:val="0"/>
+                <w:sz w:val="22"/>
+              </w:rPr>
+              <w:t>Visiting</w:t>
+            </w:r>
+          </w:p>
+        </w:tc>
+        <w:tc>
+          <w:tcPr>
+            <w:tcW w:w="6129" w:type="dxa"/>
+            <w:vAlign w:val="center"/>
+          </w:tcPr>
+          <w:p>
+            <w:pPr>
+              <w:wordWrap/>
+              <w:adjustRightInd w:val="0"/>
+              <w:ind w:firstLineChars="50" w:firstLine="110"/>
+              <w:jc w:val="left"/>
+              <w:rPr>
+                <w:rFonts w:ascii="Linux Libertine Display" w:hAnsi="Linux Libertine Display" w:cs="Linux Libertine Display"/>
+                <w:b/>
+                <w:bCs/>
+                <w:kern w:val="0"/>
+                <w:sz w:val="22"/>
+              </w:rPr>
+            </w:pPr>
+            <w:r>
+              <w:rPr>
+                <w:rFonts w:ascii="Linux Libertine Display" w:hAnsi="Linux Libertine Display" w:cs="Linux Libertine Display"/>
+                <w:b/>
+                <w:bCs/>
+                <w:kern w:val="0"/>
+                <w:sz w:val="22"/>
+              </w:rPr>
+              <w:t>Stanford University, CA, USA</w:t>
+            </w:r>
+          </w:p>
+          <w:p>
+            <w:pPr>
+              <w:wordWrap/>
+              <w:adjustRightInd w:val="0"/>
+              <w:ind w:firstLineChars="50" w:firstLine="100"/>
+              <w:jc w:val="left"/>
+              <w:rPr>
+                <w:rFonts w:ascii="Linux Libertine Display" w:hAnsi="Linux Libertine Display" w:cs="Linux Libertine Display"/>
+                <w:b/>
+                <w:bCs/>
+                <w:kern w:val="0"/>
+                <w:sz w:val="22"/>
+              </w:rPr>
+            </w:pPr>
+            <w:r>
+              <w:rPr>
+                <w:rFonts w:ascii="Linux Libertine Display" w:hAnsi="Linux Libertine Display" w:cs="Linux Libertine Display"/>
+                <w:bCs/>
+                <w:kern w:val="0"/>
+                <w:szCs w:val="20"/>
+              </w:rPr>
+              <w:t xml:space="preserve">Advisor: </w:t>
+            </w:r>
+            <w:hyperlink r:id="rId16" w:history="1">
+              <w:r>
+                <w:rPr>
+                  <w:rStyle w:val="Hyperlink"/>
+                  <w:rFonts w:ascii="Linux Libertine Display" w:hAnsi="Linux Libertine Display" w:cs="Linux Libertine Display"/>
+                  <w:bCs/>
+                  <w:color w:val="1F497D" w:themeColor="text2"/>
+                  <w:kern w:val="0"/>
+                  <w:szCs w:val="20"/>
+                </w:rPr>
+                <w:t>Mark Brongersma</w:t>
+              </w:r>
+            </w:hyperlink>
+          </w:p>
+        </w:tc>
+        <w:tc>
+          <w:tcPr>
+            <w:tcW w:w="1440" w:type="dxa"/>
+            <w:vAlign w:val="center"/>
+          </w:tcPr>
+          <w:p>
+            <w:pPr>
+              <w:wordWrap/>
+              <w:adjustRightInd w:val="0"/>
+              <w:spacing w:line="360" w:lineRule="auto"/>
+              <w:jc w:val="center"/>
+              <w:outlineLvl w:val="0"/>
+              <w:rPr>
+                <w:rFonts w:ascii="Linux Libertine Display" w:hAnsi="Linux Libertine Display" w:cs="Linux Libertine Display"/>
+                <w:bCs/>
+                <w:kern w:val="0"/>
+                <w:sz w:val="22"/>
+              </w:rPr>
+            </w:pPr>
+            <w:r>
+              <w:rPr>
+                <w:rFonts w:ascii="Linux Libertine Display" w:hAnsi="Linux Libertine Display" w:cs="Linux Libertine Display"/>
+                <w:bCs/>
+                <w:kern w:val="0"/>
+                <w:sz w:val="22"/>
+              </w:rPr>
+              <w:t>11/</w:t>
+            </w:r>
+            <w:r>
+              <w:rPr>
+                <w:rFonts w:ascii="Linux Libertine Display" w:hAnsi="Linux Libertine Display" w:cs="Linux Libertine Display"/>
+                <w:bCs/>
+                <w:kern w:val="0"/>
+                <w:sz w:val="22"/>
+              </w:rPr>
+              <w:t>2023</w:t>
+            </w:r>
+            <m:oMath>
+              <m:r>
+                <w:rPr>
+                  <w:rFonts w:ascii="Cambria Math" w:hAnsi="Cambria Math" w:cs="Linux Libertine Display"/>
+                  <w:kern w:val="0"/>
+                  <w:sz w:val="22"/>
+                </w:rPr>
+                <m:t>-</m:t>
+              </m:r>
+            </m:oMath>
+          </w:p>
+          <w:p>
+            <w:pPr>
+              <w:wordWrap/>
+              <w:adjustRightInd w:val="0"/>
+              <w:spacing w:line="360" w:lineRule="auto"/>
+              <w:jc w:val="center"/>
+              <w:outlineLvl w:val="0"/>
+              <w:rPr>
+                <w:rFonts w:ascii="Linux Libertine Display" w:hAnsi="Linux Libertine Display" w:cs="Linux Libertine Display"/>
+                <w:bCs/>
+                <w:kern w:val="0"/>
+                <w:sz w:val="22"/>
+              </w:rPr>
+            </w:pPr>
+            <w:r>
+              <w:rPr>
+                <w:rFonts w:ascii="Linux Libertine Display" w:hAnsi="Linux Libertine Display" w:cs="Linux Libertine Display"/>
+                <w:bCs/>
+                <w:kern w:val="0"/>
+                <w:sz w:val="22"/>
+              </w:rPr>
+              <w:t>2/</w:t>
+            </w:r>
+            <w:r>
+              <w:rPr>
+                <w:rFonts w:ascii="Linux Libertine Display" w:hAnsi="Linux Libertine Display" w:cs="Linux Libertine Display"/>
+                <w:bCs/>
+                <w:kern w:val="0"/>
+                <w:sz w:val="22"/>
+              </w:rPr>
+              <w:t>2024</w:t>
             </w:r>
           </w:p>
         </w:tc>
@@ -2181,6 +2565,7 @@
           <w:kern w:val="0"/>
           <w:szCs w:val="20"/>
         </w:rPr>
+        <w:lastRenderedPageBreak/>
         <w:t>Silver Prize</w:t>
       </w:r>
       <w:r>
@@ -2305,7 +2690,6 @@
           <w:kern w:val="0"/>
           <w:szCs w:val="20"/>
         </w:rPr>
-        <w:lastRenderedPageBreak/>
         <w:t>Best Poster Paper Awards</w:t>
       </w:r>
     </w:p>
@@ -2798,7 +3182,7 @@
         </w:rPr>
         <w:t>“</w:t>
       </w:r>
-      <w:hyperlink r:id="rId16" w:history="1">
+      <w:hyperlink r:id="rId17" w:history="1">
         <w:r>
           <w:rPr>
             <w:rStyle w:val="Hyperlink"/>
@@ -2938,7 +3322,7 @@
         </w:rPr>
         <w:t>, D. Kim, and Y. Jeong, “</w:t>
       </w:r>
-      <w:hyperlink r:id="rId17" w:history="1">
+      <w:hyperlink r:id="rId18" w:history="1">
         <w:r>
           <w:rPr>
             <w:rStyle w:val="Hyperlink"/>
@@ -3097,7 +3481,7 @@
         </w:rPr>
         <w:t>C. Kim, G.-Y. Lee, H. Choi, T. Choi, Y. Jeong, and B. Lee, “</w:t>
       </w:r>
-      <w:hyperlink r:id="rId18" w:history="1">
+      <w:hyperlink r:id="rId19" w:history="1">
         <w:r>
           <w:rPr>
             <w:rStyle w:val="Hyperlink"/>
@@ -3529,7 +3913,7 @@
         </w:rPr>
         <w:t>“</w:t>
       </w:r>
-      <w:hyperlink r:id="rId19" w:history="1">
+      <w:hyperlink r:id="rId20" w:history="1">
         <w:r>
           <w:rPr>
             <w:rStyle w:val="Hyperlink"/>
@@ -3666,7 +4050,7 @@
         </w:rPr>
         <w:t>“</w:t>
       </w:r>
-      <w:hyperlink r:id="rId20" w:history="1">
+      <w:hyperlink r:id="rId21" w:history="1">
         <w:r>
           <w:rPr>
             <w:rStyle w:val="Hyperlink"/>
@@ -3901,7 +4285,7 @@
         </w:rPr>
         <w:t>, Y. Jeong, and B. Lee, “</w:t>
       </w:r>
-      <w:hyperlink r:id="rId21" w:tgtFrame="_blank" w:history="1">
+      <w:hyperlink r:id="rId22" w:tgtFrame="_blank" w:history="1">
         <w:r>
           <w:rPr>
             <w:rStyle w:val="Hyperlink"/>
@@ -4005,7 +4389,7 @@
         </w:rPr>
         <w:t>“</w:t>
       </w:r>
-      <w:hyperlink r:id="rId22" w:history="1">
+      <w:hyperlink r:id="rId23" w:history="1">
         <w:r>
           <w:rPr>
             <w:rStyle w:val="Hyperlink"/>
@@ -4141,7 +4525,7 @@
         </w:rPr>
         <w:t>“</w:t>
       </w:r>
-      <w:hyperlink r:id="rId23" w:history="1">
+      <w:hyperlink r:id="rId24" w:history="1">
         <w:r>
           <w:rPr>
             <w:rStyle w:val="Hyperlink"/>
@@ -4231,7 +4615,7 @@
         </w:rPr>
         <w:t>“</w:t>
       </w:r>
-      <w:hyperlink r:id="rId24" w:history="1">
+      <w:hyperlink r:id="rId25" w:history="1">
         <w:r>
           <w:rPr>
             <w:rStyle w:val="Hyperlink"/>
@@ -4256,7 +4640,16 @@
             <w:rFonts w:ascii="Linux Libertine Display" w:hAnsi="Linux Libertine Display" w:cs="Linux Libertine Display"/>
             <w:color w:val="1F497D" w:themeColor="text2"/>
           </w:rPr>
-          <w:t xml:space="preserve"> Doublet Design for Broadband and Wide-Angle Operation in the Visible Range</w:t>
+          <w:t xml:space="preserve"> Doublet </w:t>
+        </w:r>
+        <w:r>
+          <w:rPr>
+            <w:rStyle w:val="Hyperlink"/>
+            <w:rFonts w:ascii="Linux Libertine Display" w:hAnsi="Linux Libertine Display" w:cs="Linux Libertine Display"/>
+            <w:color w:val="1F497D" w:themeColor="text2"/>
+          </w:rPr>
+          <w:lastRenderedPageBreak/>
+          <w:t>Design for Broadband and Wide-Angle Operation in the Visible Range</w:t>
         </w:r>
       </w:hyperlink>
       <w:r>
@@ -4349,7 +4742,7 @@
         </w:rPr>
         <w:t>, J. Jeong, S. Choi, W. Han, J. Kim, and B. Lee, “</w:t>
       </w:r>
-      <w:hyperlink r:id="rId25" w:history="1">
+      <w:hyperlink r:id="rId26" w:history="1">
         <w:r>
           <w:rPr>
             <w:rStyle w:val="Hyperlink"/>
@@ -4593,7 +4986,7 @@
         </w:rPr>
         <w:t>“</w:t>
       </w:r>
-      <w:hyperlink r:id="rId26" w:history="1">
+      <w:hyperlink r:id="rId27" w:history="1">
         <w:r>
           <w:rPr>
             <w:rStyle w:val="Hyperlink"/>
@@ -4677,7 +5070,7 @@
         </w:rPr>
         <w:t>, “</w:t>
       </w:r>
-      <w:hyperlink r:id="rId27" w:history="1">
+      <w:hyperlink r:id="rId28" w:history="1">
         <w:r>
           <w:rPr>
             <w:rStyle w:val="Hyperlink"/>
@@ -4765,7 +5158,7 @@
         </w:rPr>
         <w:t>, G.-Y. Lee, J. Jang, Y. Jeong, “</w:t>
       </w:r>
-      <w:hyperlink r:id="rId28" w:history="1">
+      <w:hyperlink r:id="rId29" w:history="1">
         <w:r>
           <w:rPr>
             <w:rStyle w:val="Hyperlink"/>
@@ -5370,7 +5763,23 @@
           <w:kern w:val="0"/>
           <w:sz w:val="22"/>
         </w:rPr>
-        <w:t>Scientific Reports, ACS Photonics, ACM SIGGRAPH, ACM SIGRGAPH Asia, ACM Transactions on Graphics (TOG), Optical and Quantum Electronics</w:t>
+        <w:t>Scientific Reports, ACS Photonics, ACM SIGGRAPH, ACM SIG</w:t>
+      </w:r>
+      <w:r>
+        <w:rPr>
+          <w:rFonts w:ascii="Linux Libertine Display" w:hAnsi="Linux Libertine Display" w:cs="Linux Libertine Display"/>
+          <w:kern w:val="0"/>
+          <w:sz w:val="22"/>
+        </w:rPr>
+        <w:t>G</w:t>
+      </w:r>
+      <w:r>
+        <w:rPr>
+          <w:rFonts w:ascii="Linux Libertine Display" w:hAnsi="Linux Libertine Display" w:cs="Linux Libertine Display"/>
+          <w:kern w:val="0"/>
+          <w:sz w:val="22"/>
+        </w:rPr>
+        <w:t>RAPH Asia, ACM Transactions on Graphics (TOG), Optical and Quantum Electronics</w:t>
       </w:r>
     </w:p>
     <w:p>
@@ -5423,10 +5832,10 @@
       </w:pPr>
     </w:p>
     <w:sectPr>
-      <w:headerReference w:type="default" r:id="rId29"/>
-      <w:footerReference w:type="default" r:id="rId30"/>
-      <w:headerReference w:type="first" r:id="rId31"/>
-      <w:footerReference w:type="first" r:id="rId32"/>
+      <w:headerReference w:type="default" r:id="rId30"/>
+      <w:footerReference w:type="default" r:id="rId31"/>
+      <w:headerReference w:type="first" r:id="rId32"/>
+      <w:footerReference w:type="first" r:id="rId33"/>
       <w:type w:val="continuous"/>
       <w:pgSz w:w="11906" w:h="16838"/>
       <w:pgMar w:top="1701" w:right="1440" w:bottom="1440" w:left="1440" w:header="964" w:footer="907" w:gutter="0"/>
@@ -5942,14 +6351,14 @@
         <v:path o:extrusionok="f" gradientshapeok="t" o:connecttype="rect"/>
         <o:lock v:ext="edit" aspectratio="t"/>
       </v:shapetype>
-      <v:shape id="_x0000_i1025" type="#_x0000_t75" style="width:540.25pt;height:540.25pt;visibility:visible;mso-wrap-style:square" o:bullet="t">
+      <v:shape id="_x0000_i1025" type="#_x0000_t75" style="width:540.4pt;height:540.4pt;visibility:visible;mso-wrap-style:square" o:bullet="t">
         <v:imagedata r:id="rId1" o:title="" croptop="3115f" cropbottom="3115f" cropleft="3115f" cropright="3115f"/>
       </v:shape>
     </w:pict>
   </w:numPicBullet>
   <w:numPicBullet w:numPicBulletId="1">
     <w:pict>
-      <v:shape id="_x0000_i1026" type="#_x0000_t75" style="width:14.1pt;height:14.1pt;visibility:visible;mso-wrap-style:square" o:bullet="t">
+      <v:shape id="_x0000_i1026" type="#_x0000_t75" style="width:13.95pt;height:13.95pt;visibility:visible;mso-wrap-style:square" o:bullet="t">
         <v:imagedata r:id="rId2" o:title="" cropbottom="-1179f" cropright="-1179f"/>
       </v:shape>
     </w:pict>
@@ -6659,6 +7068,119 @@
     </w:lvl>
   </w:abstractNum>
   <w:abstractNum w:abstractNumId="7" w15:restartNumberingAfterBreak="0">
+    <w:nsid w:val="2EB04AD6"/>
+    <w:multiLevelType w:val="hybridMultilevel"/>
+    <w:tmpl w:val="26BA3606"/>
+    <w:lvl w:ilvl="0" w:tplc="B21C57D6">
+      <w:start w:val="2019"/>
+      <w:numFmt w:val="bullet"/>
+      <w:lvlText w:val="-"/>
+      <w:lvlJc w:val="left"/>
+      <w:pPr>
+        <w:ind w:left="720" w:hanging="360"/>
+      </w:pPr>
+      <w:rPr>
+        <w:rFonts w:ascii="Linux Libertine Display" w:eastAsiaTheme="minorEastAsia" w:hAnsi="Linux Libertine Display" w:cs="Linux Libertine Display" w:hint="default"/>
+      </w:rPr>
+    </w:lvl>
+    <w:lvl w:ilvl="1" w:tplc="04090003" w:tentative="1">
+      <w:start w:val="1"/>
+      <w:numFmt w:val="bullet"/>
+      <w:lvlText w:val="o"/>
+      <w:lvlJc w:val="left"/>
+      <w:pPr>
+        <w:ind w:left="1440" w:hanging="360"/>
+      </w:pPr>
+      <w:rPr>
+        <w:rFonts w:ascii="Courier New" w:hAnsi="Courier New" w:hint="default"/>
+      </w:rPr>
+    </w:lvl>
+    <w:lvl w:ilvl="2" w:tplc="04090005" w:tentative="1">
+      <w:start w:val="1"/>
+      <w:numFmt w:val="bullet"/>
+      <w:lvlText w:val=""/>
+      <w:lvlJc w:val="left"/>
+      <w:pPr>
+        <w:ind w:left="2160" w:hanging="360"/>
+      </w:pPr>
+      <w:rPr>
+        <w:rFonts w:ascii="Wingdings" w:hAnsi="Wingdings" w:hint="default"/>
+      </w:rPr>
+    </w:lvl>
+    <w:lvl w:ilvl="3" w:tplc="04090001" w:tentative="1">
+      <w:start w:val="1"/>
+      <w:numFmt w:val="bullet"/>
+      <w:lvlText w:val=""/>
+      <w:lvlJc w:val="left"/>
+      <w:pPr>
+        <w:ind w:left="2880" w:hanging="360"/>
+      </w:pPr>
+      <w:rPr>
+        <w:rFonts w:ascii="Symbol" w:hAnsi="Symbol" w:hint="default"/>
+      </w:rPr>
+    </w:lvl>
+    <w:lvl w:ilvl="4" w:tplc="04090003" w:tentative="1">
+      <w:start w:val="1"/>
+      <w:numFmt w:val="bullet"/>
+      <w:lvlText w:val="o"/>
+      <w:lvlJc w:val="left"/>
+      <w:pPr>
+        <w:ind w:left="3600" w:hanging="360"/>
+      </w:pPr>
+      <w:rPr>
+        <w:rFonts w:ascii="Courier New" w:hAnsi="Courier New" w:hint="default"/>
+      </w:rPr>
+    </w:lvl>
+    <w:lvl w:ilvl="5" w:tplc="04090005" w:tentative="1">
+      <w:start w:val="1"/>
+      <w:numFmt w:val="bullet"/>
+      <w:lvlText w:val=""/>
+      <w:lvlJc w:val="left"/>
+      <w:pPr>
+        <w:ind w:left="4320" w:hanging="360"/>
+      </w:pPr>
+      <w:rPr>
+        <w:rFonts w:ascii="Wingdings" w:hAnsi="Wingdings" w:hint="default"/>
+      </w:rPr>
+    </w:lvl>
+    <w:lvl w:ilvl="6" w:tplc="04090001" w:tentative="1">
+      <w:start w:val="1"/>
+      <w:numFmt w:val="bullet"/>
+      <w:lvlText w:val=""/>
+      <w:lvlJc w:val="left"/>
+      <w:pPr>
+        <w:ind w:left="5040" w:hanging="360"/>
+      </w:pPr>
+      <w:rPr>
+        <w:rFonts w:ascii="Symbol" w:hAnsi="Symbol" w:hint="default"/>
+      </w:rPr>
+    </w:lvl>
+    <w:lvl w:ilvl="7" w:tplc="04090003" w:tentative="1">
+      <w:start w:val="1"/>
+      <w:numFmt w:val="bullet"/>
+      <w:lvlText w:val="o"/>
+      <w:lvlJc w:val="left"/>
+      <w:pPr>
+        <w:ind w:left="5760" w:hanging="360"/>
+      </w:pPr>
+      <w:rPr>
+        <w:rFonts w:ascii="Courier New" w:hAnsi="Courier New" w:hint="default"/>
+      </w:rPr>
+    </w:lvl>
+    <w:lvl w:ilvl="8" w:tplc="04090005" w:tentative="1">
+      <w:start w:val="1"/>
+      <w:numFmt w:val="bullet"/>
+      <w:lvlText w:val=""/>
+      <w:lvlJc w:val="left"/>
+      <w:pPr>
+        <w:ind w:left="6480" w:hanging="360"/>
+      </w:pPr>
+      <w:rPr>
+        <w:rFonts w:ascii="Wingdings" w:hAnsi="Wingdings" w:hint="default"/>
+      </w:rPr>
+    </w:lvl>
+  </w:abstractNum>
+  <w:abstractNum w:abstractNumId="8" w15:restartNumberingAfterBreak="0">
     <w:nsid w:val="3F8812B1"/>
     <w:multiLevelType w:val="hybridMultilevel"/>
     <w:tmpl w:val="4772487E"/>
@@ -6750,7 +7272,7 @@
       </w:pPr>
     </w:lvl>
   </w:abstractNum>
-  <w:abstractNum w:abstractNumId="8" w15:restartNumberingAfterBreak="0">
+  <w:abstractNum w:abstractNumId="9" w15:restartNumberingAfterBreak="0">
     <w:nsid w:val="4322261B"/>
     <w:multiLevelType w:val="hybridMultilevel"/>
     <w:tmpl w:val="13423E08"/>
@@ -6891,7 +7413,7 @@
       </w:rPr>
     </w:lvl>
   </w:abstractNum>
-  <w:abstractNum w:abstractNumId="9" w15:restartNumberingAfterBreak="0">
+  <w:abstractNum w:abstractNumId="10" w15:restartNumberingAfterBreak="0">
     <w:nsid w:val="43986CB8"/>
     <w:multiLevelType w:val="hybridMultilevel"/>
     <w:tmpl w:val="04628078"/>
@@ -7004,7 +7526,7 @@
       </w:rPr>
     </w:lvl>
   </w:abstractNum>
-  <w:abstractNum w:abstractNumId="10" w15:restartNumberingAfterBreak="0">
+  <w:abstractNum w:abstractNumId="11" w15:restartNumberingAfterBreak="0">
     <w:nsid w:val="48D7176B"/>
     <w:multiLevelType w:val="hybridMultilevel"/>
     <w:tmpl w:val="0D5CED46"/>
@@ -7117,7 +7639,122 @@
       </w:rPr>
     </w:lvl>
   </w:abstractNum>
-  <w:abstractNum w:abstractNumId="11" w15:restartNumberingAfterBreak="0">
+  <w:abstractNum w:abstractNumId="12" w15:restartNumberingAfterBreak="0">
+    <w:nsid w:val="515E48F8"/>
+    <w:multiLevelType w:val="hybridMultilevel"/>
+    <w:tmpl w:val="69F6805A"/>
+    <w:lvl w:ilvl="0" w:tplc="7972930A">
+      <w:start w:val="2019"/>
+      <w:numFmt w:val="bullet"/>
+      <w:lvlText w:val="-"/>
+      <w:lvlJc w:val="left"/>
+      <w:pPr>
+        <w:ind w:left="720" w:hanging="360"/>
+      </w:pPr>
+      <w:rPr>
+        <w:rFonts w:ascii="Linux Libertine Display" w:eastAsiaTheme="minorEastAsia" w:hAnsi="Linux Libertine Display" w:cs="Linux Libertine Display" w:hint="default"/>
+        <w:b w:val="0"/>
+        <w:sz w:val="22"/>
+      </w:rPr>
+    </w:lvl>
+    <w:lvl w:ilvl="1" w:tplc="04090003" w:tentative="1">
+      <w:start w:val="1"/>
+      <w:numFmt w:val="bullet"/>
+      <w:lvlText w:val="o"/>
+      <w:lvlJc w:val="left"/>
+      <w:pPr>
+        <w:ind w:left="1440" w:hanging="360"/>
+      </w:pPr>
+      <w:rPr>
+        <w:rFonts w:ascii="Courier New" w:hAnsi="Courier New" w:hint="default"/>
+      </w:rPr>
+    </w:lvl>
+    <w:lvl w:ilvl="2" w:tplc="04090005" w:tentative="1">
+      <w:start w:val="1"/>
+      <w:numFmt w:val="bullet"/>
+      <w:lvlText w:val=""/>
+      <w:lvlJc w:val="left"/>
+      <w:pPr>
+        <w:ind w:left="2160" w:hanging="360"/>
+      </w:pPr>
+      <w:rPr>
+        <w:rFonts w:ascii="Wingdings" w:hAnsi="Wingdings" w:hint="default"/>
+      </w:rPr>
+    </w:lvl>
+    <w:lvl w:ilvl="3" w:tplc="04090001" w:tentative="1">
+      <w:start w:val="1"/>
+      <w:numFmt w:val="bullet"/>
+      <w:lvlText w:val=""/>
+      <w:lvlJc w:val="left"/>
+      <w:pPr>
+        <w:ind w:left="2880" w:hanging="360"/>
+      </w:pPr>
+      <w:rPr>
+        <w:rFonts w:ascii="Symbol" w:hAnsi="Symbol" w:hint="default"/>
+      </w:rPr>
+    </w:lvl>
+    <w:lvl w:ilvl="4" w:tplc="04090003" w:tentative="1">
+      <w:start w:val="1"/>
+      <w:numFmt w:val="bullet"/>
+      <w:lvlText w:val="o"/>
+      <w:lvlJc w:val="left"/>
+      <w:pPr>
+        <w:ind w:left="3600" w:hanging="360"/>
+      </w:pPr>
+      <w:rPr>
+        <w:rFonts w:ascii="Courier New" w:hAnsi="Courier New" w:hint="default"/>
+      </w:rPr>
+    </w:lvl>
+    <w:lvl w:ilvl="5" w:tplc="04090005" w:tentative="1">
+      <w:start w:val="1"/>
+      <w:numFmt w:val="bullet"/>
+      <w:lvlText w:val=""/>
+      <w:lvlJc w:val="left"/>
+      <w:pPr>
+        <w:ind w:left="4320" w:hanging="360"/>
+      </w:pPr>
+      <w:rPr>
+        <w:rFonts w:ascii="Wingdings" w:hAnsi="Wingdings" w:hint="default"/>
+      </w:rPr>
+    </w:lvl>
+    <w:lvl w:ilvl="6" w:tplc="04090001" w:tentative="1">
+      <w:start w:val="1"/>
+      <w:numFmt w:val="bullet"/>
+      <w:lvlText w:val=""/>
+      <w:lvlJc w:val="left"/>
+      <w:pPr>
+        <w:ind w:left="5040" w:hanging="360"/>
+      </w:pPr>
+      <w:rPr>
+        <w:rFonts w:ascii="Symbol" w:hAnsi="Symbol" w:hint="default"/>
+      </w:rPr>
+    </w:lvl>
+    <w:lvl w:ilvl="7" w:tplc="04090003" w:tentative="1">
+      <w:start w:val="1"/>
+      <w:numFmt w:val="bullet"/>
+      <w:lvlText w:val="o"/>
+      <w:lvlJc w:val="left"/>
+      <w:pPr>
+        <w:ind w:left="5760" w:hanging="360"/>
+      </w:pPr>
+      <w:rPr>
+        <w:rFonts w:ascii="Courier New" w:hAnsi="Courier New" w:hint="default"/>
+      </w:rPr>
+    </w:lvl>
+    <w:lvl w:ilvl="8" w:tplc="04090005" w:tentative="1">
+      <w:start w:val="1"/>
+      <w:numFmt w:val="bullet"/>
+      <w:lvlText w:val=""/>
+      <w:lvlJc w:val="left"/>
+      <w:pPr>
+        <w:ind w:left="6480" w:hanging="360"/>
+      </w:pPr>
+      <w:rPr>
+        <w:rFonts w:ascii="Wingdings" w:hAnsi="Wingdings" w:hint="default"/>
+      </w:rPr>
+    </w:lvl>
+  </w:abstractNum>
+  <w:abstractNum w:abstractNumId="13" w15:restartNumberingAfterBreak="0">
     <w:nsid w:val="5E576954"/>
     <w:multiLevelType w:val="hybridMultilevel"/>
     <w:tmpl w:val="F5A6A4A8"/>
@@ -7230,7 +7867,7 @@
       </w:rPr>
     </w:lvl>
   </w:abstractNum>
-  <w:abstractNum w:abstractNumId="12" w15:restartNumberingAfterBreak="0">
+  <w:abstractNum w:abstractNumId="14" w15:restartNumberingAfterBreak="0">
     <w:nsid w:val="603519C7"/>
     <w:multiLevelType w:val="hybridMultilevel"/>
     <w:tmpl w:val="ED428562"/>
@@ -7343,7 +7980,7 @@
       </w:rPr>
     </w:lvl>
   </w:abstractNum>
-  <w:abstractNum w:abstractNumId="13" w15:restartNumberingAfterBreak="0">
+  <w:abstractNum w:abstractNumId="15" w15:restartNumberingAfterBreak="0">
     <w:nsid w:val="67BF651D"/>
     <w:multiLevelType w:val="hybridMultilevel"/>
     <w:tmpl w:val="1940FBC2"/>
@@ -7456,7 +8093,7 @@
       </w:rPr>
     </w:lvl>
   </w:abstractNum>
-  <w:abstractNum w:abstractNumId="14" w15:restartNumberingAfterBreak="0">
+  <w:abstractNum w:abstractNumId="16" w15:restartNumberingAfterBreak="0">
     <w:nsid w:val="77DB4C94"/>
     <w:multiLevelType w:val="hybridMultilevel"/>
     <w:tmpl w:val="3CE44034"/>
@@ -7569,7 +8206,7 @@
       </w:rPr>
     </w:lvl>
   </w:abstractNum>
-  <w:abstractNum w:abstractNumId="15" w15:restartNumberingAfterBreak="0">
+  <w:abstractNum w:abstractNumId="17" w15:restartNumberingAfterBreak="0">
     <w:nsid w:val="7B2B77D8"/>
     <w:multiLevelType w:val="hybridMultilevel"/>
     <w:tmpl w:val="9C529402"/>
@@ -7686,7 +8323,7 @@
     <w:abstractNumId w:val="5"/>
   </w:num>
   <w:num w:numId="2" w16cid:durableId="1085683944">
-    <w:abstractNumId w:val="9"/>
+    <w:abstractNumId w:val="10"/>
   </w:num>
   <w:num w:numId="3" w16cid:durableId="1269384679">
     <w:abstractNumId w:val="3"/>
@@ -7701,34 +8338,34 @@
     <w:abstractNumId w:val="4"/>
   </w:num>
   <w:num w:numId="7" w16cid:durableId="1320768709">
-    <w:abstractNumId w:val="14"/>
+    <w:abstractNumId w:val="16"/>
   </w:num>
   <w:num w:numId="8" w16cid:durableId="261687185">
-    <w:abstractNumId w:val="10"/>
+    <w:abstractNumId w:val="11"/>
   </w:num>
   <w:num w:numId="9" w16cid:durableId="1553421429">
-    <w:abstractNumId w:val="13"/>
+    <w:abstractNumId w:val="15"/>
   </w:num>
   <w:num w:numId="10" w16cid:durableId="798184333">
-    <w:abstractNumId w:val="8"/>
+    <w:abstractNumId w:val="9"/>
   </w:num>
   <w:num w:numId="11" w16cid:durableId="2013101990">
-    <w:abstractNumId w:val="15"/>
+    <w:abstractNumId w:val="17"/>
   </w:num>
   <w:num w:numId="12" w16cid:durableId="761612898">
-    <w:abstractNumId w:val="12"/>
+    <w:abstractNumId w:val="14"/>
   </w:num>
   <w:num w:numId="13" w16cid:durableId="909540162">
     <w:abstractNumId w:val="6"/>
   </w:num>
   <w:num w:numId="14" w16cid:durableId="1929382911">
-    <w:abstractNumId w:val="11"/>
+    <w:abstractNumId w:val="13"/>
   </w:num>
   <w:num w:numId="15" w16cid:durableId="1567298874">
     <w:abstractNumId w:val="1"/>
   </w:num>
   <w:num w:numId="16" w16cid:durableId="974213894">
-    <w:abstractNumId w:val="7"/>
+    <w:abstractNumId w:val="8"/>
   </w:num>
   <w:num w:numId="17" w16cid:durableId="493835943">
     <w:abstractNumId w:val="5"/>
@@ -7738,6 +8375,12 @@
   </w:num>
   <w:num w:numId="18" w16cid:durableId="2118020040">
     <w:abstractNumId w:val="0"/>
+  </w:num>
+  <w:num w:numId="19" w16cid:durableId="1731419733">
+    <w:abstractNumId w:val="12"/>
+  </w:num>
+  <w:num w:numId="20" w16cid:durableId="850608741">
+    <w:abstractNumId w:val="7"/>
   </w:num>
   <w:numIdMacAtCleanup w:val="9"/>
 </w:numbering>
@@ -8499,6 +9142,16 @@
       <w:szCs w:val="27"/>
     </w:rPr>
   </w:style>
+  <w:style w:type="character" w:styleId="PlaceholderText">
+    <w:name w:val="Placeholder Text"/>
+    <w:basedOn w:val="DefaultParagraphFont"/>
+    <w:uiPriority w:val="99"/>
+    <w:semiHidden/>
+    <w:rsid w:val="00317BA8"/>
+    <w:rPr>
+      <w:color w:val="666666"/>
+    </w:rPr>
+  </w:style>
 </w:styles>
 </file>
 

</xml_diff>

<commit_message>
Deploying to gh-pages from @ YoungJIn94/YoungJIn94.github.io@d8e114bfb02717844d62ab932107387d8204237b 🚀
</commit_message>
<xml_diff>
--- a/assets/pdf/YJKim_CV.docx
+++ b/assets/pdf/YJKim_CV.docx
@@ -2001,7 +2001,15 @@
                 <w:kern w:val="0"/>
                 <w:sz w:val="22"/>
               </w:rPr>
-              <w:t>Stanford University, CA, USA</w:t>
+              <w:t>Stanford University</w:t>
+            </w:r>
+            <w:r>
+              <w:rPr>
+                <w:rFonts w:ascii="Linux Libertine Display" w:hAnsi="Linux Libertine Display" w:cs="Linux Libertine Display"/>
+                <w:kern w:val="0"/>
+                <w:sz w:val="22"/>
+              </w:rPr>
+              <w:t>, CA, USA</w:t>
             </w:r>
           </w:p>
           <w:p>
@@ -6351,14 +6359,14 @@
         <v:path o:extrusionok="f" gradientshapeok="t" o:connecttype="rect"/>
         <o:lock v:ext="edit" aspectratio="t"/>
       </v:shapetype>
-      <v:shape id="_x0000_i1025" type="#_x0000_t75" style="width:540.4pt;height:540.4pt;visibility:visible;mso-wrap-style:square" o:bullet="t">
+      <v:shape id="_x0000_i1025" type="#_x0000_t75" style="width:540.55pt;height:540.55pt;visibility:visible;mso-wrap-style:square" o:bullet="t">
         <v:imagedata r:id="rId1" o:title="" croptop="3115f" cropbottom="3115f" cropleft="3115f" cropright="3115f"/>
       </v:shape>
     </w:pict>
   </w:numPicBullet>
   <w:numPicBullet w:numPicBulletId="1">
     <w:pict>
-      <v:shape id="_x0000_i1026" type="#_x0000_t75" style="width:13.95pt;height:13.95pt;visibility:visible;mso-wrap-style:square" o:bullet="t">
+      <v:shape id="_x0000_i1026" type="#_x0000_t75" style="width:13.85pt;height:13.85pt;visibility:visible;mso-wrap-style:square" o:bullet="t">
         <v:imagedata r:id="rId2" o:title="" cropbottom="-1179f" cropright="-1179f"/>
       </v:shape>
     </w:pict>

</xml_diff>